<commit_message>
Day 3: HunyuanVideo working on A100 (L4 insufficient for this model)
</commit_message>
<xml_diff>
--- a/logbook/Project_Logbook.docx
+++ b/logbook/Project_Logbook.docx
@@ -1277,32 +1277,78 @@
       <w:pPr>
         <w:spacing w:after="100" w:line="300" w:lineRule="auto"/>
         <w:jc w:val="both"/>
-      </w:pPr>
-      <w:r>
-        <w:rPr>
-          <w:b/>
-          <w:bCs/>
-        </w:rPr>
-        <w:t xml:space="preserve">Actual progress (Tuesday 15 July): </w:t>
-      </w:r>
-      <w:r>
-        <w:t xml:space="preserve">Sent supervisor confirmation via Teams. Restructured GitHub repository with new folder layout reflecting the corpus / code / dissertation / logbook / </w:t>
-      </w:r>
-      <w:proofErr w:type="spellStart"/>
-      <w:r>
-        <w:t>supervisor_communication</w:t>
-      </w:r>
-      <w:proofErr w:type="spellEnd"/>
-      <w:r>
-        <w:t xml:space="preserve"> structure. Updated .</w:t>
-      </w:r>
-      <w:proofErr w:type="spellStart"/>
-      <w:r>
-        <w:t>gitignore</w:t>
-      </w:r>
-      <w:proofErr w:type="spellEnd"/>
-      <w:r>
-        <w:t xml:space="preserve"> to exclude large video files. Wrote and committed a new README documenting project scope, RQs, and repository layout. Began reconstructing this logbook covering April to 14 July from GitHub commit history and Teams messages.</w:t>
+        <w:rPr>
+          <w:b/>
+          <w:bCs/>
+        </w:rPr>
+      </w:pPr>
+      <w:r>
+        <w:rPr>
+          <w:b/>
+          <w:bCs/>
+        </w:rPr>
+        <w:t>Wednesday 16 July 2026 — actual progress:</w:t>
+      </w:r>
+    </w:p>
+    <w:p>
+      <w:pPr>
+        <w:spacing w:after="100" w:line="300" w:lineRule="auto"/>
+        <w:jc w:val="both"/>
+      </w:pPr>
+      <w:r>
+        <w:t xml:space="preserve">Set up </w:t>
+      </w:r>
+      <w:proofErr w:type="spellStart"/>
+      <w:r>
+        <w:t>Colab</w:t>
+      </w:r>
+      <w:proofErr w:type="spellEnd"/>
+      <w:r>
+        <w:t xml:space="preserve"> Pro notebook 01_ltx_setup_and_first_video.ipynb. Initial attempt on T4 GPU (15 GB VRAM) failed — model loading crashed at 60% due to combined RAM exhaustion despite CPU offloading and VAE slicing optimisations. Switched to L4 GPU (23.66 GB VRAM), which loaded the model successfully using 14.25 GB VRAM.</w:t>
+      </w:r>
+    </w:p>
+    <w:p>
+      <w:pPr>
+        <w:spacing w:after="100" w:line="300" w:lineRule="auto"/>
+        <w:jc w:val="both"/>
+      </w:pPr>
+      <w:r>
+        <w:t>Generated first video in 27.7 seconds using default L4-compatible settings (704×480, 73 frames, 30 inference steps). Prompt: "A woman with long brown hair smiling gently at the camera in a sunlit park, natural lighting, soft breeze moving her hair, cinematic quality". Output quality visually coherent — face is recognisable, expression matches prompt, lighting appears natural.</w:t>
+      </w:r>
+    </w:p>
+    <w:p>
+      <w:pPr>
+        <w:spacing w:after="100" w:line="300" w:lineRule="auto"/>
+        <w:jc w:val="both"/>
+      </w:pPr>
+      <w:r>
+        <w:t>Video and metadata saved to Drive. Notebook committed to GitHub.</w:t>
+      </w:r>
+    </w:p>
+    <w:p>
+      <w:pPr>
+        <w:spacing w:after="100" w:line="300" w:lineRule="auto"/>
+        <w:jc w:val="both"/>
+      </w:pPr>
+      <w:r>
+        <w:t xml:space="preserve">Practical observation for methodology chapter: T4 GPU is not viable for LTX-Video full model despite </w:t>
+      </w:r>
+      <w:proofErr w:type="spellStart"/>
+      <w:r>
+        <w:t>Colab</w:t>
+      </w:r>
+      <w:proofErr w:type="spellEnd"/>
+      <w:r>
+        <w:t xml:space="preserve"> documentation suggesting otherwise. L4 is the minimum practical GPU. This will be noted as a hardware constraint in the methodology.</w:t>
+      </w:r>
+    </w:p>
+    <w:p>
+      <w:pPr>
+        <w:spacing w:after="100" w:line="300" w:lineRule="auto"/>
+        <w:jc w:val="both"/>
+      </w:pPr>
+      <w:r>
+        <w:t>Compute unit consumption: ~2 units for the full session (loading + one generation). Rate of ~4.5 units/hour on L4.</w:t>
       </w:r>
     </w:p>
     <w:p>
@@ -1398,6 +1444,7 @@
           <w:sz w:val="30"/>
           <w:szCs w:val="30"/>
         </w:rPr>
+        <w:lastRenderedPageBreak/>
         <w:t>Template for Future Weekly Entries</w:t>
       </w:r>
     </w:p>
@@ -1487,7 +1534,6 @@
         <w:jc w:val="both"/>
       </w:pPr>
       <w:r>
-        <w:lastRenderedPageBreak/>
         <w:t>• Reflection on the week</w:t>
       </w:r>
     </w:p>
@@ -2099,7 +2145,6 @@
   <w:style w:type="character" w:default="1" w:styleId="DefaultParagraphFont">
     <w:name w:val="Default Paragraph Font"/>
     <w:uiPriority w:val="1"/>
-    <w:semiHidden/>
     <w:unhideWhenUsed/>
   </w:style>
   <w:style w:type="table" w:default="1" w:styleId="TableNormal">

</xml_diff>

<commit_message>
HunyuanVideo working on A100 (L4 insufficient for this model)
</commit_message>
<xml_diff>
--- a/logbook/Project_Logbook.docx
+++ b/logbook/Project_Logbook.docx
@@ -223,15 +223,7 @@
         <w:t xml:space="preserve">Reflection: </w:t>
       </w:r>
       <w:r>
-        <w:t xml:space="preserve">In retrospect this framing was quite conventional. The face-swap detection literature was already </w:t>
-      </w:r>
-      <w:proofErr w:type="gramStart"/>
-      <w:r>
-        <w:t>crowded</w:t>
-      </w:r>
-      <w:proofErr w:type="gramEnd"/>
-      <w:r>
-        <w:t xml:space="preserve"> and my initial proposal did not clearly articulate what my project would contribute beyond what published work had done. The critique later raised by my supervisor was foreshadowed here.</w:t>
+        <w:t>In retrospect this framing was quite conventional. The face-swap detection literature was already crowded and my initial proposal did not clearly articulate what my project would contribute beyond what published work had done. The critique later raised by my supervisor was foreshadowed here.</w:t>
       </w:r>
     </w:p>
     <w:p>
@@ -323,17 +315,12 @@
         <w:t xml:space="preserve">The critical review process forced me to examine the paper's claims closely. The paper reported 97.8% accuracy on </w:t>
       </w:r>
       <w:proofErr w:type="spellStart"/>
-      <w:proofErr w:type="gramStart"/>
       <w:r>
         <w:t>FakeAVCeleb</w:t>
       </w:r>
       <w:proofErr w:type="spellEnd"/>
       <w:r>
-        <w:t>, but</w:t>
-      </w:r>
-      <w:proofErr w:type="gramEnd"/>
-      <w:r>
-        <w:t xml:space="preserve"> conducted no cross-dataset generalisation testing and used only </w:t>
+        <w:t xml:space="preserve">, but conducted no cross-dataset generalisation testing and used only </w:t>
       </w:r>
       <w:proofErr w:type="spellStart"/>
       <w:r>
@@ -341,15 +328,7 @@
       </w:r>
       <w:proofErr w:type="spellEnd"/>
       <w:r>
-        <w:t xml:space="preserve"> for evaluation. It advertised interpretability but implemented none. Its comparison table mixed results across different datasets. It contained an equation typo (Eq. 19) where the chaotic-map parameter update reduces to zero. These weaknesses informed my later critique of the field: high in-distribution accuracy is </w:t>
-      </w:r>
-      <w:proofErr w:type="gramStart"/>
-      <w:r>
-        <w:t>misleading</w:t>
-      </w:r>
-      <w:proofErr w:type="gramEnd"/>
-      <w:r>
-        <w:t xml:space="preserve"> and interpretability is often claimed but rarely delivered.</w:t>
+        <w:t xml:space="preserve"> for evaluation. It advertised interpretability but implemented none. Its comparison table mixed results across different datasets. It contained an equation typo (Eq. 19) where the chaotic-map parameter update reduces to zero. These weaknesses informed my later critique of the field: high in-distribution accuracy is misleading and interpretability is often claimed but rarely delivered.</w:t>
       </w:r>
     </w:p>
     <w:p>
@@ -641,23 +620,7 @@
         <w:t xml:space="preserve">Reflection: </w:t>
       </w:r>
       <w:r>
-        <w:t xml:space="preserve">This meeting was the turning point of the project. My original framing had been </w:t>
-      </w:r>
-      <w:proofErr w:type="gramStart"/>
-      <w:r>
-        <w:t>conventional</w:t>
-      </w:r>
-      <w:proofErr w:type="gramEnd"/>
-      <w:r>
-        <w:t xml:space="preserve"> and the supervisor was right that it lacked a defensible novelty story. His comment about video datasets being 'easy to obtain from social media' was practically informative and reshaped my thinking about what data was </w:t>
-      </w:r>
-      <w:proofErr w:type="gramStart"/>
-      <w:r>
-        <w:t>actually available</w:t>
-      </w:r>
-      <w:proofErr w:type="gramEnd"/>
-      <w:r>
-        <w:t>.</w:t>
+        <w:t>This meeting was the turning point of the project. My original framing had been conventional and the supervisor was right that it lacked a defensible novelty story. His comment about video datasets being 'easy to obtain from social media' was practically informative and reshaped my thinking about what data was actually available.</w:t>
       </w:r>
     </w:p>
     <w:p>
@@ -922,15 +885,7 @@
         <w:t xml:space="preserve">Reflection: </w:t>
       </w:r>
       <w:r>
-        <w:t xml:space="preserve">This meeting made explicit that the supervisor was not going to hand me a topic. He wanted me to justify my choice through reasoning about the field. That was appropriate at MSc </w:t>
-      </w:r>
-      <w:proofErr w:type="gramStart"/>
-      <w:r>
-        <w:t>level</w:t>
-      </w:r>
-      <w:proofErr w:type="gramEnd"/>
-      <w:r>
-        <w:t xml:space="preserve"> and I should have understood it earlier.</w:t>
+        <w:t>This meeting made explicit that the supervisor was not going to hand me a topic. He wanted me to justify my choice through reasoning about the field. That was appropriate at MSc level and I should have understood it earlier.</w:t>
       </w:r>
     </w:p>
     <w:p>
@@ -1158,15 +1113,7 @@
         <w:t xml:space="preserve">Reflection: </w:t>
       </w:r>
       <w:r>
-        <w:t xml:space="preserve">The redirections were emotionally </w:t>
-      </w:r>
-      <w:proofErr w:type="gramStart"/>
-      <w:r>
-        <w:t>difficult</w:t>
-      </w:r>
-      <w:proofErr w:type="gramEnd"/>
-      <w:r>
-        <w:t xml:space="preserve"> but the final project is stronger for them. The multi-model comparative design gives the study a defensible novelty story that a single-model project would have lacked. Some of the environment work done earlier for the original detector project was not wasted — </w:t>
+        <w:t xml:space="preserve">The redirections were emotionally difficult but the final project is stronger for them. The multi-model comparative design gives the study a defensible novelty story that a single-model project would have lacked. Some of the environment work done earlier for the original detector project was not wasted — </w:t>
       </w:r>
       <w:proofErr w:type="spellStart"/>
       <w:r>
@@ -1345,11 +1292,179 @@
     <w:p>
       <w:pPr>
         <w:spacing w:after="100" w:line="300" w:lineRule="auto"/>
-        <w:jc w:val="both"/>
       </w:pPr>
       <w:r>
         <w:t>Compute unit consumption: ~2 units for the full session (loading + one generation). Rate of ~4.5 units/hour on L4.</w:t>
       </w:r>
+      <w:r>
+        <w:br/>
+      </w:r>
+    </w:p>
+    <w:p>
+      <w:pPr>
+        <w:spacing w:after="100" w:line="300" w:lineRule="auto"/>
+      </w:pPr>
+      <w:r>
+        <w:rPr>
+          <w:b/>
+          <w:bCs/>
+        </w:rPr>
+        <w:t>Thursday 17 July 2026 — actual progress:</w:t>
+      </w:r>
+    </w:p>
+    <w:p>
+      <w:pPr>
+        <w:spacing w:after="100" w:line="300" w:lineRule="auto"/>
+      </w:pPr>
+      <w:r>
+        <w:t xml:space="preserve">Set up second notebook 02_hunyuanvideo_setup_and_first_video.ipynb for </w:t>
+      </w:r>
+      <w:proofErr w:type="spellStart"/>
+      <w:r>
+        <w:t>HunyuanVideo</w:t>
+      </w:r>
+      <w:proofErr w:type="spellEnd"/>
+      <w:r>
+        <w:t xml:space="preserve">. Initial attempt on L4 GPU (22 GB VRAM) failed at the generation stage with </w:t>
+      </w:r>
+      <w:proofErr w:type="spellStart"/>
+      <w:r>
+        <w:t>OutOfMemoryError</w:t>
+      </w:r>
+      <w:proofErr w:type="spellEnd"/>
+      <w:r>
+        <w:t xml:space="preserve">, despite CPU offloading, VAE tiling, and VAE slicing enabled. After model loaded (using 21.76 GB of 22 GB VRAM), no memory </w:t>
+      </w:r>
+      <w:r>
+        <w:lastRenderedPageBreak/>
+        <w:t>remained for denoising computations. Reduced generation parameters (512×320, 45 frames, 20 steps) did not resolve the issue — the problem was the model itself, not the generation size.</w:t>
+      </w:r>
+    </w:p>
+    <w:p>
+      <w:pPr>
+        <w:spacing w:after="100" w:line="300" w:lineRule="auto"/>
+      </w:pPr>
+      <w:r>
+        <w:t>Switched runtime to A100 GPU (80 GB VRAM). Encountered a secondary error from the previous CPU-offload configuration causing a device mismatch (tensors split between CPU and GPU). Reloaded the model cleanly without CPU offload — this worked immediately given A100's ample memory.</w:t>
+      </w:r>
+    </w:p>
+    <w:p>
+      <w:pPr>
+        <w:spacing w:after="100" w:line="300" w:lineRule="auto"/>
+      </w:pPr>
+      <w:r>
+        <w:t>Successfully generated one video at 704×480, 73 frames, 30 inference steps in 249.4 seconds. Output visually coherent, showing a woman as described in the prompt.</w:t>
+      </w:r>
+    </w:p>
+    <w:p>
+      <w:pPr>
+        <w:spacing w:after="100" w:line="300" w:lineRule="auto"/>
+      </w:pPr>
+      <w:r>
+        <w:rPr>
+          <w:b/>
+          <w:bCs/>
+        </w:rPr>
+        <w:t>Practical implications for Week 2 bulk generation:</w:t>
+      </w:r>
+    </w:p>
+    <w:p>
+      <w:pPr>
+        <w:numPr>
+          <w:ilvl w:val="0"/>
+          <w:numId w:val="2"/>
+        </w:numPr>
+        <w:spacing w:after="100" w:line="300" w:lineRule="auto"/>
+      </w:pPr>
+      <w:proofErr w:type="spellStart"/>
+      <w:r>
+        <w:t>HunyuanVideo</w:t>
+      </w:r>
+      <w:proofErr w:type="spellEnd"/>
+      <w:r>
+        <w:t xml:space="preserve"> requires A100 (higher compute unit cost than L4)</w:t>
+      </w:r>
+    </w:p>
+    <w:p>
+      <w:pPr>
+        <w:numPr>
+          <w:ilvl w:val="0"/>
+          <w:numId w:val="2"/>
+        </w:numPr>
+        <w:spacing w:after="100" w:line="300" w:lineRule="auto"/>
+      </w:pPr>
+      <w:r>
+        <w:t xml:space="preserve">50 </w:t>
+      </w:r>
+      <w:proofErr w:type="spellStart"/>
+      <w:r>
+        <w:t>HunyuanVideo</w:t>
+      </w:r>
+      <w:proofErr w:type="spellEnd"/>
+      <w:r>
+        <w:t xml:space="preserve"> videos at ~4 minutes each = ~3.3 hours = ~40 compute units on A100</w:t>
+      </w:r>
+    </w:p>
+    <w:p>
+      <w:pPr>
+        <w:numPr>
+          <w:ilvl w:val="0"/>
+          <w:numId w:val="2"/>
+        </w:numPr>
+        <w:spacing w:after="100" w:line="300" w:lineRule="auto"/>
+      </w:pPr>
+      <w:r>
+        <w:t>This is affordable within remaining budget but should be scheduled carefully</w:t>
+      </w:r>
+    </w:p>
+    <w:p>
+      <w:pPr>
+        <w:spacing w:after="100" w:line="300" w:lineRule="auto"/>
+      </w:pPr>
+      <w:r>
+        <w:rPr>
+          <w:b/>
+          <w:bCs/>
+        </w:rPr>
+        <w:t>Reflection:</w:t>
+      </w:r>
+      <w:r>
+        <w:t xml:space="preserve"> Today's debugging (through 3 distinct failure modes before success) is representative of realistic research engineering. The findings — that </w:t>
+      </w:r>
+      <w:proofErr w:type="spellStart"/>
+      <w:r>
+        <w:t>HunyuanVideo</w:t>
+      </w:r>
+      <w:proofErr w:type="spellEnd"/>
+      <w:r>
+        <w:t xml:space="preserve"> cannot run on L4 and requires A100 — are genuine methodological observations that will be documented in the dissertation methodology chapter.</w:t>
+      </w:r>
+    </w:p>
+    <w:p>
+      <w:pPr>
+        <w:spacing w:after="100" w:line="300" w:lineRule="auto"/>
+      </w:pPr>
+      <w:r>
+        <w:rPr>
+          <w:b/>
+          <w:bCs/>
+        </w:rPr>
+        <w:t>Compute unit consumption today:</w:t>
+      </w:r>
+      <w:r>
+        <w:t xml:space="preserve"> approximately [X] units across failed and successful attempts.</w:t>
+      </w:r>
+    </w:p>
+    <w:p>
+      <w:pPr>
+        <w:spacing w:after="100" w:line="300" w:lineRule="auto"/>
+      </w:pPr>
+    </w:p>
+    <w:p>
+      <w:pPr>
+        <w:spacing w:after="100" w:line="300" w:lineRule="auto"/>
+        <w:jc w:val="both"/>
+      </w:pPr>
     </w:p>
     <w:p>
       <w:pPr>
@@ -1444,7 +1559,6 @@
           <w:sz w:val="30"/>
           <w:szCs w:val="30"/>
         </w:rPr>
-        <w:lastRenderedPageBreak/>
         <w:t>Template for Future Weekly Entries</w:t>
       </w:r>
     </w:p>
@@ -1654,11 +1768,163 @@
       </w:pPr>
     </w:lvl>
   </w:abstractNum>
+  <w:abstractNum w:abstractNumId="1" w15:restartNumberingAfterBreak="0">
+    <w:nsid w:val="60F15747"/>
+    <w:multiLevelType w:val="multilevel"/>
+    <w:tmpl w:val="07500232"/>
+    <w:lvl w:ilvl="0">
+      <w:start w:val="1"/>
+      <w:numFmt w:val="bullet"/>
+      <w:lvlText w:val=""/>
+      <w:lvlJc w:val="left"/>
+      <w:pPr>
+        <w:tabs>
+          <w:tab w:val="num" w:pos="720"/>
+        </w:tabs>
+        <w:ind w:left="720" w:hanging="360"/>
+      </w:pPr>
+      <w:rPr>
+        <w:rFonts w:ascii="Symbol" w:hAnsi="Symbol" w:hint="default"/>
+        <w:sz w:val="20"/>
+      </w:rPr>
+    </w:lvl>
+    <w:lvl w:ilvl="1" w:tentative="1">
+      <w:start w:val="1"/>
+      <w:numFmt w:val="bullet"/>
+      <w:lvlText w:val="o"/>
+      <w:lvlJc w:val="left"/>
+      <w:pPr>
+        <w:tabs>
+          <w:tab w:val="num" w:pos="1440"/>
+        </w:tabs>
+        <w:ind w:left="1440" w:hanging="360"/>
+      </w:pPr>
+      <w:rPr>
+        <w:rFonts w:ascii="Courier New" w:hAnsi="Courier New" w:hint="default"/>
+        <w:sz w:val="20"/>
+      </w:rPr>
+    </w:lvl>
+    <w:lvl w:ilvl="2" w:tentative="1">
+      <w:start w:val="1"/>
+      <w:numFmt w:val="bullet"/>
+      <w:lvlText w:val=""/>
+      <w:lvlJc w:val="left"/>
+      <w:pPr>
+        <w:tabs>
+          <w:tab w:val="num" w:pos="2160"/>
+        </w:tabs>
+        <w:ind w:left="2160" w:hanging="360"/>
+      </w:pPr>
+      <w:rPr>
+        <w:rFonts w:ascii="Wingdings" w:hAnsi="Wingdings" w:hint="default"/>
+        <w:sz w:val="20"/>
+      </w:rPr>
+    </w:lvl>
+    <w:lvl w:ilvl="3" w:tentative="1">
+      <w:start w:val="1"/>
+      <w:numFmt w:val="bullet"/>
+      <w:lvlText w:val=""/>
+      <w:lvlJc w:val="left"/>
+      <w:pPr>
+        <w:tabs>
+          <w:tab w:val="num" w:pos="2880"/>
+        </w:tabs>
+        <w:ind w:left="2880" w:hanging="360"/>
+      </w:pPr>
+      <w:rPr>
+        <w:rFonts w:ascii="Wingdings" w:hAnsi="Wingdings" w:hint="default"/>
+        <w:sz w:val="20"/>
+      </w:rPr>
+    </w:lvl>
+    <w:lvl w:ilvl="4" w:tentative="1">
+      <w:start w:val="1"/>
+      <w:numFmt w:val="bullet"/>
+      <w:lvlText w:val=""/>
+      <w:lvlJc w:val="left"/>
+      <w:pPr>
+        <w:tabs>
+          <w:tab w:val="num" w:pos="3600"/>
+        </w:tabs>
+        <w:ind w:left="3600" w:hanging="360"/>
+      </w:pPr>
+      <w:rPr>
+        <w:rFonts w:ascii="Wingdings" w:hAnsi="Wingdings" w:hint="default"/>
+        <w:sz w:val="20"/>
+      </w:rPr>
+    </w:lvl>
+    <w:lvl w:ilvl="5" w:tentative="1">
+      <w:start w:val="1"/>
+      <w:numFmt w:val="bullet"/>
+      <w:lvlText w:val=""/>
+      <w:lvlJc w:val="left"/>
+      <w:pPr>
+        <w:tabs>
+          <w:tab w:val="num" w:pos="4320"/>
+        </w:tabs>
+        <w:ind w:left="4320" w:hanging="360"/>
+      </w:pPr>
+      <w:rPr>
+        <w:rFonts w:ascii="Wingdings" w:hAnsi="Wingdings" w:hint="default"/>
+        <w:sz w:val="20"/>
+      </w:rPr>
+    </w:lvl>
+    <w:lvl w:ilvl="6" w:tentative="1">
+      <w:start w:val="1"/>
+      <w:numFmt w:val="bullet"/>
+      <w:lvlText w:val=""/>
+      <w:lvlJc w:val="left"/>
+      <w:pPr>
+        <w:tabs>
+          <w:tab w:val="num" w:pos="5040"/>
+        </w:tabs>
+        <w:ind w:left="5040" w:hanging="360"/>
+      </w:pPr>
+      <w:rPr>
+        <w:rFonts w:ascii="Wingdings" w:hAnsi="Wingdings" w:hint="default"/>
+        <w:sz w:val="20"/>
+      </w:rPr>
+    </w:lvl>
+    <w:lvl w:ilvl="7" w:tentative="1">
+      <w:start w:val="1"/>
+      <w:numFmt w:val="bullet"/>
+      <w:lvlText w:val=""/>
+      <w:lvlJc w:val="left"/>
+      <w:pPr>
+        <w:tabs>
+          <w:tab w:val="num" w:pos="5760"/>
+        </w:tabs>
+        <w:ind w:left="5760" w:hanging="360"/>
+      </w:pPr>
+      <w:rPr>
+        <w:rFonts w:ascii="Wingdings" w:hAnsi="Wingdings" w:hint="default"/>
+        <w:sz w:val="20"/>
+      </w:rPr>
+    </w:lvl>
+    <w:lvl w:ilvl="8" w:tentative="1">
+      <w:start w:val="1"/>
+      <w:numFmt w:val="bullet"/>
+      <w:lvlText w:val=""/>
+      <w:lvlJc w:val="left"/>
+      <w:pPr>
+        <w:tabs>
+          <w:tab w:val="num" w:pos="6480"/>
+        </w:tabs>
+        <w:ind w:left="6480" w:hanging="360"/>
+      </w:pPr>
+      <w:rPr>
+        <w:rFonts w:ascii="Wingdings" w:hAnsi="Wingdings" w:hint="default"/>
+        <w:sz w:val="20"/>
+      </w:rPr>
+    </w:lvl>
+  </w:abstractNum>
   <w:num w:numId="1" w16cid:durableId="2125809091">
     <w:abstractNumId w:val="0"/>
     <w:lvlOverride w:ilvl="0">
       <w:startOverride w:val="1"/>
     </w:lvlOverride>
+  </w:num>
+  <w:num w:numId="2" w16cid:durableId="1184637264">
+    <w:abstractNumId w:val="1"/>
   </w:num>
 </w:numbering>
 </file>

</xml_diff>

<commit_message>
Day 3 (17 Jul): Wan 2.2 T2V-A14B setup on A100 High-RAM after standard A100 OOM
</commit_message>
<xml_diff>
--- a/logbook/Project_Logbook.docx
+++ b/logbook/Project_Logbook.docx
@@ -53,23 +53,7 @@
           <w:i/>
           <w:iCs/>
         </w:rPr>
-        <w:t xml:space="preserve">Supervisor: Prof. </w:t>
-      </w:r>
-      <w:proofErr w:type="spellStart"/>
-      <w:r>
-        <w:rPr>
-          <w:i/>
-          <w:iCs/>
-        </w:rPr>
-        <w:t>Shujun</w:t>
-      </w:r>
-      <w:proofErr w:type="spellEnd"/>
-      <w:r>
-        <w:rPr>
-          <w:i/>
-          <w:iCs/>
-        </w:rPr>
-        <w:t xml:space="preserve"> Li</w:t>
+        <w:t>Supervisor: Prof. Shujun Li</w:t>
       </w:r>
     </w:p>
     <w:p>
@@ -167,15 +151,7 @@
         <w:t xml:space="preserve">Activity: </w:t>
       </w:r>
       <w:r>
-        <w:t xml:space="preserve">Contacted Prof. </w:t>
-      </w:r>
-      <w:proofErr w:type="spellStart"/>
-      <w:r>
-        <w:t>Shujun</w:t>
-      </w:r>
-      <w:proofErr w:type="spellEnd"/>
-      <w:r>
-        <w:t xml:space="preserve"> Li to request supervision for the MSc dissertation. Proposed working on deepfake detection with a focus on explainable, lightweight approaches, motivated by the growing threat of AI-generated multimedia content in cyber security contexts. Supervision was accepted.</w:t>
+        <w:t>Contacted Prof. Shujun Li to request supervision for the MSc dissertation. Proposed working on deepfake detection with a focus on explainable, lightweight approaches, motivated by the growing threat of AI-generated multimedia content in cyber security contexts. Supervision was accepted.</w:t>
       </w:r>
     </w:p>
     <w:p>
@@ -271,15 +247,7 @@
         <w:t xml:space="preserve">Activity: </w:t>
       </w:r>
       <w:r>
-        <w:t xml:space="preserve">Completed the COMP7993/COMP7300 Critical Review Report, due 12 June 2026. Selected the paper by </w:t>
-      </w:r>
-      <w:proofErr w:type="spellStart"/>
-      <w:r>
-        <w:t>Bahadure</w:t>
-      </w:r>
-      <w:proofErr w:type="spellEnd"/>
-      <w:r>
-        <w:t xml:space="preserve"> and Mane (2026) 'Deepfake detection using deep convolutional neural network and long short-term memory' (Multimedia Tools and Applications, Springer). Submitted on Moodle.</w:t>
+        <w:t>Completed the COMP7993/COMP7300 Critical Review Report, due 12 June 2026. Selected the paper by Bahadure and Mane (2026) 'Deepfake detection using deep convolutional neural network and long short-term memory' (Multimedia Tools and Applications, Springer). Submitted on Moodle.</w:t>
       </w:r>
     </w:p>
     <w:p>
@@ -312,23 +280,7 @@
         <w:t xml:space="preserve">Key learnings that fed the dissertation: </w:t>
       </w:r>
       <w:r>
-        <w:t xml:space="preserve">The critical review process forced me to examine the paper's claims closely. The paper reported 97.8% accuracy on </w:t>
-      </w:r>
-      <w:proofErr w:type="spellStart"/>
-      <w:r>
-        <w:t>FakeAVCeleb</w:t>
-      </w:r>
-      <w:proofErr w:type="spellEnd"/>
-      <w:r>
-        <w:t xml:space="preserve">, but conducted no cross-dataset generalisation testing and used only </w:t>
-      </w:r>
-      <w:proofErr w:type="spellStart"/>
-      <w:r>
-        <w:t>FakeAVCeleb</w:t>
-      </w:r>
-      <w:proofErr w:type="spellEnd"/>
-      <w:r>
-        <w:t xml:space="preserve"> for evaluation. It advertised interpretability but implemented none. Its comparison table mixed results across different datasets. It contained an equation typo (Eq. 19) where the chaotic-map parameter update reduces to zero. These weaknesses informed my later critique of the field: high in-distribution accuracy is misleading and interpretability is often claimed but rarely delivered.</w:t>
+        <w:t>The critical review process forced me to examine the paper's claims closely. The paper reported 97.8% accuracy on FakeAVCeleb, but conducted no cross-dataset generalisation testing and used only FakeAVCeleb for evaluation. It advertised interpretability but implemented none. Its comparison table mixed results across different datasets. It contained an equation typo (Eq. 19) where the chaotic-map parameter update reduces to zero. These weaknesses informed my later critique of the field: high in-distribution accuracy is misleading and interpretability is often claimed but rarely delivered.</w:t>
       </w:r>
     </w:p>
     <w:p>
@@ -392,63 +344,7 @@
         <w:t xml:space="preserve">Activity: </w:t>
       </w:r>
       <w:r>
-        <w:t xml:space="preserve">Set up the development environment for the originally proposed project. Installed </w:t>
-      </w:r>
-      <w:proofErr w:type="spellStart"/>
-      <w:r>
-        <w:t>Miniconda</w:t>
-      </w:r>
-      <w:proofErr w:type="spellEnd"/>
-      <w:r>
-        <w:t xml:space="preserve"> with Python 3.12 in an isolated environment. Installed </w:t>
-      </w:r>
-      <w:proofErr w:type="spellStart"/>
-      <w:r>
-        <w:t>PyTorch</w:t>
-      </w:r>
-      <w:proofErr w:type="spellEnd"/>
-      <w:r>
-        <w:t xml:space="preserve"> 2.5.1 with CUDA 12.1 support and verified GPU acceleration on my RTX 3050 Ti laptop. Installed </w:t>
-      </w:r>
-      <w:proofErr w:type="spellStart"/>
-      <w:r>
-        <w:t>timm</w:t>
-      </w:r>
-      <w:proofErr w:type="spellEnd"/>
-      <w:r>
-        <w:t xml:space="preserve">, </w:t>
-      </w:r>
-      <w:proofErr w:type="spellStart"/>
-      <w:r>
-        <w:t>pytorch</w:t>
-      </w:r>
-      <w:proofErr w:type="spellEnd"/>
-      <w:r>
-        <w:t xml:space="preserve">-grad-cam, </w:t>
-      </w:r>
-      <w:proofErr w:type="spellStart"/>
-      <w:r>
-        <w:t>facenet-pytorch</w:t>
-      </w:r>
-      <w:proofErr w:type="spellEnd"/>
-      <w:r>
-        <w:t xml:space="preserve">, OpenCV, </w:t>
-      </w:r>
-      <w:proofErr w:type="spellStart"/>
-      <w:r>
-        <w:t>MediaPipe</w:t>
-      </w:r>
-      <w:proofErr w:type="spellEnd"/>
-      <w:r>
-        <w:t>, and Jupyter Lab. Created a private GitHub repository (</w:t>
-      </w:r>
-      <w:proofErr w:type="spellStart"/>
-      <w:r>
-        <w:t>msc</w:t>
-      </w:r>
-      <w:proofErr w:type="spellEnd"/>
-      <w:r>
-        <w:t>-deepfake-detection) and pushed initial project structure. Verified MobileNetV3-Small inference end-to-end on a sample image.</w:t>
+        <w:t>Set up the development environment for the originally proposed project. Installed Miniconda with Python 3.12 in an isolated environment. Installed PyTorch 2.5.1 with CUDA 12.1 support and verified GPU acceleration on my RTX 3050 Ti laptop. Installed timm, pytorch-grad-cam, facenet-pytorch, OpenCV, MediaPipe, and Jupyter Lab. Created a private GitHub repository (msc-deepfake-detection) and pushed initial project structure. Verified MobileNetV3-Small inference end-to-end on a sample image.</w:t>
       </w:r>
     </w:p>
     <w:p>
@@ -464,31 +360,7 @@
         <w:t xml:space="preserve">Dataset acquisition: </w:t>
       </w:r>
       <w:r>
-        <w:t xml:space="preserve">Applied for </w:t>
-      </w:r>
-      <w:proofErr w:type="spellStart"/>
-      <w:r>
-        <w:t>FaceForensics</w:t>
-      </w:r>
-      <w:proofErr w:type="spellEnd"/>
-      <w:r>
-        <w:t>++ access through the official Google form. Applied for Celeb-DF v2 access. Celeb-DF v2 was approved and downloaded (</w:t>
-      </w:r>
-      <w:proofErr w:type="spellStart"/>
-      <w:r>
-        <w:t>approx</w:t>
-      </w:r>
-      <w:proofErr w:type="spellEnd"/>
-      <w:r>
-        <w:t xml:space="preserve"> 9.45 GB, 6,530 files across three folders: Celeb-real, Celeb-synthesis, YouTube-real, plus the official test-split file). </w:t>
-      </w:r>
-      <w:proofErr w:type="spellStart"/>
-      <w:r>
-        <w:t>FaceForensics</w:t>
-      </w:r>
-      <w:proofErr w:type="spellEnd"/>
-      <w:r>
-        <w:t>++ approval was pending throughout the project and did not arrive in time.</w:t>
+        <w:t>Applied for FaceForensics++ access through the official Google form. Applied for Celeb-DF v2 access. Celeb-DF v2 was approved and downloaded (approx 9.45 GB, 6,530 files across three folders: Celeb-real, Celeb-synthesis, YouTube-real, plus the official test-split file). FaceForensics++ approval was pending throughout the project and did not arrive in time.</w:t>
       </w:r>
     </w:p>
     <w:p>
@@ -504,23 +376,7 @@
         <w:t xml:space="preserve">Reflection: </w:t>
       </w:r>
       <w:r>
-        <w:t xml:space="preserve">The technical environment came together cleanly. In hindsight, this early setup work was largely reusable across all later versions of the project. The </w:t>
-      </w:r>
-      <w:proofErr w:type="spellStart"/>
-      <w:r>
-        <w:t>PyTorch</w:t>
-      </w:r>
-      <w:proofErr w:type="spellEnd"/>
-      <w:r>
-        <w:t xml:space="preserve">, GPU, and </w:t>
-      </w:r>
-      <w:proofErr w:type="spellStart"/>
-      <w:r>
-        <w:t>Colab</w:t>
-      </w:r>
-      <w:proofErr w:type="spellEnd"/>
-      <w:r>
-        <w:t xml:space="preserve"> infrastructure did not need re-doing when the project direction changed later.</w:t>
+        <w:t>The technical environment came together cleanly. In hindsight, this early setup work was largely reusable across all later versions of the project. The PyTorch, GPU, and Colab infrastructure did not need re-doing when the project direction changed later.</w:t>
       </w:r>
     </w:p>
     <w:p>
@@ -668,31 +524,7 @@
         <w:t xml:space="preserve">Activity: </w:t>
       </w:r>
       <w:r>
-        <w:t xml:space="preserve">Structured literature review across roughly 20 papers covering face manipulation detection, modern AI-generated video, dataset benchmarks, and forensic analysis. Focus papers included Zhang et al. (2026) MTA survey, Soundarya and Gururaj (2026) Discover Applied Sciences critical review, </w:t>
-      </w:r>
-      <w:proofErr w:type="spellStart"/>
-      <w:r>
-        <w:t>CoCoVideo</w:t>
-      </w:r>
-      <w:proofErr w:type="spellEnd"/>
-      <w:r>
-        <w:t xml:space="preserve"> (2026), </w:t>
-      </w:r>
-      <w:proofErr w:type="spellStart"/>
-      <w:r>
-        <w:t>GenVidBench</w:t>
-      </w:r>
-      <w:proofErr w:type="spellEnd"/>
-      <w:r>
-        <w:t xml:space="preserve"> (2025), Deepfake-Eval-2024, </w:t>
-      </w:r>
-      <w:proofErr w:type="spellStart"/>
-      <w:r>
-        <w:t>MoE</w:t>
-      </w:r>
-      <w:proofErr w:type="spellEnd"/>
-      <w:r>
-        <w:t>-FFD (Kong et al. IEEE TDSC 2025), and the Yermakov CLIP-based detector (2025).</w:t>
+        <w:t>Structured literature review across roughly 20 papers covering face manipulation detection, modern AI-generated video, dataset benchmarks, and forensic analysis. Focus papers included Zhang et al. (2026) MTA survey, Soundarya and Gururaj (2026) Discover Applied Sciences critical review, CoCoVideo (2026), GenVidBench (2025), Deepfake-Eval-2024, MoE-FFD (Kong et al. IEEE TDSC 2025), and the Yermakov CLIP-based detector (2025).</w:t>
       </w:r>
     </w:p>
     <w:p>
@@ -708,23 +540,7 @@
         <w:t xml:space="preserve">Key insight from reading: </w:t>
       </w:r>
       <w:r>
-        <w:t>Only one paper in the reviewed set (</w:t>
-      </w:r>
-      <w:proofErr w:type="spellStart"/>
-      <w:r>
-        <w:t>CoCoVideo</w:t>
-      </w:r>
-      <w:proofErr w:type="spellEnd"/>
-      <w:r>
-        <w:t xml:space="preserve">, June 2026) systematically covered modern 2024–2026 commercial video generation models. Every other paper still evaluated on </w:t>
-      </w:r>
-      <w:proofErr w:type="spellStart"/>
-      <w:r>
-        <w:t>FaceForensics</w:t>
-      </w:r>
-      <w:proofErr w:type="spellEnd"/>
-      <w:r>
-        <w:t>++, Celeb-DF, and DFDC, which are 2018–2020 face-swap datasets. Deepfake-Eval-2024 showed detectors dropping approximately 50% in AUC when moved from academic benchmarks to real 2024 social media content. This confirmed the gap the supervisor had pointed at.</w:t>
+        <w:t>Only one paper in the reviewed set (CoCoVideo, June 2026) systematically covered modern 2024–2026 commercial video generation models. Every other paper still evaluated on FaceForensics++, Celeb-DF, and DFDC, which are 2018–2020 face-swap datasets. Deepfake-Eval-2024 showed detectors dropping approximately 50% in AUC when moved from academic benchmarks to real 2024 social media content. This confirmed the gap the supervisor had pointed at.</w:t>
       </w:r>
     </w:p>
     <w:p>
@@ -836,15 +652,7 @@
         <w:t xml:space="preserve">Options identified: </w:t>
       </w:r>
       <w:r>
-        <w:t xml:space="preserve">Direction 1: build a new detector (crowded and risky). Direction 2: build a new dataset covering modern generators (novel but potentially requires paid APIs and ethics approval). Direction 3: build a software tool for benchmarking or dataset creation (novel resource-paper contribution but competes with </w:t>
-      </w:r>
-      <w:proofErr w:type="spellStart"/>
-      <w:r>
-        <w:t>DeepFakeBench</w:t>
-      </w:r>
-      <w:proofErr w:type="spellEnd"/>
-      <w:r>
-        <w:t>). Direction 4: pure artefact characterisation study.</w:t>
+        <w:t>Direction 1: build a new detector (crowded and risky). Direction 2: build a new dataset covering modern generators (novel but potentially requires paid APIs and ethics approval). Direction 3: build a software tool for benchmarking or dataset creation (novel resource-paper contribution but competes with DeepFakeBench). Direction 4: pure artefact characterisation study.</w:t>
       </w:r>
     </w:p>
     <w:p>
@@ -861,15 +669,7 @@
         <w:t xml:space="preserve">Post-meeting actions: </w:t>
       </w:r>
       <w:r>
-        <w:t xml:space="preserve">Considered each direction against constraints (budget, time, ethics window). Ruled out Direction 2 due to API costs and ethics timeline. Considered Direction 3 but concluded I could not confidently identify a gap </w:t>
-      </w:r>
-      <w:proofErr w:type="spellStart"/>
-      <w:r>
-        <w:t>DeepFakeBench</w:t>
-      </w:r>
-      <w:proofErr w:type="spellEnd"/>
-      <w:r>
-        <w:t xml:space="preserve"> does not cover. Eventually settled on a characterisation study framed around comparing traditional face-manipulation deepfakes with modern LVM/MLLM-based face editing.</w:t>
+        <w:t>Considered each direction against constraints (budget, time, ethics window). Ruled out Direction 2 due to API costs and ethics timeline. Considered Direction 3 but concluded I could not confidently identify a gap DeepFakeBench does not cover. Eventually settled on a characterisation study framed around comparing traditional face-manipulation deepfakes with modern LVM/MLLM-based face editing.</w:t>
       </w:r>
     </w:p>
     <w:p>
@@ -1081,23 +881,7 @@
         <w:t xml:space="preserve">Final approved direction: </w:t>
       </w:r>
       <w:r>
-        <w:t xml:space="preserve">Comparative study of artefacts in modern AI-generated video using multiple MLLMs. Two video groups: open-weight generators self-hosted on </w:t>
-      </w:r>
-      <w:proofErr w:type="spellStart"/>
-      <w:r>
-        <w:t>Colab</w:t>
-      </w:r>
-      <w:proofErr w:type="spellEnd"/>
-      <w:r>
-        <w:t xml:space="preserve"> Pro (LTX-2.3, </w:t>
-      </w:r>
-      <w:proofErr w:type="spellStart"/>
-      <w:r>
-        <w:t>HunyuanVideo</w:t>
-      </w:r>
-      <w:proofErr w:type="spellEnd"/>
-      <w:r>
-        <w:t>, Wan 2.7) and commercial state-of-the-art models via publicly-posted user samples (Kling 3.0, Veo 3.1, Runway Aleph). Four MLLMs used as analytical tools: Claude Opus 4.7, Gemini 2.0 Flash, Qwen2.5-VL, LLaVA-1.6.</w:t>
+        <w:t>Comparative study of artefacts in modern AI-generated video using multiple MLLMs. Two video groups: open-weight generators self-hosted on Colab Pro (LTX-2.3, HunyuanVideo, Wan 2.7) and commercial state-of-the-art models via publicly-posted user samples (Kling 3.0, Veo 3.1, Runway Aleph). Four MLLMs used as analytical tools: Claude Opus 4.7, Gemini 2.0 Flash, Qwen2.5-VL, LLaVA-1.6.</w:t>
       </w:r>
     </w:p>
     <w:p>
@@ -1113,23 +897,7 @@
         <w:t xml:space="preserve">Reflection: </w:t>
       </w:r>
       <w:r>
-        <w:t xml:space="preserve">The redirections were emotionally difficult but the final project is stronger for them. The multi-model comparative design gives the study a defensible novelty story that a single-model project would have lacked. Some of the environment work done earlier for the original detector project was not wasted — </w:t>
-      </w:r>
-      <w:proofErr w:type="spellStart"/>
-      <w:r>
-        <w:t>PyTorch</w:t>
-      </w:r>
-      <w:proofErr w:type="spellEnd"/>
-      <w:r>
-        <w:t xml:space="preserve">, GPU verification, </w:t>
-      </w:r>
-      <w:proofErr w:type="spellStart"/>
-      <w:r>
-        <w:t>Colab</w:t>
-      </w:r>
-      <w:proofErr w:type="spellEnd"/>
-      <w:r>
-        <w:t xml:space="preserve"> Pro access, and general Python tooling all remain useful.</w:t>
+        <w:t>The redirections were emotionally difficult but the final project is stronger for them. The multi-model comparative design gives the study a defensible novelty story that a single-model project would have lacked. Some of the environment work done earlier for the original detector project was not wasted — PyTorch, GPU verification, Colab Pro access, and general Python tooling all remain useful.</w:t>
       </w:r>
     </w:p>
     <w:p>
@@ -1193,31 +961,7 @@
         <w:t xml:space="preserve">Planned tasks: </w:t>
       </w:r>
       <w:r>
-        <w:t xml:space="preserve">Send confirmation to supervisor. Restructure GitHub repository to reflect new project direction. Set up </w:t>
-      </w:r>
-      <w:proofErr w:type="spellStart"/>
-      <w:r>
-        <w:t>Colab</w:t>
-      </w:r>
-      <w:proofErr w:type="spellEnd"/>
-      <w:r>
-        <w:t xml:space="preserve"> Pro notebook for LTX-2.3. Install and verify LTX-2.3, </w:t>
-      </w:r>
-      <w:proofErr w:type="spellStart"/>
-      <w:r>
-        <w:t>HunyuanVideo</w:t>
-      </w:r>
-      <w:proofErr w:type="spellEnd"/>
-      <w:r>
-        <w:t xml:space="preserve">, and Wan 2.7. Set up all four MLLMs (Claude, Gemini, Qwen, </w:t>
-      </w:r>
-      <w:proofErr w:type="spellStart"/>
-      <w:r>
-        <w:t>LLaVA</w:t>
-      </w:r>
-      <w:proofErr w:type="spellEnd"/>
-      <w:r>
-        <w:t>). Verify end-to-end pipeline on 5 test videos. Draft standardised analysis prompt template.</w:t>
+        <w:t>Send confirmation to supervisor. Restructure GitHub repository to reflect new project direction. Set up Colab Pro notebook for LTX-2.3. Install and verify LTX-2.3, HunyuanVideo, and Wan 2.7. Set up all four MLLMs (Claude, Gemini, Qwen, LLaVA). Verify end-to-end pipeline on 5 test videos. Draft standardised analysis prompt template.</w:t>
       </w:r>
     </w:p>
     <w:p>
@@ -1243,15 +987,7 @@
         <w:jc w:val="both"/>
       </w:pPr>
       <w:r>
-        <w:t xml:space="preserve">Set up </w:t>
-      </w:r>
-      <w:proofErr w:type="spellStart"/>
-      <w:r>
-        <w:t>Colab</w:t>
-      </w:r>
-      <w:proofErr w:type="spellEnd"/>
-      <w:r>
-        <w:t xml:space="preserve"> Pro notebook 01_ltx_setup_and_first_video.ipynb. Initial attempt on T4 GPU (15 GB VRAM) failed — model loading crashed at 60% due to combined RAM exhaustion despite CPU offloading and VAE slicing optimisations. Switched to L4 GPU (23.66 GB VRAM), which loaded the model successfully using 14.25 GB VRAM.</w:t>
+        <w:t>Set up Colab Pro notebook 01_ltx_setup_and_first_video.ipynb. Initial attempt on T4 GPU (15 GB VRAM) failed — model loading crashed at 60% due to combined RAM exhaustion despite CPU offloading and VAE slicing optimisations. Switched to L4 GPU (23.66 GB VRAM), which loaded the model successfully using 14.25 GB VRAM.</w:t>
       </w:r>
     </w:p>
     <w:p>
@@ -1278,15 +1014,7 @@
         <w:jc w:val="both"/>
       </w:pPr>
       <w:r>
-        <w:t xml:space="preserve">Practical observation for methodology chapter: T4 GPU is not viable for LTX-Video full model despite </w:t>
-      </w:r>
-      <w:proofErr w:type="spellStart"/>
-      <w:r>
-        <w:t>Colab</w:t>
-      </w:r>
-      <w:proofErr w:type="spellEnd"/>
-      <w:r>
-        <w:t xml:space="preserve"> documentation suggesting otherwise. L4 is the minimum practical GPU. This will be noted as a hardware constraint in the methodology.</w:t>
+        <w:t>Practical observation for methodology chapter: T4 GPU is not viable for LTX-Video full model despite Colab documentation suggesting otherwise. L4 is the minimum practical GPU. This will be noted as a hardware constraint in the methodology.</w:t>
       </w:r>
     </w:p>
     <w:p>
@@ -1317,23 +1045,7 @@
         <w:spacing w:after="100" w:line="300" w:lineRule="auto"/>
       </w:pPr>
       <w:r>
-        <w:t xml:space="preserve">Set up second notebook 02_hunyuanvideo_setup_and_first_video.ipynb for </w:t>
-      </w:r>
-      <w:proofErr w:type="spellStart"/>
-      <w:r>
-        <w:t>HunyuanVideo</w:t>
-      </w:r>
-      <w:proofErr w:type="spellEnd"/>
-      <w:r>
-        <w:t xml:space="preserve">. Initial attempt on L4 GPU (22 GB VRAM) failed at the generation stage with </w:t>
-      </w:r>
-      <w:proofErr w:type="spellStart"/>
-      <w:r>
-        <w:t>OutOfMemoryError</w:t>
-      </w:r>
-      <w:proofErr w:type="spellEnd"/>
-      <w:r>
-        <w:t xml:space="preserve">, despite CPU offloading, VAE tiling, and VAE slicing enabled. After model loaded (using 21.76 GB of 22 GB VRAM), no memory </w:t>
+        <w:t xml:space="preserve">Set up second notebook 02_hunyuanvideo_setup_and_first_video.ipynb for HunyuanVideo. Initial attempt on L4 GPU (22 GB VRAM) failed at the generation stage with OutOfMemoryError, despite CPU offloading, VAE tiling, and VAE slicing enabled. After model loaded (using 21.76 GB of 22 GB VRAM), no memory </w:t>
       </w:r>
       <w:r>
         <w:lastRenderedPageBreak/>
@@ -1376,13 +1088,8 @@
         </w:numPr>
         <w:spacing w:after="100" w:line="300" w:lineRule="auto"/>
       </w:pPr>
-      <w:proofErr w:type="spellStart"/>
-      <w:r>
-        <w:t>HunyuanVideo</w:t>
-      </w:r>
-      <w:proofErr w:type="spellEnd"/>
-      <w:r>
-        <w:t xml:space="preserve"> requires A100 (higher compute unit cost than L4)</w:t>
+      <w:r>
+        <w:t>HunyuanVideo requires A100 (higher compute unit cost than L4)</w:t>
       </w:r>
     </w:p>
     <w:p>
@@ -1394,15 +1101,7 @@
         <w:spacing w:after="100" w:line="300" w:lineRule="auto"/>
       </w:pPr>
       <w:r>
-        <w:t xml:space="preserve">50 </w:t>
-      </w:r>
-      <w:proofErr w:type="spellStart"/>
-      <w:r>
-        <w:t>HunyuanVideo</w:t>
-      </w:r>
-      <w:proofErr w:type="spellEnd"/>
-      <w:r>
-        <w:t xml:space="preserve"> videos at ~4 minutes each = ~3.3 hours = ~40 compute units on A100</w:t>
+        <w:t>50 HunyuanVideo videos at ~4 minutes each = ~3.3 hours = ~40 compute units on A100</w:t>
       </w:r>
     </w:p>
     <w:p>
@@ -1429,15 +1128,7 @@
         <w:t>Reflection:</w:t>
       </w:r>
       <w:r>
-        <w:t xml:space="preserve"> Today's debugging (through 3 distinct failure modes before success) is representative of realistic research engineering. The findings — that </w:t>
-      </w:r>
-      <w:proofErr w:type="spellStart"/>
-      <w:r>
-        <w:t>HunyuanVideo</w:t>
-      </w:r>
-      <w:proofErr w:type="spellEnd"/>
-      <w:r>
-        <w:t xml:space="preserve"> cannot run on L4 and requires A100 — are genuine methodological observations that will be documented in the dissertation methodology chapter.</w:t>
+        <w:t xml:space="preserve"> Today's debugging (through 3 distinct failure modes before success) is representative of realistic research engineering. The findings — that HunyuanVideo cannot run on L4 and requires A100 — are genuine methodological observations that will be documented in the dissertation methodology chapter.</w:t>
       </w:r>
     </w:p>
     <w:p>
@@ -1454,11 +1145,6 @@
       <w:r>
         <w:t xml:space="preserve"> approximately [X] units across failed and successful attempts.</w:t>
       </w:r>
-    </w:p>
-    <w:p>
-      <w:pPr>
-        <w:spacing w:after="100" w:line="300" w:lineRule="auto"/>
-      </w:pPr>
     </w:p>
     <w:p>
       <w:pPr>

</xml_diff>

<commit_message>
Add frame extraction utility for reliable MLLM analysis
</commit_message>
<xml_diff>
--- a/logbook/Project_Logbook.docx
+++ b/logbook/Project_Logbook.docx
@@ -53,7 +53,23 @@
           <w:i/>
           <w:iCs/>
         </w:rPr>
-        <w:t>Supervisor: Prof. Shujun Li</w:t>
+        <w:t xml:space="preserve">Supervisor: Prof. </w:t>
+      </w:r>
+      <w:proofErr w:type="spellStart"/>
+      <w:r>
+        <w:rPr>
+          <w:i/>
+          <w:iCs/>
+        </w:rPr>
+        <w:t>Shujun</w:t>
+      </w:r>
+      <w:proofErr w:type="spellEnd"/>
+      <w:r>
+        <w:rPr>
+          <w:i/>
+          <w:iCs/>
+        </w:rPr>
+        <w:t xml:space="preserve"> Li</w:t>
       </w:r>
     </w:p>
     <w:p>
@@ -151,7 +167,15 @@
         <w:t xml:space="preserve">Activity: </w:t>
       </w:r>
       <w:r>
-        <w:t>Contacted Prof. Shujun Li to request supervision for the MSc dissertation. Proposed working on deepfake detection with a focus on explainable, lightweight approaches, motivated by the growing threat of AI-generated multimedia content in cyber security contexts. Supervision was accepted.</w:t>
+        <w:t xml:space="preserve">Contacted Prof. </w:t>
+      </w:r>
+      <w:proofErr w:type="spellStart"/>
+      <w:r>
+        <w:t>Shujun</w:t>
+      </w:r>
+      <w:proofErr w:type="spellEnd"/>
+      <w:r>
+        <w:t xml:space="preserve"> Li to request supervision for the MSc dissertation. Proposed working on deepfake detection with a focus on explainable, lightweight approaches, motivated by the growing threat of AI-generated multimedia content in cyber security contexts. Supervision was accepted.</w:t>
       </w:r>
     </w:p>
     <w:p>
@@ -199,7 +223,15 @@
         <w:t xml:space="preserve">Reflection: </w:t>
       </w:r>
       <w:r>
-        <w:t>In retrospect this framing was quite conventional. The face-swap detection literature was already crowded and my initial proposal did not clearly articulate what my project would contribute beyond what published work had done. The critique later raised by my supervisor was foreshadowed here.</w:t>
+        <w:t xml:space="preserve">In retrospect this framing was quite conventional. The face-swap detection literature was already </w:t>
+      </w:r>
+      <w:proofErr w:type="gramStart"/>
+      <w:r>
+        <w:t>crowded</w:t>
+      </w:r>
+      <w:proofErr w:type="gramEnd"/>
+      <w:r>
+        <w:t xml:space="preserve"> and my initial proposal did not clearly articulate what my project would contribute beyond what published work had done. The critique later raised by my supervisor was foreshadowed here.</w:t>
       </w:r>
     </w:p>
     <w:p>
@@ -247,7 +279,15 @@
         <w:t xml:space="preserve">Activity: </w:t>
       </w:r>
       <w:r>
-        <w:t>Completed the COMP7993/COMP7300 Critical Review Report, due 12 June 2026. Selected the paper by Bahadure and Mane (2026) 'Deepfake detection using deep convolutional neural network and long short-term memory' (Multimedia Tools and Applications, Springer). Submitted on Moodle.</w:t>
+        <w:t xml:space="preserve">Completed the COMP7993/COMP7300 Critical Review Report, due 12 June 2026. Selected the paper by </w:t>
+      </w:r>
+      <w:proofErr w:type="spellStart"/>
+      <w:r>
+        <w:t>Bahadure</w:t>
+      </w:r>
+      <w:proofErr w:type="spellEnd"/>
+      <w:r>
+        <w:t xml:space="preserve"> and Mane (2026) 'Deepfake detection using deep convolutional neural network and long short-term memory' (Multimedia Tools and Applications, Springer). Submitted on Moodle.</w:t>
       </w:r>
     </w:p>
     <w:p>
@@ -280,7 +320,36 @@
         <w:t xml:space="preserve">Key learnings that fed the dissertation: </w:t>
       </w:r>
       <w:r>
-        <w:t>The critical review process forced me to examine the paper's claims closely. The paper reported 97.8% accuracy on FakeAVCeleb, but conducted no cross-dataset generalisation testing and used only FakeAVCeleb for evaluation. It advertised interpretability but implemented none. Its comparison table mixed results across different datasets. It contained an equation typo (Eq. 19) where the chaotic-map parameter update reduces to zero. These weaknesses informed my later critique of the field: high in-distribution accuracy is misleading and interpretability is often claimed but rarely delivered.</w:t>
+        <w:t xml:space="preserve">The critical review process forced me to examine the paper's claims closely. The paper reported 97.8% accuracy on </w:t>
+      </w:r>
+      <w:proofErr w:type="spellStart"/>
+      <w:proofErr w:type="gramStart"/>
+      <w:r>
+        <w:t>FakeAVCeleb</w:t>
+      </w:r>
+      <w:proofErr w:type="spellEnd"/>
+      <w:r>
+        <w:t>, but</w:t>
+      </w:r>
+      <w:proofErr w:type="gramEnd"/>
+      <w:r>
+        <w:t xml:space="preserve"> conducted no cross-dataset generalisation testing and used only </w:t>
+      </w:r>
+      <w:proofErr w:type="spellStart"/>
+      <w:r>
+        <w:t>FakeAVCeleb</w:t>
+      </w:r>
+      <w:proofErr w:type="spellEnd"/>
+      <w:r>
+        <w:t xml:space="preserve"> for evaluation. It advertised interpretability but implemented none. Its comparison table mixed results across different datasets. It contained an equation typo (Eq. 19) where the chaotic-map parameter update reduces to zero. These weaknesses informed my later critique of the field: high in-distribution accuracy is </w:t>
+      </w:r>
+      <w:proofErr w:type="gramStart"/>
+      <w:r>
+        <w:t>misleading</w:t>
+      </w:r>
+      <w:proofErr w:type="gramEnd"/>
+      <w:r>
+        <w:t xml:space="preserve"> and interpretability is often claimed but rarely delivered.</w:t>
       </w:r>
     </w:p>
     <w:p>
@@ -344,7 +413,63 @@
         <w:t xml:space="preserve">Activity: </w:t>
       </w:r>
       <w:r>
-        <w:t>Set up the development environment for the originally proposed project. Installed Miniconda with Python 3.12 in an isolated environment. Installed PyTorch 2.5.1 with CUDA 12.1 support and verified GPU acceleration on my RTX 3050 Ti laptop. Installed timm, pytorch-grad-cam, facenet-pytorch, OpenCV, MediaPipe, and Jupyter Lab. Created a private GitHub repository (msc-deepfake-detection) and pushed initial project structure. Verified MobileNetV3-Small inference end-to-end on a sample image.</w:t>
+        <w:t xml:space="preserve">Set up the development environment for the originally proposed project. Installed </w:t>
+      </w:r>
+      <w:proofErr w:type="spellStart"/>
+      <w:r>
+        <w:t>Miniconda</w:t>
+      </w:r>
+      <w:proofErr w:type="spellEnd"/>
+      <w:r>
+        <w:t xml:space="preserve"> with Python 3.12 in an isolated environment. Installed </w:t>
+      </w:r>
+      <w:proofErr w:type="spellStart"/>
+      <w:r>
+        <w:t>PyTorch</w:t>
+      </w:r>
+      <w:proofErr w:type="spellEnd"/>
+      <w:r>
+        <w:t xml:space="preserve"> 2.5.1 with CUDA 12.1 support and verified GPU acceleration on my RTX 3050 Ti laptop. Installed </w:t>
+      </w:r>
+      <w:proofErr w:type="spellStart"/>
+      <w:r>
+        <w:t>timm</w:t>
+      </w:r>
+      <w:proofErr w:type="spellEnd"/>
+      <w:r>
+        <w:t xml:space="preserve">, </w:t>
+      </w:r>
+      <w:proofErr w:type="spellStart"/>
+      <w:r>
+        <w:t>pytorch</w:t>
+      </w:r>
+      <w:proofErr w:type="spellEnd"/>
+      <w:r>
+        <w:t xml:space="preserve">-grad-cam, </w:t>
+      </w:r>
+      <w:proofErr w:type="spellStart"/>
+      <w:r>
+        <w:t>facenet-pytorch</w:t>
+      </w:r>
+      <w:proofErr w:type="spellEnd"/>
+      <w:r>
+        <w:t xml:space="preserve">, OpenCV, </w:t>
+      </w:r>
+      <w:proofErr w:type="spellStart"/>
+      <w:r>
+        <w:t>MediaPipe</w:t>
+      </w:r>
+      <w:proofErr w:type="spellEnd"/>
+      <w:r>
+        <w:t>, and Jupyter Lab. Created a private GitHub repository (</w:t>
+      </w:r>
+      <w:proofErr w:type="spellStart"/>
+      <w:r>
+        <w:t>msc</w:t>
+      </w:r>
+      <w:proofErr w:type="spellEnd"/>
+      <w:r>
+        <w:t>-deepfake-detection) and pushed initial project structure. Verified MobileNetV3-Small inference end-to-end on a sample image.</w:t>
       </w:r>
     </w:p>
     <w:p>
@@ -360,7 +485,31 @@
         <w:t xml:space="preserve">Dataset acquisition: </w:t>
       </w:r>
       <w:r>
-        <w:t>Applied for FaceForensics++ access through the official Google form. Applied for Celeb-DF v2 access. Celeb-DF v2 was approved and downloaded (approx 9.45 GB, 6,530 files across three folders: Celeb-real, Celeb-synthesis, YouTube-real, plus the official test-split file). FaceForensics++ approval was pending throughout the project and did not arrive in time.</w:t>
+        <w:t xml:space="preserve">Applied for </w:t>
+      </w:r>
+      <w:proofErr w:type="spellStart"/>
+      <w:r>
+        <w:t>FaceForensics</w:t>
+      </w:r>
+      <w:proofErr w:type="spellEnd"/>
+      <w:r>
+        <w:t>++ access through the official Google form. Applied for Celeb-DF v2 access. Celeb-DF v2 was approved and downloaded (</w:t>
+      </w:r>
+      <w:proofErr w:type="spellStart"/>
+      <w:r>
+        <w:t>approx</w:t>
+      </w:r>
+      <w:proofErr w:type="spellEnd"/>
+      <w:r>
+        <w:t xml:space="preserve"> 9.45 GB, 6,530 files across three folders: Celeb-real, Celeb-synthesis, YouTube-real, plus the official test-split file). </w:t>
+      </w:r>
+      <w:proofErr w:type="spellStart"/>
+      <w:r>
+        <w:t>FaceForensics</w:t>
+      </w:r>
+      <w:proofErr w:type="spellEnd"/>
+      <w:r>
+        <w:t>++ approval was pending throughout the project and did not arrive in time.</w:t>
       </w:r>
     </w:p>
     <w:p>
@@ -376,7 +525,23 @@
         <w:t xml:space="preserve">Reflection: </w:t>
       </w:r>
       <w:r>
-        <w:t>The technical environment came together cleanly. In hindsight, this early setup work was largely reusable across all later versions of the project. The PyTorch, GPU, and Colab infrastructure did not need re-doing when the project direction changed later.</w:t>
+        <w:t xml:space="preserve">The technical environment came together cleanly. In hindsight, this early setup work was largely reusable across all later versions of the project. The </w:t>
+      </w:r>
+      <w:proofErr w:type="spellStart"/>
+      <w:r>
+        <w:t>PyTorch</w:t>
+      </w:r>
+      <w:proofErr w:type="spellEnd"/>
+      <w:r>
+        <w:t xml:space="preserve">, GPU, and </w:t>
+      </w:r>
+      <w:proofErr w:type="spellStart"/>
+      <w:r>
+        <w:t>Colab</w:t>
+      </w:r>
+      <w:proofErr w:type="spellEnd"/>
+      <w:r>
+        <w:t xml:space="preserve"> infrastructure did not need re-doing when the project direction changed later.</w:t>
       </w:r>
     </w:p>
     <w:p>
@@ -476,7 +641,23 @@
         <w:t xml:space="preserve">Reflection: </w:t>
       </w:r>
       <w:r>
-        <w:t>This meeting was the turning point of the project. My original framing had been conventional and the supervisor was right that it lacked a defensible novelty story. His comment about video datasets being 'easy to obtain from social media' was practically informative and reshaped my thinking about what data was actually available.</w:t>
+        <w:t xml:space="preserve">This meeting was the turning point of the project. My original framing had been </w:t>
+      </w:r>
+      <w:proofErr w:type="gramStart"/>
+      <w:r>
+        <w:t>conventional</w:t>
+      </w:r>
+      <w:proofErr w:type="gramEnd"/>
+      <w:r>
+        <w:t xml:space="preserve"> and the supervisor was right that it lacked a defensible novelty story. His comment about video datasets being 'easy to obtain from social media' was practically informative and reshaped my thinking about what data was </w:t>
+      </w:r>
+      <w:proofErr w:type="gramStart"/>
+      <w:r>
+        <w:t>actually available</w:t>
+      </w:r>
+      <w:proofErr w:type="gramEnd"/>
+      <w:r>
+        <w:t>.</w:t>
       </w:r>
     </w:p>
     <w:p>
@@ -524,7 +705,31 @@
         <w:t xml:space="preserve">Activity: </w:t>
       </w:r>
       <w:r>
-        <w:t>Structured literature review across roughly 20 papers covering face manipulation detection, modern AI-generated video, dataset benchmarks, and forensic analysis. Focus papers included Zhang et al. (2026) MTA survey, Soundarya and Gururaj (2026) Discover Applied Sciences critical review, CoCoVideo (2026), GenVidBench (2025), Deepfake-Eval-2024, MoE-FFD (Kong et al. IEEE TDSC 2025), and the Yermakov CLIP-based detector (2025).</w:t>
+        <w:t xml:space="preserve">Structured literature review across roughly 20 papers covering face manipulation detection, modern AI-generated video, dataset benchmarks, and forensic analysis. Focus papers included Zhang et al. (2026) MTA survey, Soundarya and Gururaj (2026) Discover Applied Sciences critical review, </w:t>
+      </w:r>
+      <w:proofErr w:type="spellStart"/>
+      <w:r>
+        <w:t>CoCoVideo</w:t>
+      </w:r>
+      <w:proofErr w:type="spellEnd"/>
+      <w:r>
+        <w:t xml:space="preserve"> (2026), </w:t>
+      </w:r>
+      <w:proofErr w:type="spellStart"/>
+      <w:r>
+        <w:t>GenVidBench</w:t>
+      </w:r>
+      <w:proofErr w:type="spellEnd"/>
+      <w:r>
+        <w:t xml:space="preserve"> (2025), Deepfake-Eval-2024, </w:t>
+      </w:r>
+      <w:proofErr w:type="spellStart"/>
+      <w:r>
+        <w:t>MoE</w:t>
+      </w:r>
+      <w:proofErr w:type="spellEnd"/>
+      <w:r>
+        <w:t>-FFD (Kong et al. IEEE TDSC 2025), and the Yermakov CLIP-based detector (2025).</w:t>
       </w:r>
     </w:p>
     <w:p>
@@ -540,7 +745,23 @@
         <w:t xml:space="preserve">Key insight from reading: </w:t>
       </w:r>
       <w:r>
-        <w:t>Only one paper in the reviewed set (CoCoVideo, June 2026) systematically covered modern 2024–2026 commercial video generation models. Every other paper still evaluated on FaceForensics++, Celeb-DF, and DFDC, which are 2018–2020 face-swap datasets. Deepfake-Eval-2024 showed detectors dropping approximately 50% in AUC when moved from academic benchmarks to real 2024 social media content. This confirmed the gap the supervisor had pointed at.</w:t>
+        <w:t>Only one paper in the reviewed set (</w:t>
+      </w:r>
+      <w:proofErr w:type="spellStart"/>
+      <w:r>
+        <w:t>CoCoVideo</w:t>
+      </w:r>
+      <w:proofErr w:type="spellEnd"/>
+      <w:r>
+        <w:t xml:space="preserve">, June 2026) systematically covered modern 2024–2026 commercial video generation models. Every other paper still evaluated on </w:t>
+      </w:r>
+      <w:proofErr w:type="spellStart"/>
+      <w:r>
+        <w:t>FaceForensics</w:t>
+      </w:r>
+      <w:proofErr w:type="spellEnd"/>
+      <w:r>
+        <w:t>++, Celeb-DF, and DFDC, which are 2018–2020 face-swap datasets. Deepfake-Eval-2024 showed detectors dropping approximately 50% in AUC when moved from academic benchmarks to real 2024 social media content. This confirmed the gap the supervisor had pointed at.</w:t>
       </w:r>
     </w:p>
     <w:p>
@@ -652,7 +873,15 @@
         <w:t xml:space="preserve">Options identified: </w:t>
       </w:r>
       <w:r>
-        <w:t>Direction 1: build a new detector (crowded and risky). Direction 2: build a new dataset covering modern generators (novel but potentially requires paid APIs and ethics approval). Direction 3: build a software tool for benchmarking or dataset creation (novel resource-paper contribution but competes with DeepFakeBench). Direction 4: pure artefact characterisation study.</w:t>
+        <w:t xml:space="preserve">Direction 1: build a new detector (crowded and risky). Direction 2: build a new dataset covering modern generators (novel but potentially requires paid APIs and ethics approval). Direction 3: build a software tool for benchmarking or dataset creation (novel resource-paper contribution but competes with </w:t>
+      </w:r>
+      <w:proofErr w:type="spellStart"/>
+      <w:r>
+        <w:t>DeepFakeBench</w:t>
+      </w:r>
+      <w:proofErr w:type="spellEnd"/>
+      <w:r>
+        <w:t>). Direction 4: pure artefact characterisation study.</w:t>
       </w:r>
     </w:p>
     <w:p>
@@ -669,7 +898,15 @@
         <w:t xml:space="preserve">Post-meeting actions: </w:t>
       </w:r>
       <w:r>
-        <w:t>Considered each direction against constraints (budget, time, ethics window). Ruled out Direction 2 due to API costs and ethics timeline. Considered Direction 3 but concluded I could not confidently identify a gap DeepFakeBench does not cover. Eventually settled on a characterisation study framed around comparing traditional face-manipulation deepfakes with modern LVM/MLLM-based face editing.</w:t>
+        <w:t xml:space="preserve">Considered each direction against constraints (budget, time, ethics window). Ruled out Direction 2 due to API costs and ethics timeline. Considered Direction 3 but concluded I could not confidently identify a gap </w:t>
+      </w:r>
+      <w:proofErr w:type="spellStart"/>
+      <w:r>
+        <w:t>DeepFakeBench</w:t>
+      </w:r>
+      <w:proofErr w:type="spellEnd"/>
+      <w:r>
+        <w:t xml:space="preserve"> does not cover. Eventually settled on a characterisation study framed around comparing traditional face-manipulation deepfakes with modern LVM/MLLM-based face editing.</w:t>
       </w:r>
     </w:p>
     <w:p>
@@ -685,7 +922,15 @@
         <w:t xml:space="preserve">Reflection: </w:t>
       </w:r>
       <w:r>
-        <w:t>This meeting made explicit that the supervisor was not going to hand me a topic. He wanted me to justify my choice through reasoning about the field. That was appropriate at MSc level and I should have understood it earlier.</w:t>
+        <w:t xml:space="preserve">This meeting made explicit that the supervisor was not going to hand me a topic. He wanted me to justify my choice through reasoning about the field. That was appropriate at MSc </w:t>
+      </w:r>
+      <w:proofErr w:type="gramStart"/>
+      <w:r>
+        <w:t>level</w:t>
+      </w:r>
+      <w:proofErr w:type="gramEnd"/>
+      <w:r>
+        <w:t xml:space="preserve"> and I should have understood it earlier.</w:t>
       </w:r>
     </w:p>
     <w:p>
@@ -881,7 +1126,23 @@
         <w:t xml:space="preserve">Final approved direction: </w:t>
       </w:r>
       <w:r>
-        <w:t>Comparative study of artefacts in modern AI-generated video using multiple MLLMs. Two video groups: open-weight generators self-hosted on Colab Pro (LTX-2.3, HunyuanVideo, Wan 2.7) and commercial state-of-the-art models via publicly-posted user samples (Kling 3.0, Veo 3.1, Runway Aleph). Four MLLMs used as analytical tools: Claude Opus 4.7, Gemini 2.0 Flash, Qwen2.5-VL, LLaVA-1.6.</w:t>
+        <w:t xml:space="preserve">Comparative study of artefacts in modern AI-generated video using multiple MLLMs. Two video groups: open-weight generators self-hosted on </w:t>
+      </w:r>
+      <w:proofErr w:type="spellStart"/>
+      <w:r>
+        <w:t>Colab</w:t>
+      </w:r>
+      <w:proofErr w:type="spellEnd"/>
+      <w:r>
+        <w:t xml:space="preserve"> Pro (LTX-2.3, </w:t>
+      </w:r>
+      <w:proofErr w:type="spellStart"/>
+      <w:r>
+        <w:t>HunyuanVideo</w:t>
+      </w:r>
+      <w:proofErr w:type="spellEnd"/>
+      <w:r>
+        <w:t>, Wan 2.7) and commercial state-of-the-art models via publicly-posted user samples (Kling 3.0, Veo 3.1, Runway Aleph). Four MLLMs used as analytical tools: Claude Opus 4.7, Gemini 2.0 Flash, Qwen2.5-VL, LLaVA-1.6.</w:t>
       </w:r>
     </w:p>
     <w:p>
@@ -897,7 +1158,31 @@
         <w:t xml:space="preserve">Reflection: </w:t>
       </w:r>
       <w:r>
-        <w:t>The redirections were emotionally difficult but the final project is stronger for them. The multi-model comparative design gives the study a defensible novelty story that a single-model project would have lacked. Some of the environment work done earlier for the original detector project was not wasted — PyTorch, GPU verification, Colab Pro access, and general Python tooling all remain useful.</w:t>
+        <w:t xml:space="preserve">The redirections were emotionally </w:t>
+      </w:r>
+      <w:proofErr w:type="gramStart"/>
+      <w:r>
+        <w:t>difficult</w:t>
+      </w:r>
+      <w:proofErr w:type="gramEnd"/>
+      <w:r>
+        <w:t xml:space="preserve"> but the final project is stronger for them. The multi-model comparative design gives the study a defensible novelty story that a single-model project would have lacked. Some of the environment work done earlier for the original detector project was not wasted — </w:t>
+      </w:r>
+      <w:proofErr w:type="spellStart"/>
+      <w:r>
+        <w:t>PyTorch</w:t>
+      </w:r>
+      <w:proofErr w:type="spellEnd"/>
+      <w:r>
+        <w:t xml:space="preserve">, GPU verification, </w:t>
+      </w:r>
+      <w:proofErr w:type="spellStart"/>
+      <w:r>
+        <w:t>Colab</w:t>
+      </w:r>
+      <w:proofErr w:type="spellEnd"/>
+      <w:r>
+        <w:t xml:space="preserve"> Pro access, and general Python tooling all remain useful.</w:t>
       </w:r>
     </w:p>
     <w:p>
@@ -961,33 +1246,95 @@
         <w:t xml:space="preserve">Planned tasks: </w:t>
       </w:r>
       <w:r>
-        <w:t>Send confirmation to supervisor. Restructure GitHub repository to reflect new project direction. Set up Colab Pro notebook for LTX-2.3. Install and verify LTX-2.3, HunyuanVideo, and Wan 2.7. Set up all four MLLMs (Claude, Gemini, Qwen, LLaVA). Verify end-to-end pipeline on 5 test videos. Draft standardised analysis prompt template.</w:t>
-      </w:r>
-    </w:p>
-    <w:p>
-      <w:pPr>
-        <w:spacing w:after="100" w:line="300" w:lineRule="auto"/>
-        <w:jc w:val="both"/>
-        <w:rPr>
-          <w:b/>
-          <w:bCs/>
-        </w:rPr>
-      </w:pPr>
-      <w:r>
-        <w:rPr>
-          <w:b/>
-          <w:bCs/>
-        </w:rPr>
-        <w:t>Wednesday 16 July 2026 — actual progress:</w:t>
-      </w:r>
-    </w:p>
-    <w:p>
-      <w:pPr>
-        <w:spacing w:after="100" w:line="300" w:lineRule="auto"/>
-        <w:jc w:val="both"/>
-      </w:pPr>
-      <w:r>
-        <w:t>Set up Colab Pro notebook 01_ltx_setup_and_first_video.ipynb. Initial attempt on T4 GPU (15 GB VRAM) failed — model loading crashed at 60% due to combined RAM exhaustion despite CPU offloading and VAE slicing optimisations. Switched to L4 GPU (23.66 GB VRAM), which loaded the model successfully using 14.25 GB VRAM.</w:t>
+        <w:t xml:space="preserve">Send confirmation to supervisor. Restructure GitHub repository to reflect new project direction. Set up </w:t>
+      </w:r>
+      <w:proofErr w:type="spellStart"/>
+      <w:r>
+        <w:t>Colab</w:t>
+      </w:r>
+      <w:proofErr w:type="spellEnd"/>
+      <w:r>
+        <w:t xml:space="preserve"> Pro notebook for LTX-2.3. Install and verify LTX-2.3, </w:t>
+      </w:r>
+      <w:proofErr w:type="spellStart"/>
+      <w:r>
+        <w:t>HunyuanVideo</w:t>
+      </w:r>
+      <w:proofErr w:type="spellEnd"/>
+      <w:r>
+        <w:t xml:space="preserve">, and Wan 2.7. Set up all four MLLMs (Claude, Gemini, Qwen, </w:t>
+      </w:r>
+      <w:proofErr w:type="spellStart"/>
+      <w:r>
+        <w:t>LLaVA</w:t>
+      </w:r>
+      <w:proofErr w:type="spellEnd"/>
+      <w:r>
+        <w:t>). Verify end-to-end pipeline on 5 test videos. Draft standardised analysis prompt template.</w:t>
+      </w:r>
+    </w:p>
+    <w:p>
+      <w:pPr>
+        <w:spacing w:after="100" w:line="300" w:lineRule="auto"/>
+        <w:jc w:val="both"/>
+        <w:rPr>
+          <w:b/>
+          <w:bCs/>
+        </w:rPr>
+      </w:pPr>
+      <w:r>
+        <w:rPr>
+          <w:b/>
+          <w:bCs/>
+        </w:rPr>
+        <w:t>Wednesday 1</w:t>
+      </w:r>
+      <w:r>
+        <w:rPr>
+          <w:b/>
+          <w:bCs/>
+        </w:rPr>
+        <w:t>5</w:t>
+      </w:r>
+      <w:r>
+        <w:rPr>
+          <w:b/>
+          <w:bCs/>
+        </w:rPr>
+        <w:t xml:space="preserve"> July 2026 </w:t>
+      </w:r>
+      <w:r>
+        <w:rPr>
+          <w:b/>
+          <w:bCs/>
+        </w:rPr>
+        <w:t xml:space="preserve">– setup confirmed and </w:t>
+      </w:r>
+      <w:proofErr w:type="spellStart"/>
+      <w:r>
+        <w:rPr>
+          <w:b/>
+          <w:bCs/>
+        </w:rPr>
+        <w:t>exer</w:t>
+      </w:r>
+      <w:proofErr w:type="spellEnd"/>
+    </w:p>
+    <w:p>
+      <w:pPr>
+        <w:spacing w:after="100" w:line="300" w:lineRule="auto"/>
+        <w:jc w:val="both"/>
+      </w:pPr>
+      <w:r>
+        <w:t xml:space="preserve">Set up </w:t>
+      </w:r>
+      <w:proofErr w:type="spellStart"/>
+      <w:r>
+        <w:t>Colab</w:t>
+      </w:r>
+      <w:proofErr w:type="spellEnd"/>
+      <w:r>
+        <w:t xml:space="preserve"> Pro notebook 01_ltx_setup_and_first_video.ipynb. Initial attempt on T4 GPU (15 GB VRAM) failed — model loading crashed at 60% due to combined RAM exhaustion despite CPU offloading and VAE slicing optimisations. Switched to L4 GPU (23.66 GB VRAM), which loaded the model successfully using 14.25 GB VRAM.</w:t>
       </w:r>
     </w:p>
     <w:p>
@@ -1014,7 +1361,15 @@
         <w:jc w:val="both"/>
       </w:pPr>
       <w:r>
-        <w:t>Practical observation for methodology chapter: T4 GPU is not viable for LTX-Video full model despite Colab documentation suggesting otherwise. L4 is the minimum practical GPU. This will be noted as a hardware constraint in the methodology.</w:t>
+        <w:t xml:space="preserve">Practical observation for methodology chapter: T4 GPU is not viable for LTX-Video full model despite </w:t>
+      </w:r>
+      <w:proofErr w:type="spellStart"/>
+      <w:r>
+        <w:t>Colab</w:t>
+      </w:r>
+      <w:proofErr w:type="spellEnd"/>
+      <w:r>
+        <w:t xml:space="preserve"> documentation suggesting otherwise. L4 is the minimum practical GPU. This will be noted as a hardware constraint in the methodology.</w:t>
       </w:r>
     </w:p>
     <w:p>
@@ -1037,15 +1392,52 @@
           <w:b/>
           <w:bCs/>
         </w:rPr>
-        <w:t>Thursday 17 July 2026 — actual progress:</w:t>
-      </w:r>
-    </w:p>
-    <w:p>
-      <w:pPr>
-        <w:spacing w:after="100" w:line="300" w:lineRule="auto"/>
-      </w:pPr>
-      <w:r>
-        <w:t xml:space="preserve">Set up second notebook 02_hunyuanvideo_setup_and_first_video.ipynb for HunyuanVideo. Initial attempt on L4 GPU (22 GB VRAM) failed at the generation stage with OutOfMemoryError, despite CPU offloading, VAE tiling, and VAE slicing enabled. After model loaded (using 21.76 GB of 22 GB VRAM), no memory </w:t>
+        <w:t>Thursday 1</w:t>
+      </w:r>
+      <w:r>
+        <w:rPr>
+          <w:b/>
+          <w:bCs/>
+        </w:rPr>
+        <w:t>6</w:t>
+      </w:r>
+      <w:r>
+        <w:rPr>
+          <w:b/>
+          <w:bCs/>
+        </w:rPr>
+        <w:t xml:space="preserve"> July 2026 </w:t>
+      </w:r>
+      <w:r>
+        <w:rPr>
+          <w:b/>
+          <w:bCs/>
+        </w:rPr>
+        <w:t xml:space="preserve">– progress </w:t>
+      </w:r>
+    </w:p>
+    <w:p>
+      <w:pPr>
+        <w:spacing w:after="100" w:line="300" w:lineRule="auto"/>
+      </w:pPr>
+      <w:r>
+        <w:t xml:space="preserve">Set up second notebook 02_hunyuanvideo_setup_and_first_video.ipynb for </w:t>
+      </w:r>
+      <w:proofErr w:type="spellStart"/>
+      <w:r>
+        <w:t>HunyuanVideo</w:t>
+      </w:r>
+      <w:proofErr w:type="spellEnd"/>
+      <w:r>
+        <w:t xml:space="preserve">. Initial attempt on L4 GPU (22 GB VRAM) failed at the generation stage with </w:t>
+      </w:r>
+      <w:proofErr w:type="spellStart"/>
+      <w:r>
+        <w:t>OutOfMemoryError</w:t>
+      </w:r>
+      <w:proofErr w:type="spellEnd"/>
+      <w:r>
+        <w:t xml:space="preserve">, despite CPU offloading, VAE tiling, and VAE slicing enabled. After model loaded (using 21.76 GB of 22 GB VRAM), no memory </w:t>
       </w:r>
       <w:r>
         <w:lastRenderedPageBreak/>
@@ -1088,8 +1480,13 @@
         </w:numPr>
         <w:spacing w:after="100" w:line="300" w:lineRule="auto"/>
       </w:pPr>
-      <w:r>
-        <w:t>HunyuanVideo requires A100 (higher compute unit cost than L4)</w:t>
+      <w:proofErr w:type="spellStart"/>
+      <w:r>
+        <w:t>HunyuanVideo</w:t>
+      </w:r>
+      <w:proofErr w:type="spellEnd"/>
+      <w:r>
+        <w:t xml:space="preserve"> requires A100 (higher compute unit cost than L4)</w:t>
       </w:r>
     </w:p>
     <w:p>
@@ -1101,7 +1498,15 @@
         <w:spacing w:after="100" w:line="300" w:lineRule="auto"/>
       </w:pPr>
       <w:r>
-        <w:t>50 HunyuanVideo videos at ~4 minutes each = ~3.3 hours = ~40 compute units on A100</w:t>
+        <w:t xml:space="preserve">50 </w:t>
+      </w:r>
+      <w:proofErr w:type="spellStart"/>
+      <w:r>
+        <w:t>HunyuanVideo</w:t>
+      </w:r>
+      <w:proofErr w:type="spellEnd"/>
+      <w:r>
+        <w:t xml:space="preserve"> videos at ~4 minutes each = ~3.3 hours = ~40 compute units on A100</w:t>
       </w:r>
     </w:p>
     <w:p>
@@ -1128,7 +1533,15 @@
         <w:t>Reflection:</w:t>
       </w:r>
       <w:r>
-        <w:t xml:space="preserve"> Today's debugging (through 3 distinct failure modes before success) is representative of realistic research engineering. The findings — that HunyuanVideo cannot run on L4 and requires A100 — are genuine methodological observations that will be documented in the dissertation methodology chapter.</w:t>
+        <w:t xml:space="preserve"> Today's debugging (through 3 distinct failure modes before success) is representative of realistic research engineering. The findings — that </w:t>
+      </w:r>
+      <w:proofErr w:type="spellStart"/>
+      <w:r>
+        <w:t>HunyuanVideo</w:t>
+      </w:r>
+      <w:proofErr w:type="spellEnd"/>
+      <w:r>
+        <w:t xml:space="preserve"> cannot run on L4 and requires A100 — are genuine methodological observations that will be documented in the dissertation methodology chapter.</w:t>
       </w:r>
     </w:p>
     <w:p>
@@ -1145,6 +1558,383 @@
       <w:r>
         <w:t xml:space="preserve"> approximately [X] units across failed and successful attempts.</w:t>
       </w:r>
+      <w:r>
+        <w:br/>
+      </w:r>
+      <w:r>
+        <w:br/>
+      </w:r>
+      <w:r>
+        <w:rPr>
+          <w:b/>
+          <w:bCs/>
+        </w:rPr>
+        <w:t xml:space="preserve">Friday 17 July 2026 </w:t>
+      </w:r>
+      <w:r>
+        <w:rPr>
+          <w:b/>
+          <w:bCs/>
+        </w:rPr>
+        <w:t xml:space="preserve">- progress </w:t>
+      </w:r>
+    </w:p>
+    <w:p>
+      <w:pPr>
+        <w:spacing w:after="100" w:line="300" w:lineRule="auto"/>
+      </w:pPr>
+      <w:r>
+        <w:t>Set up notebook 03_wan_setup_and_first_video.ipynb for Wan 2.2 T2V-A14B (Wan-AI/Wan2.2-T2V-A14B-Diffusers on Hugging Face). Corrected an earlier planning error where the model had been referenced as "Wan 2.7" — the actual latest publicly-available version is Wan 2.2, released July 2025. Updated documentation accordingly.</w:t>
+      </w:r>
+    </w:p>
+    <w:p>
+      <w:pPr>
+        <w:spacing w:after="100" w:line="300" w:lineRule="auto"/>
+      </w:pPr>
+      <w:r>
+        <w:t xml:space="preserve">Installed dependencies (diffusers, transformers, accelerate, </w:t>
+      </w:r>
+      <w:proofErr w:type="spellStart"/>
+      <w:r>
+        <w:t>ftfy</w:t>
+      </w:r>
+      <w:proofErr w:type="spellEnd"/>
+      <w:r>
+        <w:t xml:space="preserve">, </w:t>
+      </w:r>
+      <w:proofErr w:type="spellStart"/>
+      <w:r>
+        <w:t>einops</w:t>
+      </w:r>
+      <w:proofErr w:type="spellEnd"/>
+      <w:r>
+        <w:t xml:space="preserve">, </w:t>
+      </w:r>
+      <w:proofErr w:type="spellStart"/>
+      <w:r>
+        <w:t>safetensors</w:t>
+      </w:r>
+      <w:proofErr w:type="spellEnd"/>
+      <w:r>
+        <w:t xml:space="preserve">) and downloaded the model from Hugging Face. Total download was approximately 126 GB across 41 files, taking around 5-6 minutes on </w:t>
+      </w:r>
+      <w:proofErr w:type="spellStart"/>
+      <w:r>
+        <w:t>Colab's</w:t>
+      </w:r>
+      <w:proofErr w:type="spellEnd"/>
+      <w:r>
+        <w:t xml:space="preserve"> network.</w:t>
+      </w:r>
+    </w:p>
+    <w:p>
+      <w:pPr>
+        <w:spacing w:after="100" w:line="300" w:lineRule="auto"/>
+      </w:pPr>
+      <w:r>
+        <w:t>Initial attempt to load the model onto standard A100 (40 GB VRAM) failed at the pipe.to("</w:t>
+      </w:r>
+      <w:proofErr w:type="spellStart"/>
+      <w:r>
+        <w:t>cuda</w:t>
+      </w:r>
+      <w:proofErr w:type="spellEnd"/>
+      <w:r>
+        <w:t xml:space="preserve">") step with an </w:t>
+      </w:r>
+      <w:proofErr w:type="spellStart"/>
+      <w:r>
+        <w:t>OutOfMemoryError</w:t>
+      </w:r>
+      <w:proofErr w:type="spellEnd"/>
+      <w:r>
+        <w:t>. The model at bfloat16 precision plus the pipeline components exceeded 39 GB, leaving no headroom for the transfer. This confirmed that Wan 2.2 T2V-A14B is the most memory-intensive of the three open-weight generators in the study.</w:t>
+      </w:r>
+    </w:p>
+    <w:p>
+      <w:pPr>
+        <w:spacing w:after="100" w:line="300" w:lineRule="auto"/>
+      </w:pPr>
+      <w:r>
+        <w:rPr>
+          <w:b/>
+          <w:bCs/>
+        </w:rPr>
+        <w:t>Resolution:</w:t>
+      </w:r>
+      <w:r>
+        <w:t xml:space="preserve"> Switched runtime to </w:t>
+      </w:r>
+      <w:r>
+        <w:rPr>
+          <w:b/>
+          <w:bCs/>
+        </w:rPr>
+        <w:t>A100 with High-RAM</w:t>
+      </w:r>
+      <w:r>
+        <w:t xml:space="preserve"> setting in </w:t>
+      </w:r>
+      <w:proofErr w:type="spellStart"/>
+      <w:r>
+        <w:t>Colab</w:t>
+      </w:r>
+      <w:proofErr w:type="spellEnd"/>
+      <w:r>
+        <w:t xml:space="preserve"> Pro. This provides the same A100 GPU but with additional system RAM allocated during model loading, which was sufficient to complete the pipe.to("</w:t>
+      </w:r>
+      <w:proofErr w:type="spellStart"/>
+      <w:r>
+        <w:t>cuda</w:t>
+      </w:r>
+      <w:proofErr w:type="spellEnd"/>
+      <w:r>
+        <w:t xml:space="preserve">") transfer without OOM. Model loaded successfully and video generation completed using the same test prompt as LTX (15 July) and </w:t>
+      </w:r>
+      <w:proofErr w:type="spellStart"/>
+      <w:r>
+        <w:t>HunyuanVideo</w:t>
+      </w:r>
+      <w:proofErr w:type="spellEnd"/>
+      <w:r>
+        <w:t xml:space="preserve"> (16 July). Output video saved to Drive with metadata.</w:t>
+      </w:r>
+    </w:p>
+    <w:p>
+      <w:pPr>
+        <w:spacing w:after="100" w:line="300" w:lineRule="auto"/>
+      </w:pPr>
+      <w:r>
+        <w:rPr>
+          <w:b/>
+          <w:bCs/>
+        </w:rPr>
+        <w:t>All three open-weight generators are now verified end-to-end:</w:t>
+      </w:r>
+    </w:p>
+    <w:p>
+      <w:pPr>
+        <w:numPr>
+          <w:ilvl w:val="0"/>
+          <w:numId w:val="3"/>
+        </w:numPr>
+        <w:spacing w:after="100" w:line="300" w:lineRule="auto"/>
+      </w:pPr>
+      <w:r>
+        <w:t>LTX-2.3 on L4 — fastest, lowest hardware requirement</w:t>
+      </w:r>
+    </w:p>
+    <w:p>
+      <w:pPr>
+        <w:numPr>
+          <w:ilvl w:val="0"/>
+          <w:numId w:val="3"/>
+        </w:numPr>
+        <w:spacing w:after="100" w:line="300" w:lineRule="auto"/>
+      </w:pPr>
+      <w:proofErr w:type="spellStart"/>
+      <w:r>
+        <w:t>HunyuanVideo</w:t>
+      </w:r>
+      <w:proofErr w:type="spellEnd"/>
+      <w:r>
+        <w:t xml:space="preserve"> on A100 (standard) — required upgrade from L4 due to memory</w:t>
+      </w:r>
+    </w:p>
+    <w:p>
+      <w:pPr>
+        <w:numPr>
+          <w:ilvl w:val="0"/>
+          <w:numId w:val="3"/>
+        </w:numPr>
+        <w:spacing w:after="100" w:line="300" w:lineRule="auto"/>
+      </w:pPr>
+      <w:r>
+        <w:t>Wan 2.2 T2V-A14B on A100 High-RAM — required additional system RAM beyond standard A100 setting</w:t>
+      </w:r>
+    </w:p>
+    <w:p>
+      <w:pPr>
+        <w:spacing w:after="100" w:line="300" w:lineRule="auto"/>
+      </w:pPr>
+      <w:r>
+        <w:lastRenderedPageBreak/>
+        <w:t>This progression is a genuine methodological observation: the three open-weight text-to-video generators occupy three distinct hardware requirement tiers. This has direct implications for bulk generation planning in Week 2 and for reproducibility guidance in the dissertation methodology chapter.</w:t>
+      </w:r>
+    </w:p>
+    <w:p>
+      <w:pPr>
+        <w:spacing w:after="100" w:line="300" w:lineRule="auto"/>
+      </w:pPr>
+      <w:r>
+        <w:rPr>
+          <w:b/>
+          <w:bCs/>
+        </w:rPr>
+        <w:t>Compute unit consumption today:</w:t>
+      </w:r>
+      <w:r>
+        <w:t xml:space="preserve"> approximately </w:t>
+      </w:r>
+      <w:r>
+        <w:t>3</w:t>
+      </w:r>
+      <w:r>
+        <w:t xml:space="preserve"> units on A100 High-RAM. Remaining budget:</w:t>
+      </w:r>
+      <w:r>
+        <w:t xml:space="preserve"> </w:t>
+      </w:r>
+      <w:r>
+        <w:t>92.07</w:t>
+      </w:r>
+      <w:r>
+        <w:t xml:space="preserve"> </w:t>
+      </w:r>
+      <w:r>
+        <w:t>units.</w:t>
+      </w:r>
+    </w:p>
+    <w:p>
+      <w:pPr>
+        <w:spacing w:after="100" w:line="300" w:lineRule="auto"/>
+      </w:pPr>
+      <w:r>
+        <w:rPr>
+          <w:b/>
+          <w:bCs/>
+        </w:rPr>
+        <w:t>Reflection:</w:t>
+      </w:r>
+      <w:r>
+        <w:t xml:space="preserve"> Three generators verified in three days is ahead of the planned Week 1 schedule. This gives me buffer time to properly test all four MLLMs (Qwen2.5-VL, LLaVA-1.6, Claude Opus, Gemini Flash) over the weekend before beginning bulk generation on Monday.</w:t>
+      </w:r>
+    </w:p>
+    <w:p>
+      <w:pPr>
+        <w:spacing w:after="100" w:line="300" w:lineRule="auto"/>
+      </w:pPr>
+      <w:r>
+        <w:rPr>
+          <w:b/>
+          <w:bCs/>
+        </w:rPr>
+        <w:t>Saturday</w:t>
+      </w:r>
+      <w:r>
+        <w:rPr>
+          <w:b/>
+          <w:bCs/>
+        </w:rPr>
+        <w:t xml:space="preserve"> 1</w:t>
+      </w:r>
+      <w:r>
+        <w:rPr>
+          <w:b/>
+          <w:bCs/>
+        </w:rPr>
+        <w:t>8</w:t>
+      </w:r>
+      <w:r>
+        <w:rPr>
+          <w:b/>
+          <w:bCs/>
+        </w:rPr>
+        <w:t xml:space="preserve"> July 2026 — actual progress:</w:t>
+      </w:r>
+    </w:p>
+    <w:p>
+      <w:pPr>
+        <w:spacing w:after="100" w:line="300" w:lineRule="auto"/>
+      </w:pPr>
+      <w:r>
+        <w:rPr>
+          <w:b/>
+          <w:bCs/>
+        </w:rPr>
+        <w:t>Methodology finding — MLLM video analysis is unreliable:</w:t>
+      </w:r>
+    </w:p>
+    <w:p>
+      <w:pPr>
+        <w:spacing w:after="100" w:line="300" w:lineRule="auto"/>
+      </w:pPr>
+      <w:r>
+        <w:t xml:space="preserve">Claude Opus successfully analysed the LTX test video via direct video </w:t>
+      </w:r>
+      <w:r>
+        <w:t>upload but</w:t>
+      </w:r>
+      <w:r>
+        <w:t xml:space="preserve"> failed to reliably analyse the </w:t>
+      </w:r>
+      <w:proofErr w:type="spellStart"/>
+      <w:r>
+        <w:t>HunyuanVideo</w:t>
+      </w:r>
+      <w:proofErr w:type="spellEnd"/>
+      <w:r>
+        <w:t xml:space="preserve"> test video due to intermittent viewer failures on frame derivatives. Rather than fabricating artefact scores, Claude honestly declined to rate what it could not see. This is a genuine methodological issue — MLLM video handling is not consistent across files or sessions.</w:t>
+      </w:r>
+    </w:p>
+    <w:p>
+      <w:pPr>
+        <w:spacing w:after="100" w:line="300" w:lineRule="auto"/>
+      </w:pPr>
+      <w:r>
+        <w:rPr>
+          <w:b/>
+          <w:bCs/>
+        </w:rPr>
+        <w:t>Resolution:</w:t>
+      </w:r>
+      <w:r>
+        <w:t xml:space="preserve"> Adopted frame-based analysis as the primary methodology. Wrote code/preprocessing/extract_frames.py which extracts N evenly-spaced frames from each video (default 6). All frames rendered as JPEG at 95% quality. Frame-based analysis is more reliable, reproducible, and documentable than raw video upload.</w:t>
+      </w:r>
+    </w:p>
+    <w:p>
+      <w:pPr>
+        <w:spacing w:after="100" w:line="300" w:lineRule="auto"/>
+      </w:pPr>
+      <w:r>
+        <w:t xml:space="preserve">Re-analysed </w:t>
+      </w:r>
+      <w:proofErr w:type="spellStart"/>
+      <w:r>
+        <w:t>HunyuanVideo</w:t>
+      </w:r>
+      <w:proofErr w:type="spellEnd"/>
+      <w:r>
+        <w:t xml:space="preserve"> test video using extracted frames — analysis succeeded. </w:t>
+      </w:r>
+      <w:proofErr w:type="gramStart"/>
+      <w:r>
+        <w:t>Also</w:t>
+      </w:r>
+      <w:proofErr w:type="gramEnd"/>
+      <w:r>
+        <w:t xml:space="preserve"> re-analysed LTX and Wan test videos using frames for methodological consistency.</w:t>
+      </w:r>
+    </w:p>
+    <w:p>
+      <w:pPr>
+        <w:spacing w:after="100" w:line="300" w:lineRule="auto"/>
+      </w:pPr>
+      <w:r>
+        <w:rPr>
+          <w:b/>
+          <w:bCs/>
+        </w:rPr>
+        <w:t>Decision for the dissertation:</w:t>
+      </w:r>
+      <w:r>
+        <w:t xml:space="preserve"> All MLLM analysis in this project uses frame-based input (6 frames per video, evenly spaced, skipping first and last). This will be documented in the Methodology chapter as a deliberate design choice, not a workaround.</w:t>
+      </w:r>
+    </w:p>
+    <w:p>
+      <w:pPr>
+        <w:spacing w:after="100" w:line="300" w:lineRule="auto"/>
+      </w:pPr>
     </w:p>
     <w:p>
       <w:pPr>
@@ -1314,6 +2104,7 @@
         <w:jc w:val="both"/>
       </w:pPr>
       <w:r>
+        <w:lastRenderedPageBreak/>
         <w:t>• Key decisions made and reasoning</w:t>
       </w:r>
     </w:p>
@@ -1455,6 +2246,155 @@
     </w:lvl>
   </w:abstractNum>
   <w:abstractNum w:abstractNumId="1" w15:restartNumberingAfterBreak="0">
+    <w:nsid w:val="390D79E7"/>
+    <w:multiLevelType w:val="multilevel"/>
+    <w:tmpl w:val="CE7AD602"/>
+    <w:lvl w:ilvl="0">
+      <w:start w:val="1"/>
+      <w:numFmt w:val="bullet"/>
+      <w:lvlText w:val=""/>
+      <w:lvlJc w:val="left"/>
+      <w:pPr>
+        <w:tabs>
+          <w:tab w:val="num" w:pos="720"/>
+        </w:tabs>
+        <w:ind w:left="720" w:hanging="360"/>
+      </w:pPr>
+      <w:rPr>
+        <w:rFonts w:ascii="Symbol" w:hAnsi="Symbol" w:hint="default"/>
+        <w:sz w:val="20"/>
+      </w:rPr>
+    </w:lvl>
+    <w:lvl w:ilvl="1" w:tentative="1">
+      <w:start w:val="1"/>
+      <w:numFmt w:val="bullet"/>
+      <w:lvlText w:val="o"/>
+      <w:lvlJc w:val="left"/>
+      <w:pPr>
+        <w:tabs>
+          <w:tab w:val="num" w:pos="1440"/>
+        </w:tabs>
+        <w:ind w:left="1440" w:hanging="360"/>
+      </w:pPr>
+      <w:rPr>
+        <w:rFonts w:ascii="Courier New" w:hAnsi="Courier New" w:hint="default"/>
+        <w:sz w:val="20"/>
+      </w:rPr>
+    </w:lvl>
+    <w:lvl w:ilvl="2" w:tentative="1">
+      <w:start w:val="1"/>
+      <w:numFmt w:val="bullet"/>
+      <w:lvlText w:val=""/>
+      <w:lvlJc w:val="left"/>
+      <w:pPr>
+        <w:tabs>
+          <w:tab w:val="num" w:pos="2160"/>
+        </w:tabs>
+        <w:ind w:left="2160" w:hanging="360"/>
+      </w:pPr>
+      <w:rPr>
+        <w:rFonts w:ascii="Wingdings" w:hAnsi="Wingdings" w:hint="default"/>
+        <w:sz w:val="20"/>
+      </w:rPr>
+    </w:lvl>
+    <w:lvl w:ilvl="3" w:tentative="1">
+      <w:start w:val="1"/>
+      <w:numFmt w:val="bullet"/>
+      <w:lvlText w:val=""/>
+      <w:lvlJc w:val="left"/>
+      <w:pPr>
+        <w:tabs>
+          <w:tab w:val="num" w:pos="2880"/>
+        </w:tabs>
+        <w:ind w:left="2880" w:hanging="360"/>
+      </w:pPr>
+      <w:rPr>
+        <w:rFonts w:ascii="Wingdings" w:hAnsi="Wingdings" w:hint="default"/>
+        <w:sz w:val="20"/>
+      </w:rPr>
+    </w:lvl>
+    <w:lvl w:ilvl="4" w:tentative="1">
+      <w:start w:val="1"/>
+      <w:numFmt w:val="bullet"/>
+      <w:lvlText w:val=""/>
+      <w:lvlJc w:val="left"/>
+      <w:pPr>
+        <w:tabs>
+          <w:tab w:val="num" w:pos="3600"/>
+        </w:tabs>
+        <w:ind w:left="3600" w:hanging="360"/>
+      </w:pPr>
+      <w:rPr>
+        <w:rFonts w:ascii="Wingdings" w:hAnsi="Wingdings" w:hint="default"/>
+        <w:sz w:val="20"/>
+      </w:rPr>
+    </w:lvl>
+    <w:lvl w:ilvl="5" w:tentative="1">
+      <w:start w:val="1"/>
+      <w:numFmt w:val="bullet"/>
+      <w:lvlText w:val=""/>
+      <w:lvlJc w:val="left"/>
+      <w:pPr>
+        <w:tabs>
+          <w:tab w:val="num" w:pos="4320"/>
+        </w:tabs>
+        <w:ind w:left="4320" w:hanging="360"/>
+      </w:pPr>
+      <w:rPr>
+        <w:rFonts w:ascii="Wingdings" w:hAnsi="Wingdings" w:hint="default"/>
+        <w:sz w:val="20"/>
+      </w:rPr>
+    </w:lvl>
+    <w:lvl w:ilvl="6" w:tentative="1">
+      <w:start w:val="1"/>
+      <w:numFmt w:val="bullet"/>
+      <w:lvlText w:val=""/>
+      <w:lvlJc w:val="left"/>
+      <w:pPr>
+        <w:tabs>
+          <w:tab w:val="num" w:pos="5040"/>
+        </w:tabs>
+        <w:ind w:left="5040" w:hanging="360"/>
+      </w:pPr>
+      <w:rPr>
+        <w:rFonts w:ascii="Wingdings" w:hAnsi="Wingdings" w:hint="default"/>
+        <w:sz w:val="20"/>
+      </w:rPr>
+    </w:lvl>
+    <w:lvl w:ilvl="7" w:tentative="1">
+      <w:start w:val="1"/>
+      <w:numFmt w:val="bullet"/>
+      <w:lvlText w:val=""/>
+      <w:lvlJc w:val="left"/>
+      <w:pPr>
+        <w:tabs>
+          <w:tab w:val="num" w:pos="5760"/>
+        </w:tabs>
+        <w:ind w:left="5760" w:hanging="360"/>
+      </w:pPr>
+      <w:rPr>
+        <w:rFonts w:ascii="Wingdings" w:hAnsi="Wingdings" w:hint="default"/>
+        <w:sz w:val="20"/>
+      </w:rPr>
+    </w:lvl>
+    <w:lvl w:ilvl="8" w:tentative="1">
+      <w:start w:val="1"/>
+      <w:numFmt w:val="bullet"/>
+      <w:lvlText w:val=""/>
+      <w:lvlJc w:val="left"/>
+      <w:pPr>
+        <w:tabs>
+          <w:tab w:val="num" w:pos="6480"/>
+        </w:tabs>
+        <w:ind w:left="6480" w:hanging="360"/>
+      </w:pPr>
+      <w:rPr>
+        <w:rFonts w:ascii="Wingdings" w:hAnsi="Wingdings" w:hint="default"/>
+        <w:sz w:val="20"/>
+      </w:rPr>
+    </w:lvl>
+  </w:abstractNum>
+  <w:abstractNum w:abstractNumId="2" w15:restartNumberingAfterBreak="0">
     <w:nsid w:val="60F15747"/>
     <w:multiLevelType w:val="multilevel"/>
     <w:tmpl w:val="07500232"/>
@@ -1610,6 +2550,9 @@
     </w:lvlOverride>
   </w:num>
   <w:num w:numId="2" w16cid:durableId="1184637264">
+    <w:abstractNumId w:val="2"/>
+  </w:num>
+  <w:num w:numId="3" w16cid:durableId="1593197417">
     <w:abstractNumId w:val="1"/>
   </w:num>
 </w:numbering>
@@ -2009,6 +2952,7 @@
   <w:style w:type="paragraph" w:default="1" w:styleId="Normal">
     <w:name w:val="Normal"/>
     <w:qFormat/>
+    <w:rsid w:val="00272B23"/>
   </w:style>
   <w:style w:type="paragraph" w:styleId="Heading1">
     <w:name w:val="heading 1"/>

</xml_diff>

<commit_message>
Day 4 (18 Jul): Claude + Gemini analyses complete; Kaggle Qwen blocked
</commit_message>
<xml_diff>
--- a/logbook/Project_Logbook.docx
+++ b/logbook/Project_Logbook.docx
@@ -1846,27 +1846,25 @@
     <w:p>
       <w:pPr>
         <w:spacing w:after="100" w:line="300" w:lineRule="auto"/>
-      </w:pPr>
-      <w:r>
-        <w:rPr>
-          <w:b/>
-          <w:bCs/>
-        </w:rPr>
-        <w:t>Methodology finding — MLLM video analysis is unreliable:</w:t>
-      </w:r>
-    </w:p>
-    <w:p>
-      <w:pPr>
-        <w:spacing w:after="100" w:line="300" w:lineRule="auto"/>
-      </w:pPr>
-      <w:r>
-        <w:t xml:space="preserve">Claude Opus successfully analysed the LTX test video via direct video </w:t>
-      </w:r>
-      <w:r>
-        <w:t>upload but</w:t>
-      </w:r>
-      <w:r>
-        <w:t xml:space="preserve"> failed to reliably analyse the </w:t>
+        <w:rPr>
+          <w:b/>
+          <w:bCs/>
+        </w:rPr>
+      </w:pPr>
+      <w:r>
+        <w:rPr>
+          <w:b/>
+          <w:bCs/>
+        </w:rPr>
+        <w:t>Methodology decision — frame-based analysis:</w:t>
+      </w:r>
+    </w:p>
+    <w:p>
+      <w:pPr>
+        <w:spacing w:after="100" w:line="300" w:lineRule="auto"/>
+      </w:pPr>
+      <w:r>
+        <w:t xml:space="preserve">Video-upload analysis proved unreliable across MLLMs (Claude failed on </w:t>
       </w:r>
       <w:proofErr w:type="spellStart"/>
       <w:r>
@@ -1874,30 +1872,22 @@
       </w:r>
       <w:proofErr w:type="spellEnd"/>
       <w:r>
-        <w:t xml:space="preserve"> test video due to intermittent viewer failures on frame derivatives. Rather than fabricating artefact scores, Claude honestly declined to rate what it could not see. This is a genuine methodological issue — MLLM video handling is not consistent across files or sessions.</w:t>
-      </w:r>
-    </w:p>
-    <w:p>
-      <w:pPr>
-        <w:spacing w:after="100" w:line="300" w:lineRule="auto"/>
-      </w:pPr>
-      <w:r>
-        <w:rPr>
-          <w:b/>
-          <w:bCs/>
-        </w:rPr>
-        <w:t>Resolution:</w:t>
-      </w:r>
-      <w:r>
-        <w:t xml:space="preserve"> Adopted frame-based analysis as the primary methodology. Wrote code/preprocessing/extract_frames.py which extracts N evenly-spaced frames from each video (default 6). All frames rendered as JPEG at 95% quality. Frame-based analysis is more reliable, reproducible, and documentable than raw video upload.</w:t>
-      </w:r>
-    </w:p>
-    <w:p>
-      <w:pPr>
-        <w:spacing w:after="100" w:line="300" w:lineRule="auto"/>
-      </w:pPr>
-      <w:r>
-        <w:t xml:space="preserve">Re-analysed </w:t>
+        <w:t xml:space="preserve"> video upload despite succeeding on LTX). Adopted 6-frames-evenly-spaced extraction as the primary methodology. Wrote code/preprocessing/extract_frames.py — deterministic, reproducible, applies uniformly across all four MLLMs. Documented as a deliberate design choice, not a workaround.</w:t>
+      </w:r>
+    </w:p>
+    <w:p>
+      <w:pPr>
+        <w:spacing w:after="100" w:line="300" w:lineRule="auto"/>
+      </w:pPr>
+      <w:r>
+        <w:rPr>
+          <w:b/>
+          <w:bCs/>
+        </w:rPr>
+        <w:t>Claude Opus 4.7 (claude.ai Pro</w:t>
+      </w:r>
+      <w:r>
+        <w:t xml:space="preserve">): Analysed LTX, </w:t>
       </w:r>
       <w:proofErr w:type="spellStart"/>
       <w:r>
@@ -1905,36 +1895,197 @@
       </w:r>
       <w:proofErr w:type="spellEnd"/>
       <w:r>
-        <w:t xml:space="preserve"> test video using extracted frames — analysis succeeded. </w:t>
-      </w:r>
-      <w:proofErr w:type="gramStart"/>
-      <w:r>
-        <w:t>Also</w:t>
-      </w:r>
-      <w:proofErr w:type="gramEnd"/>
-      <w:r>
-        <w:t xml:space="preserve"> re-analysed LTX and Wan test videos using frames for methodological consistency.</w:t>
-      </w:r>
-    </w:p>
-    <w:p>
-      <w:pPr>
-        <w:spacing w:after="100" w:line="300" w:lineRule="auto"/>
-      </w:pPr>
-      <w:r>
-        <w:rPr>
-          <w:b/>
-          <w:bCs/>
-        </w:rPr>
-        <w:t>Decision for the dissertation:</w:t>
-      </w:r>
-      <w:r>
-        <w:t xml:space="preserve"> All MLLM analysis in this project uses frame-based input (6 frames per video, evenly spaced, skipping first and last). This will be documented in the Methodology chapter as a deliberate design choice, not a workaround.</w:t>
-      </w:r>
-    </w:p>
-    <w:p>
-      <w:pPr>
-        <w:spacing w:after="100" w:line="300" w:lineRule="auto"/>
-      </w:pPr>
+        <w:t xml:space="preserve">, Wan test videos using 6 frames per video + analysis_prompt_v1. Format followed cleanly across all three. Ratings: [SUMMARISE — e.g. "LTX overall 6/10, </w:t>
+      </w:r>
+      <w:proofErr w:type="spellStart"/>
+      <w:r>
+        <w:t>HunyuanVideo</w:t>
+      </w:r>
+      <w:proofErr w:type="spellEnd"/>
+      <w:r>
+        <w:t xml:space="preserve"> 7/10, Wan 5/10, all rated likely AI-generated with 80-95% confidence"]. Responses saved to corpus/</w:t>
+      </w:r>
+      <w:proofErr w:type="spellStart"/>
+      <w:r>
+        <w:t>mllm_outputs</w:t>
+      </w:r>
+      <w:proofErr w:type="spellEnd"/>
+      <w:r>
+        <w:t>/</w:t>
+      </w:r>
+      <w:proofErr w:type="spellStart"/>
+      <w:r>
+        <w:t>claude</w:t>
+      </w:r>
+      <w:proofErr w:type="spellEnd"/>
+      <w:r>
+        <w:t>/.</w:t>
+      </w:r>
+    </w:p>
+    <w:p>
+      <w:pPr>
+        <w:spacing w:after="100" w:line="300" w:lineRule="auto"/>
+      </w:pPr>
+      <w:r>
+        <w:rPr>
+          <w:b/>
+          <w:bCs/>
+        </w:rPr>
+        <w:t>Gemini 2.5 Flash (aistudio.google.com free tier</w:t>
+      </w:r>
+      <w:r>
+        <w:t>): Same 6 frames, same prompt, three videos. Format compliance: [good / partial / drift]. Ratings comparison vs Claude: [systematically higher / lower / similar]. Notable disagreements: [any category where Claude and Gemini split significantly]. Responses saved to corpus/</w:t>
+      </w:r>
+      <w:proofErr w:type="spellStart"/>
+      <w:r>
+        <w:t>mllm_outputs</w:t>
+      </w:r>
+      <w:proofErr w:type="spellEnd"/>
+      <w:r>
+        <w:t>/</w:t>
+      </w:r>
+      <w:proofErr w:type="spellStart"/>
+      <w:r>
+        <w:t>gemini</w:t>
+      </w:r>
+      <w:proofErr w:type="spellEnd"/>
+      <w:r>
+        <w:t>/.</w:t>
+      </w:r>
+    </w:p>
+    <w:p>
+      <w:pPr>
+        <w:spacing w:after="100" w:line="300" w:lineRule="auto"/>
+      </w:pPr>
+      <w:r>
+        <w:rPr>
+          <w:b/>
+          <w:bCs/>
+        </w:rPr>
+        <w:t>Kaggle Qwen2.5-VL setup</w:t>
+      </w:r>
+      <w:r>
+        <w:t xml:space="preserve"> — abandoned after 5 environment blockers:</w:t>
+      </w:r>
+    </w:p>
+    <w:p>
+      <w:pPr>
+        <w:spacing w:after="100" w:line="300" w:lineRule="auto"/>
+      </w:pPr>
+      <w:proofErr w:type="spellStart"/>
+      <w:r>
+        <w:t>torchaudio</w:t>
+      </w:r>
+      <w:proofErr w:type="spellEnd"/>
+      <w:r>
+        <w:t xml:space="preserve"> / CUDA 13 mismatch on Kaggle base image</w:t>
+      </w:r>
+    </w:p>
+    <w:p>
+      <w:pPr>
+        <w:spacing w:after="100" w:line="300" w:lineRule="auto"/>
+      </w:pPr>
+      <w:proofErr w:type="spellStart"/>
+      <w:r>
+        <w:t>transformers.pytorch_utils</w:t>
+      </w:r>
+      <w:proofErr w:type="spellEnd"/>
+      <w:r>
+        <w:t xml:space="preserve"> symbol mismatch on torch 2.13</w:t>
+      </w:r>
+    </w:p>
+    <w:p>
+      <w:pPr>
+        <w:spacing w:after="100" w:line="300" w:lineRule="auto"/>
+      </w:pPr>
+      <w:r>
+        <w:t>T4 VRAM (14.5 GB) insufficient for Qwen2.5-VL-7B in bfloat16</w:t>
+      </w:r>
+    </w:p>
+    <w:p>
+      <w:pPr>
+        <w:spacing w:after="100" w:line="300" w:lineRule="auto"/>
+      </w:pPr>
+      <w:proofErr w:type="spellStart"/>
+      <w:r>
+        <w:t>bitsandbytes</w:t>
+      </w:r>
+      <w:proofErr w:type="spellEnd"/>
+      <w:r>
+        <w:t xml:space="preserve"> for 4-bit fallback incompatible with Kaggle's Triton 3.x (</w:t>
+      </w:r>
+      <w:proofErr w:type="spellStart"/>
+      <w:r>
+        <w:t>triton.ops</w:t>
+      </w:r>
+      <w:proofErr w:type="spellEnd"/>
+      <w:r>
+        <w:t xml:space="preserve"> module removed)</w:t>
+      </w:r>
+    </w:p>
+    <w:p>
+      <w:pPr>
+        <w:spacing w:after="100" w:line="300" w:lineRule="auto"/>
+      </w:pPr>
+      <w:r>
+        <w:t xml:space="preserve">Pillow _Ink import error in </w:t>
+      </w:r>
+      <w:proofErr w:type="spellStart"/>
+      <w:r>
+        <w:t>transformers.image_utils</w:t>
+      </w:r>
+      <w:proofErr w:type="spellEnd"/>
+      <w:r>
+        <w:t xml:space="preserve"> after force-reinstall attempts</w:t>
+      </w:r>
+    </w:p>
+    <w:p>
+      <w:pPr>
+        <w:spacing w:after="100" w:line="300" w:lineRule="auto"/>
+      </w:pPr>
+      <w:r>
+        <w:t xml:space="preserve">Kaggle free-tier (July 2026) runs CUDA 13 + Triton 3, ahead of what the Python ML ecosystem stably supports. Every fix revealed the next incompatibility. Decision: run Qwen2.5-VL and LLaVA-1.6 on </w:t>
+      </w:r>
+      <w:proofErr w:type="spellStart"/>
+      <w:r>
+        <w:t>Colab</w:t>
+      </w:r>
+      <w:proofErr w:type="spellEnd"/>
+      <w:r>
+        <w:t xml:space="preserve"> Pro L4 (24 GB VRAM, CUDA 12.x, stable) tomorrow — clean bfloat16 inference, no quantization compromise. Compute cost estimate: ~2 units for three test videos on Qwen, similar for </w:t>
+      </w:r>
+      <w:proofErr w:type="spellStart"/>
+      <w:r>
+        <w:t>LLaVA</w:t>
+      </w:r>
+      <w:proofErr w:type="spellEnd"/>
+      <w:r>
+        <w:t>. Well within remaining budget (~90 units).</w:t>
+      </w:r>
+    </w:p>
+    <w:p>
+      <w:pPr>
+        <w:spacing w:after="100" w:line="300" w:lineRule="auto"/>
+      </w:pPr>
+      <w:r>
+        <w:t>Contribution to Methodology chapter: This experience documents a genuine reproducibility finding — "free-tier compute" is not automatically reproducible; academic pipelines must budget for platform environment stability, not just cost. Kaggle attempt notebook saved as evidence at code/analysis/04_qwen25vl_kaggle_attempt.ipynb.</w:t>
+      </w:r>
+    </w:p>
+    <w:p>
+      <w:pPr>
+        <w:spacing w:after="100" w:line="300" w:lineRule="auto"/>
+      </w:pPr>
+      <w:r>
+        <w:rPr>
+          <w:b/>
+          <w:bCs/>
+        </w:rPr>
+        <w:lastRenderedPageBreak/>
+        <w:t>Status vs plan</w:t>
+      </w:r>
+      <w:r>
+        <w:t>: Ahead on generators (done Day 3), on schedule on MLLMs (2 of 4 done, 2 remain for Sunday).</w:t>
+      </w:r>
     </w:p>
     <w:p>
       <w:pPr>
@@ -2104,7 +2255,6 @@
         <w:jc w:val="both"/>
       </w:pPr>
       <w:r>
-        <w:lastRenderedPageBreak/>
         <w:t>• Key decisions made and reasoning</w:t>
       </w:r>
     </w:p>
@@ -3041,6 +3191,7 @@
   <w:style w:type="character" w:default="1" w:styleId="DefaultParagraphFont">
     <w:name w:val="Default Paragraph Font"/>
     <w:uiPriority w:val="1"/>
+    <w:semiHidden/>
     <w:unhideWhenUsed/>
   </w:style>
   <w:style w:type="table" w:default="1" w:styleId="TableNormal">

</xml_diff>

<commit_message>
Day 5 (19 Jul): Week 1 closed with LLaVA-1.6 + Week 2 LTX-2.3 batch (v2 after v1 silent-failure); Drive-FUSE and T2V-parameter findings documented
</commit_message>
<xml_diff>
--- a/logbook/Project_Logbook.docx
+++ b/logbook/Project_Logbook.docx
@@ -2090,7 +2090,946 @@
     <w:p>
       <w:pPr>
         <w:spacing w:after="100" w:line="300" w:lineRule="auto"/>
-        <w:jc w:val="both"/>
+      </w:pPr>
+    </w:p>
+    <w:p>
+      <w:pPr>
+        <w:spacing w:after="100" w:line="300" w:lineRule="auto"/>
+        <w:jc w:val="both"/>
+        <w:rPr>
+          <w:b/>
+          <w:bCs/>
+        </w:rPr>
+      </w:pPr>
+      <w:r>
+        <w:rPr>
+          <w:b/>
+          <w:bCs/>
+        </w:rPr>
+        <w:t>Sunday 19 July 2026 — Week 1 Closed (LLaVA-1.6) + Week 2 Started Early (LTX-2.3 v2)</w:t>
+      </w:r>
+    </w:p>
+    <w:p>
+      <w:pPr>
+        <w:spacing w:after="100" w:line="300" w:lineRule="auto"/>
+        <w:jc w:val="both"/>
+      </w:pPr>
+      <w:r>
+        <w:rPr>
+          <w:b/>
+          <w:bCs/>
+        </w:rPr>
+        <w:t xml:space="preserve">Morning session — LLaVA-1.6 on Kaggle T4 (4-bit via </w:t>
+      </w:r>
+      <w:proofErr w:type="spellStart"/>
+      <w:r>
+        <w:rPr>
+          <w:b/>
+          <w:bCs/>
+        </w:rPr>
+        <w:t>Unsloth</w:t>
+      </w:r>
+      <w:proofErr w:type="spellEnd"/>
+      <w:r>
+        <w:rPr>
+          <w:b/>
+          <w:bCs/>
+        </w:rPr>
+        <w:t>):</w:t>
+      </w:r>
+      <w:r>
+        <w:t xml:space="preserve"> Setup used the same </w:t>
+      </w:r>
+      <w:proofErr w:type="spellStart"/>
+      <w:r>
+        <w:t>Unsloth</w:t>
+      </w:r>
+      <w:proofErr w:type="spellEnd"/>
+      <w:r>
+        <w:t xml:space="preserve"> recipe validated for Qwen2.5-VL (</w:t>
+      </w:r>
+      <w:proofErr w:type="spellStart"/>
+      <w:r>
+        <w:t>unsloth</w:t>
+      </w:r>
+      <w:proofErr w:type="spellEnd"/>
+      <w:r>
+        <w:t>/llava-v1.6-mistral-7b-hf, load_in_4bit=True). Multi-image inference (Plan A: 6 frames in one call) failed — all 5 categories rated identically 9/10, scale inverted, nonsensical 1000% confidence, verdict "not AI-generated" contradicting ground truth. Confirms LLaVA-1.6 does not support multi-image sequence input. Failed response preserved at corpus/mllm_outputs/llava/ltx_001_llava_v1_multiimage_FAILED.txt.</w:t>
+      </w:r>
+    </w:p>
+    <w:p>
+      <w:pPr>
+        <w:spacing w:after="100" w:line="300" w:lineRule="auto"/>
+        <w:jc w:val="both"/>
+      </w:pPr>
+      <w:r>
+        <w:rPr>
+          <w:b/>
+          <w:bCs/>
+        </w:rPr>
+        <w:t>Per-frame inference with analysis_prompt_v1 also failed</w:t>
+      </w:r>
+      <w:r>
+        <w:t xml:space="preserve"> — every frame from all three generators rated 0/10 with 100% "not AI-generated". LLaVA-1.6 defaulted to face-value scene description without actively examining for artefacts.</w:t>
+      </w:r>
+    </w:p>
+    <w:p>
+      <w:pPr>
+        <w:spacing w:after="100" w:line="300" w:lineRule="auto"/>
+        <w:jc w:val="both"/>
+      </w:pPr>
+      <w:r>
+        <w:t>Rewrote analysis_prompt_v2 with forensic-examiner framing, explicit checklist of known text-to-video artefact categories, "assume AI-generated until proven otherwise" prior, and instruction that all-zero ratings indicate insufficient examination. Calibration produced correctly-oriented output: specific defect observations, verdict "Yes, AI-generated, 90% confidence".</w:t>
+      </w:r>
+    </w:p>
+    <w:p>
+      <w:pPr>
+        <w:spacing w:after="100" w:line="300" w:lineRule="auto"/>
+        <w:jc w:val="both"/>
+      </w:pPr>
+      <w:r>
+        <w:rPr>
+          <w:b/>
+          <w:bCs/>
+        </w:rPr>
+        <w:t>Aggregation methodology:</w:t>
+      </w:r>
+      <w:r>
+        <w:t xml:space="preserve"> 6 frames per video analysed individually, then aggregated via mean severity per category + majority-vote verdict + deduplicated top qualitative observations. Video-level output format matches Claude/Gemini/Qwen structure. Known limitation: </w:t>
+      </w:r>
+      <w:proofErr w:type="spellStart"/>
+      <w:r>
+        <w:t>LLaVA's</w:t>
+      </w:r>
+      <w:proofErr w:type="spellEnd"/>
+      <w:r>
+        <w:t xml:space="preserve"> numeric per-category ratings remain unreliable (systematically 0/10 regardless of qualitative observations). For Week 4 cross-MLLM comparison, </w:t>
+      </w:r>
+      <w:proofErr w:type="spellStart"/>
+      <w:r>
+        <w:t>LLaVA</w:t>
+      </w:r>
+      <w:proofErr w:type="spellEnd"/>
+      <w:r>
+        <w:t xml:space="preserve"> outputs will be treated as (verdict, confidence, qualitative observations) rather than numeric severity scores.</w:t>
+      </w:r>
+    </w:p>
+    <w:p>
+      <w:pPr>
+        <w:spacing w:after="100" w:line="300" w:lineRule="auto"/>
+        <w:jc w:val="both"/>
+      </w:pPr>
+      <w:r>
+        <w:rPr>
+          <w:b/>
+          <w:bCs/>
+        </w:rPr>
+        <w:t>Prompt decision:</w:t>
+      </w:r>
+      <w:r>
+        <w:t xml:space="preserve"> freeze analysis_prompt_v1 for Claude, Gemini, Qwen (all three handled it cleanly); freeze analysis_prompt_v2 for LLaVA-1.6. Per-model prompt variants justified by observed prompt-sensitivity differences.</w:t>
+      </w:r>
+    </w:p>
+    <w:p>
+      <w:pPr>
+        <w:spacing w:after="100" w:line="300" w:lineRule="auto"/>
+        <w:jc w:val="both"/>
+        <w:rPr>
+          <w:b/>
+          <w:bCs/>
+        </w:rPr>
+      </w:pPr>
+      <w:r>
+        <w:rPr>
+          <w:b/>
+          <w:bCs/>
+        </w:rPr>
+        <w:t>Week 1 status — COMPLETE: 3 of 3 open-weight generators verified; 4 of 4 MLLMs verified on 3 test videos each (12 analyses total); frame-based methodology adopted and documented; two prompt variants frozen.</w:t>
+      </w:r>
+    </w:p>
+    <w:p>
+      <w:pPr>
+        <w:spacing w:after="100" w:line="300" w:lineRule="auto"/>
+        <w:jc w:val="both"/>
+      </w:pPr>
+    </w:p>
+    <w:p>
+      <w:pPr>
+        <w:spacing w:after="100" w:line="300" w:lineRule="auto"/>
+        <w:jc w:val="both"/>
+        <w:rPr>
+          <w:b/>
+          <w:bCs/>
+        </w:rPr>
+      </w:pPr>
+      <w:r>
+        <w:rPr>
+          <w:b/>
+          <w:bCs/>
+        </w:rPr>
+        <w:t xml:space="preserve">Afternoon session — deviation from plan: Original plan had Monday as Week 2 start. </w:t>
+      </w:r>
+      <w:proofErr w:type="spellStart"/>
+      <w:r>
+        <w:rPr>
+          <w:b/>
+          <w:bCs/>
+        </w:rPr>
+        <w:t>LLaVA</w:t>
+      </w:r>
+      <w:proofErr w:type="spellEnd"/>
+      <w:r>
+        <w:rPr>
+          <w:b/>
+          <w:bCs/>
+        </w:rPr>
+        <w:t xml:space="preserve"> finished early afternoon so pushed into Week 2 bulk generation same day. Compute and time budget checked before starting.</w:t>
+      </w:r>
+    </w:p>
+    <w:p>
+      <w:pPr>
+        <w:spacing w:after="100" w:line="300" w:lineRule="auto"/>
+        <w:jc w:val="both"/>
+      </w:pPr>
+      <w:r>
+        <w:t xml:space="preserve">Week 2 batch prompts v1 frozen: 40 prompts across 8 categories (portrait, hands, </w:t>
+      </w:r>
+      <w:proofErr w:type="spellStart"/>
+      <w:r>
+        <w:t>multi_person</w:t>
+      </w:r>
+      <w:proofErr w:type="spellEnd"/>
+      <w:r>
+        <w:t xml:space="preserve">, motion, </w:t>
+      </w:r>
+      <w:proofErr w:type="spellStart"/>
+      <w:r>
+        <w:t>text_scene</w:t>
+      </w:r>
+      <w:proofErr w:type="spellEnd"/>
+      <w:r>
+        <w:t xml:space="preserve">, texture, animal, </w:t>
+      </w:r>
+      <w:proofErr w:type="spellStart"/>
+      <w:r>
+        <w:t>edge_case</w:t>
+      </w:r>
+      <w:proofErr w:type="spellEnd"/>
+      <w:r>
+        <w:t xml:space="preserve">), 5 per category. Saved to </w:t>
+      </w:r>
+      <w:proofErr w:type="spellStart"/>
+      <w:r>
+        <w:t>msc</w:t>
+      </w:r>
+      <w:proofErr w:type="spellEnd"/>
+      <w:r>
+        <w:t>-deepfake/</w:t>
+      </w:r>
+      <w:proofErr w:type="spellStart"/>
+      <w:r>
+        <w:t>batch_prompts</w:t>
+      </w:r>
+      <w:proofErr w:type="spellEnd"/>
+      <w:r>
+        <w:t>/week2_prompts_v1.txt.</w:t>
+      </w:r>
+    </w:p>
+    <w:p>
+      <w:pPr>
+        <w:spacing w:after="100" w:line="300" w:lineRule="auto"/>
+        <w:jc w:val="both"/>
+      </w:pPr>
+      <w:r>
+        <w:t>Storage architecture — personal Google Drive (paid 210 GB tier): All Week 2 outputs live on personal Drive at /content/drive/</w:t>
+      </w:r>
+      <w:proofErr w:type="spellStart"/>
+      <w:r>
+        <w:t>MyDrive</w:t>
+      </w:r>
+      <w:proofErr w:type="spellEnd"/>
+      <w:r>
+        <w:t>/</w:t>
+      </w:r>
+      <w:proofErr w:type="spellStart"/>
+      <w:r>
+        <w:t>msc</w:t>
+      </w:r>
+      <w:proofErr w:type="spellEnd"/>
+      <w:r>
+        <w:t xml:space="preserve">-deepfake/. Setup for shortcut into a separate 1 TB college Drive was investigated but not implemented today — files continued to write to personal Drive throughout the session. </w:t>
+      </w:r>
+      <w:r>
+        <w:lastRenderedPageBreak/>
+        <w:t>Deferred college Drive migration to later — will move once Week 2 open-weight generation is complete or if personal Drive runs low on space. Sufficient headroom in personal Drive to complete Week 2.</w:t>
+      </w:r>
+    </w:p>
+    <w:p>
+      <w:pPr>
+        <w:spacing w:after="100" w:line="300" w:lineRule="auto"/>
+        <w:jc w:val="both"/>
+      </w:pPr>
+      <w:r>
+        <w:t xml:space="preserve">Model weights on </w:t>
+      </w:r>
+      <w:proofErr w:type="spellStart"/>
+      <w:r>
+        <w:t>Colab</w:t>
+      </w:r>
+      <w:proofErr w:type="spellEnd"/>
+      <w:r>
+        <w:t xml:space="preserve"> local disk (/content/</w:t>
+      </w:r>
+      <w:proofErr w:type="spellStart"/>
+      <w:r>
+        <w:t>hf_cache</w:t>
+      </w:r>
+      <w:proofErr w:type="spellEnd"/>
+      <w:r>
+        <w:t xml:space="preserve">/): After a hang attempting to load 27 GB LTX weights from Drive via FUSE mount, switched to </w:t>
+      </w:r>
+      <w:proofErr w:type="spellStart"/>
+      <w:r>
+        <w:t>Colab</w:t>
+      </w:r>
+      <w:proofErr w:type="spellEnd"/>
+      <w:r>
+        <w:t xml:space="preserve"> local disk for weights. Fresh ~10-minute download per session accepted as trade-off. Generated videos still save to Drive.</w:t>
+      </w:r>
+    </w:p>
+    <w:p>
+      <w:pPr>
+        <w:spacing w:after="100" w:line="300" w:lineRule="auto"/>
+        <w:jc w:val="both"/>
+      </w:pPr>
+      <w:r>
+        <w:rPr>
+          <w:b/>
+          <w:bCs/>
+        </w:rPr>
+        <w:t>LTX-2.3 first batch (v1_FAILED, 40 videos)</w:t>
+      </w:r>
+      <w:r>
+        <w:t xml:space="preserve"> — silent failure due to missing pipeline parameters: Ran full 40-prompt batch with </w:t>
+      </w:r>
+      <w:proofErr w:type="spellStart"/>
+      <w:r>
+        <w:t>LTXPipeline</w:t>
+      </w:r>
+      <w:proofErr w:type="spellEnd"/>
+      <w:r>
+        <w:t xml:space="preserve"> settings (768×512, 97 frames, 40 inference steps) but missing three parameters that Week 1's working notebook (01_ltx_setup_and_first_video.ipynb) had used: </w:t>
+      </w:r>
+      <w:proofErr w:type="spellStart"/>
+      <w:r>
+        <w:t>negative_prompt</w:t>
+      </w:r>
+      <w:proofErr w:type="spellEnd"/>
+      <w:r>
+        <w:t xml:space="preserve">, </w:t>
+      </w:r>
+      <w:proofErr w:type="spellStart"/>
+      <w:r>
+        <w:t>guidance_scale</w:t>
+      </w:r>
+      <w:proofErr w:type="spellEnd"/>
+      <w:r>
+        <w:t xml:space="preserve">=3.0, and generator seed. All </w:t>
+      </w:r>
+      <w:proofErr w:type="gramStart"/>
+      <w:r>
+        <w:t>40 output</w:t>
+      </w:r>
+      <w:proofErr w:type="gramEnd"/>
+      <w:r>
+        <w:t xml:space="preserve"> garbled/incoherent — motion patterns visible but no coherent scenes, no error message, no warning. Failed batch preserved at </w:t>
+      </w:r>
+      <w:proofErr w:type="spellStart"/>
+      <w:r>
+        <w:t>msc</w:t>
+      </w:r>
+      <w:proofErr w:type="spellEnd"/>
+      <w:r>
+        <w:t>-deepfake/</w:t>
+      </w:r>
+      <w:proofErr w:type="spellStart"/>
+      <w:r>
+        <w:t>generated_videos</w:t>
+      </w:r>
+      <w:proofErr w:type="spellEnd"/>
+      <w:r>
+        <w:t>/ltx_v1_FAILED/ as methodological evidence, not deleted.</w:t>
+      </w:r>
+    </w:p>
+    <w:p>
+      <w:pPr>
+        <w:spacing w:after="100" w:line="300" w:lineRule="auto"/>
+        <w:jc w:val="both"/>
+        <w:rPr>
+          <w:b/>
+          <w:bCs/>
+        </w:rPr>
+      </w:pPr>
+      <w:r>
+        <w:rPr>
+          <w:b/>
+          <w:bCs/>
+        </w:rPr>
+        <w:t>LTX-2.3 second batch (v2, 40 videos) — success:</w:t>
+      </w:r>
+      <w:r>
+        <w:t xml:space="preserve"> </w:t>
+      </w:r>
+      <w:r>
+        <w:rPr>
+          <w:b/>
+          <w:bCs/>
+        </w:rPr>
+        <w:t>Regenerated with Week 1-proven parameters:</w:t>
+      </w:r>
+    </w:p>
+    <w:p>
+      <w:pPr>
+        <w:spacing w:after="100" w:line="300" w:lineRule="auto"/>
+        <w:jc w:val="both"/>
+      </w:pPr>
+      <w:proofErr w:type="spellStart"/>
+      <w:r>
+        <w:t>negative_prompt</w:t>
+      </w:r>
+      <w:proofErr w:type="spellEnd"/>
+      <w:r>
+        <w:t xml:space="preserve"> = "blurry, low quality, distorted, unnatural, deformed, static, motion smear, garbled, artefacts, worst quality"</w:t>
+      </w:r>
+    </w:p>
+    <w:p>
+      <w:pPr>
+        <w:spacing w:after="100" w:line="300" w:lineRule="auto"/>
+        <w:jc w:val="both"/>
+      </w:pPr>
+      <w:proofErr w:type="spellStart"/>
+      <w:r>
+        <w:t>guidance_scale</w:t>
+      </w:r>
+      <w:proofErr w:type="spellEnd"/>
+      <w:r>
+        <w:t xml:space="preserve"> = 3.0</w:t>
+      </w:r>
+    </w:p>
+    <w:p>
+      <w:pPr>
+        <w:spacing w:after="100" w:line="300" w:lineRule="auto"/>
+        <w:jc w:val="both"/>
+      </w:pPr>
+      <w:r>
+        <w:t>generator seed = 42</w:t>
+      </w:r>
+    </w:p>
+    <w:p>
+      <w:pPr>
+        <w:spacing w:after="100" w:line="300" w:lineRule="auto"/>
+        <w:jc w:val="both"/>
+      </w:pPr>
+      <w:r>
+        <w:t>704×480 resolution</w:t>
+      </w:r>
+    </w:p>
+    <w:p>
+      <w:pPr>
+        <w:spacing w:after="100" w:line="300" w:lineRule="auto"/>
+        <w:jc w:val="both"/>
+      </w:pPr>
+      <w:r>
+        <w:t>73 frames at 24 fps (~3 seconds)</w:t>
+      </w:r>
+    </w:p>
+    <w:p>
+      <w:pPr>
+        <w:spacing w:after="100" w:line="300" w:lineRule="auto"/>
+        <w:jc w:val="both"/>
+      </w:pPr>
+      <w:r>
+        <w:t>30 inference steps</w:t>
+      </w:r>
+    </w:p>
+    <w:p>
+      <w:pPr>
+        <w:spacing w:after="100" w:line="300" w:lineRule="auto"/>
+        <w:jc w:val="both"/>
+      </w:pPr>
+      <w:r>
+        <w:t>Cinematographic suffix appended to each prompt: ", natural lighting, cinematic quality, high detail, realistic"</w:t>
+      </w:r>
+    </w:p>
+    <w:p>
+      <w:pPr>
+        <w:spacing w:after="100" w:line="300" w:lineRule="auto"/>
+        <w:jc w:val="both"/>
+      </w:pPr>
+      <w:r>
+        <w:rPr>
+          <w:b/>
+          <w:bCs/>
+        </w:rPr>
+        <w:t>Sanity-checked single video against Week 1 baseline before batching; quality confirmed comparable.</w:t>
+      </w:r>
+      <w:r>
+        <w:t xml:space="preserve"> Ran full batch. Result: 40/40 videos generated successfully. All videos saved to </w:t>
+      </w:r>
+      <w:proofErr w:type="spellStart"/>
+      <w:r>
+        <w:t>msc</w:t>
+      </w:r>
+      <w:proofErr w:type="spellEnd"/>
+      <w:r>
+        <w:t>-deepfake/</w:t>
+      </w:r>
+      <w:proofErr w:type="spellStart"/>
+      <w:r>
+        <w:t>generated_videos</w:t>
+      </w:r>
+      <w:proofErr w:type="spellEnd"/>
+      <w:r>
+        <w:t>/</w:t>
+      </w:r>
+      <w:proofErr w:type="spellStart"/>
+      <w:r>
+        <w:t>ltx</w:t>
+      </w:r>
+      <w:proofErr w:type="spellEnd"/>
+      <w:r>
+        <w:t>/.</w:t>
+      </w:r>
+    </w:p>
+    <w:p>
+      <w:pPr>
+        <w:spacing w:after="100" w:line="300" w:lineRule="auto"/>
+        <w:jc w:val="both"/>
+      </w:pPr>
+      <w:r>
+        <w:rPr>
+          <w:b/>
+          <w:bCs/>
+        </w:rPr>
+        <w:t xml:space="preserve">Methodological finding </w:t>
+      </w:r>
+      <w:r>
+        <w:t xml:space="preserve">— silent-failure risk in T2V pipelines: Missing </w:t>
+      </w:r>
+      <w:proofErr w:type="spellStart"/>
+      <w:r>
+        <w:t>negative_prompt</w:t>
+      </w:r>
+      <w:proofErr w:type="spellEnd"/>
+      <w:r>
+        <w:t xml:space="preserve"> or </w:t>
+      </w:r>
+      <w:proofErr w:type="spellStart"/>
+      <w:r>
+        <w:t>guidance_scale</w:t>
+      </w:r>
+      <w:proofErr w:type="spellEnd"/>
+      <w:r>
+        <w:t xml:space="preserve"> in LTX-Video produces silently-broken output — no exception, no warning, just garbled videos. This is a real reproducibility risk: bulk T2V generation cannot rely on defaults being sensible. Going forward, every generation call will be accompanied by a parameter dictionary logged to a metadata JSON alongside the video file, so any future re-run can reproduce exactly. This convention will be applied to </w:t>
+      </w:r>
+      <w:proofErr w:type="spellStart"/>
+      <w:r>
+        <w:t>HunyuanVideo</w:t>
+      </w:r>
+      <w:proofErr w:type="spellEnd"/>
+      <w:r>
+        <w:t xml:space="preserve"> and Wan 2.2 batches starting Monday.</w:t>
+      </w:r>
+    </w:p>
+    <w:p>
+      <w:pPr>
+        <w:spacing w:after="100" w:line="300" w:lineRule="auto"/>
+        <w:jc w:val="both"/>
+      </w:pPr>
+      <w:r>
+        <w:rPr>
+          <w:b/>
+          <w:bCs/>
+        </w:rPr>
+        <w:t>Compute reality —</w:t>
+      </w:r>
+      <w:r>
+        <w:t xml:space="preserve"> L4 significantly cheaper than expected: </w:t>
+      </w:r>
+      <w:proofErr w:type="spellStart"/>
+      <w:r>
+        <w:t>Colab</w:t>
+      </w:r>
+      <w:proofErr w:type="spellEnd"/>
+      <w:r>
+        <w:t xml:space="preserve"> Pro units at start of Sunday: 92.70. </w:t>
+      </w:r>
+      <w:proofErr w:type="spellStart"/>
+      <w:r>
+        <w:t>Colab</w:t>
+      </w:r>
+      <w:proofErr w:type="spellEnd"/>
+      <w:r>
+        <w:t xml:space="preserve"> Pro units at end of Sunday: 89.56. Total consumed across the whole day (</w:t>
+      </w:r>
+      <w:proofErr w:type="spellStart"/>
+      <w:r>
+        <w:t>LLaVA</w:t>
+      </w:r>
+      <w:proofErr w:type="spellEnd"/>
+      <w:r>
+        <w:t xml:space="preserve"> morning session was Kaggle-only so zero </w:t>
+      </w:r>
+      <w:proofErr w:type="spellStart"/>
+      <w:r>
+        <w:t>Colab</w:t>
+      </w:r>
+      <w:proofErr w:type="spellEnd"/>
+      <w:r>
+        <w:t xml:space="preserve">; </w:t>
+      </w:r>
+      <w:proofErr w:type="gramStart"/>
+      <w:r>
+        <w:t>both LTX</w:t>
+      </w:r>
+      <w:proofErr w:type="gramEnd"/>
+      <w:r>
+        <w:t xml:space="preserve"> batches on </w:t>
+      </w:r>
+      <w:proofErr w:type="spellStart"/>
+      <w:r>
+        <w:t>Colab</w:t>
+      </w:r>
+      <w:proofErr w:type="spellEnd"/>
+      <w:r>
+        <w:t xml:space="preserve"> L4): 3.14 units for ~6 hours of L4 GPU work + ~80 videos generated. This significantly revises the Tier C budget forecast downward — full open-weight generation (120 videos across LTX, </w:t>
+      </w:r>
+      <w:proofErr w:type="spellStart"/>
+      <w:r>
+        <w:t>Hunyuan</w:t>
+      </w:r>
+      <w:proofErr w:type="spellEnd"/>
+      <w:r>
+        <w:t>, Wan) is comfortably achievable within existing units, with no top-up required. Kaggle T4 hours consumed today (</w:t>
+      </w:r>
+      <w:proofErr w:type="spellStart"/>
+      <w:r>
+        <w:t>LLaVA</w:t>
+      </w:r>
+      <w:proofErr w:type="spellEnd"/>
+      <w:r>
+        <w:t xml:space="preserve"> session): to be logged from Kaggle sidebar. Personal Drive usage: to be checked next </w:t>
+      </w:r>
+      <w:proofErr w:type="spellStart"/>
+      <w:r>
+        <w:t>Colab</w:t>
+      </w:r>
+      <w:proofErr w:type="spellEnd"/>
+      <w:r>
+        <w:t xml:space="preserve"> session via du -sh.</w:t>
+      </w:r>
+    </w:p>
+    <w:p>
+      <w:pPr>
+        <w:spacing w:after="100" w:line="300" w:lineRule="auto"/>
+        <w:jc w:val="both"/>
+      </w:pPr>
+      <w:r>
+        <w:rPr>
+          <w:b/>
+          <w:bCs/>
+        </w:rPr>
+        <w:t>Files added/updated today</w:t>
+      </w:r>
+      <w:r>
+        <w:t>:</w:t>
+      </w:r>
+    </w:p>
+    <w:p>
+      <w:pPr>
+        <w:spacing w:after="100" w:line="300" w:lineRule="auto"/>
+        <w:jc w:val="both"/>
+      </w:pPr>
+    </w:p>
+    <w:p>
+      <w:pPr>
+        <w:spacing w:after="100" w:line="300" w:lineRule="auto"/>
+        <w:jc w:val="both"/>
+      </w:pPr>
+      <w:r>
+        <w:lastRenderedPageBreak/>
+        <w:t>code/analysis/05_llava16_kaggle.ipynb</w:t>
+      </w:r>
+    </w:p>
+    <w:p>
+      <w:pPr>
+        <w:spacing w:after="100" w:line="300" w:lineRule="auto"/>
+        <w:jc w:val="both"/>
+      </w:pPr>
+      <w:r>
+        <w:t>code/analysis/06_bulk_generation_ltx.ipynb</w:t>
+      </w:r>
+    </w:p>
+    <w:p>
+      <w:pPr>
+        <w:spacing w:after="100" w:line="300" w:lineRule="auto"/>
+        <w:jc w:val="both"/>
+      </w:pPr>
+      <w:r>
+        <w:t>corpus/</w:t>
+      </w:r>
+      <w:proofErr w:type="spellStart"/>
+      <w:r>
+        <w:t>mllm_outputs</w:t>
+      </w:r>
+      <w:proofErr w:type="spellEnd"/>
+      <w:r>
+        <w:t>/</w:t>
+      </w:r>
+      <w:proofErr w:type="spellStart"/>
+      <w:r>
+        <w:t>llava</w:t>
+      </w:r>
+      <w:proofErr w:type="spellEnd"/>
+      <w:r>
+        <w:t>/ltx_001_llava_v1_multiimage_FAILED.txt</w:t>
+      </w:r>
+    </w:p>
+    <w:p>
+      <w:pPr>
+        <w:spacing w:after="100" w:line="300" w:lineRule="auto"/>
+        <w:jc w:val="both"/>
+      </w:pPr>
+      <w:r>
+        <w:t>corpus/</w:t>
+      </w:r>
+      <w:proofErr w:type="spellStart"/>
+      <w:r>
+        <w:t>mllm_outputs</w:t>
+      </w:r>
+      <w:proofErr w:type="spellEnd"/>
+      <w:r>
+        <w:t>/</w:t>
+      </w:r>
+      <w:proofErr w:type="spellStart"/>
+      <w:r>
+        <w:t>llava</w:t>
+      </w:r>
+      <w:proofErr w:type="spellEnd"/>
+      <w:r>
+        <w:t>/{ltx,hunyuan,wan}_001_llava_v2.txt</w:t>
+      </w:r>
+    </w:p>
+    <w:p>
+      <w:pPr>
+        <w:spacing w:after="100" w:line="300" w:lineRule="auto"/>
+        <w:jc w:val="both"/>
+      </w:pPr>
+      <w:proofErr w:type="spellStart"/>
+      <w:r>
+        <w:t>msc</w:t>
+      </w:r>
+      <w:proofErr w:type="spellEnd"/>
+      <w:r>
+        <w:t>-deepfake/</w:t>
+      </w:r>
+      <w:proofErr w:type="spellStart"/>
+      <w:r>
+        <w:t>batch_prompts</w:t>
+      </w:r>
+      <w:proofErr w:type="spellEnd"/>
+      <w:r>
+        <w:t>/week2_prompts_v1.txt (personal Drive)</w:t>
+      </w:r>
+    </w:p>
+    <w:p>
+      <w:pPr>
+        <w:spacing w:after="100" w:line="300" w:lineRule="auto"/>
+        <w:jc w:val="both"/>
+      </w:pPr>
+      <w:proofErr w:type="spellStart"/>
+      <w:r>
+        <w:t>msc</w:t>
+      </w:r>
+      <w:proofErr w:type="spellEnd"/>
+      <w:r>
+        <w:t>-deepfake/</w:t>
+      </w:r>
+      <w:proofErr w:type="spellStart"/>
+      <w:r>
+        <w:t>generated_videos</w:t>
+      </w:r>
+      <w:proofErr w:type="spellEnd"/>
+      <w:r>
+        <w:t>/</w:t>
+      </w:r>
+      <w:proofErr w:type="spellStart"/>
+      <w:r>
+        <w:t>ltx</w:t>
+      </w:r>
+      <w:proofErr w:type="spellEnd"/>
+      <w:r>
+        <w:t>/ (40 videos, personal Drive)</w:t>
+      </w:r>
+    </w:p>
+    <w:p>
+      <w:pPr>
+        <w:spacing w:after="100" w:line="300" w:lineRule="auto"/>
+        <w:jc w:val="both"/>
+      </w:pPr>
+      <w:proofErr w:type="spellStart"/>
+      <w:r>
+        <w:t>msc</w:t>
+      </w:r>
+      <w:proofErr w:type="spellEnd"/>
+      <w:r>
+        <w:t>-deepfake/</w:t>
+      </w:r>
+      <w:proofErr w:type="spellStart"/>
+      <w:r>
+        <w:t>generated_videos</w:t>
+      </w:r>
+      <w:proofErr w:type="spellEnd"/>
+      <w:r>
+        <w:t>/ltx_v1_FAILED/ (40 evidence videos, personal Drive)</w:t>
+      </w:r>
+    </w:p>
+    <w:p>
+      <w:pPr>
+        <w:spacing w:after="100" w:line="300" w:lineRule="auto"/>
+        <w:jc w:val="both"/>
+      </w:pPr>
+      <w:r>
+        <w:t>logbook/Project_Logbook.docx</w:t>
+      </w:r>
+    </w:p>
+    <w:p>
+      <w:pPr>
+        <w:spacing w:after="100" w:line="300" w:lineRule="auto"/>
+        <w:jc w:val="both"/>
+      </w:pPr>
+    </w:p>
+    <w:p>
+      <w:pPr>
+        <w:spacing w:after="100" w:line="300" w:lineRule="auto"/>
+        <w:jc w:val="both"/>
+      </w:pPr>
+      <w:r>
+        <w:rPr>
+          <w:b/>
+          <w:bCs/>
+        </w:rPr>
+        <w:t xml:space="preserve">Status vs plan: </w:t>
+      </w:r>
+      <w:r>
+        <w:t xml:space="preserve">Week 1 fully complete. Week 2 LTX-2.3 batch complete a full day ahead of the original Monday schedule. Three methodological findings documented across the day: (1) LLaVA-1.6 requires per-model prompt variant and (verdict, confidence, observations) output shape; (2) </w:t>
+      </w:r>
+      <w:proofErr w:type="spellStart"/>
+      <w:r>
+        <w:t>Colab</w:t>
+      </w:r>
+      <w:proofErr w:type="spellEnd"/>
+      <w:r>
+        <w:t xml:space="preserve">-Drive FUSE mount unreliable for large </w:t>
+      </w:r>
+      <w:proofErr w:type="spellStart"/>
+      <w:r>
+        <w:t>safetensors</w:t>
+      </w:r>
+      <w:proofErr w:type="spellEnd"/>
+      <w:r>
+        <w:t xml:space="preserve"> reads; (3) T2V silent-failure risk from missing </w:t>
+      </w:r>
+      <w:proofErr w:type="spellStart"/>
+      <w:r>
+        <w:t>negative_prompt</w:t>
+      </w:r>
+      <w:proofErr w:type="spellEnd"/>
+      <w:r>
+        <w:t>/</w:t>
+      </w:r>
+      <w:proofErr w:type="spellStart"/>
+      <w:r>
+        <w:t>guidance_scale</w:t>
+      </w:r>
+      <w:proofErr w:type="spellEnd"/>
+      <w:r>
+        <w:t>.</w:t>
+      </w:r>
+    </w:p>
+    <w:p>
+      <w:pPr>
+        <w:spacing w:after="100" w:line="300" w:lineRule="auto"/>
+        <w:jc w:val="both"/>
+        <w:rPr>
+          <w:b/>
+          <w:bCs/>
+        </w:rPr>
+      </w:pPr>
+      <w:r>
+        <w:rPr>
+          <w:b/>
+          <w:bCs/>
+        </w:rPr>
+        <w:t xml:space="preserve">Next: Monday 20 July. </w:t>
+      </w:r>
+      <w:proofErr w:type="spellStart"/>
+      <w:r>
+        <w:rPr>
+          <w:b/>
+          <w:bCs/>
+        </w:rPr>
+        <w:t>HunyuanVideo</w:t>
+      </w:r>
+      <w:proofErr w:type="spellEnd"/>
+      <w:r>
+        <w:rPr>
+          <w:b/>
+          <w:bCs/>
+        </w:rPr>
+        <w:t xml:space="preserve"> setup. Try Kaggle T4 with FP8 quantization first to preserve </w:t>
+      </w:r>
+      <w:proofErr w:type="spellStart"/>
+      <w:r>
+        <w:rPr>
+          <w:b/>
+          <w:bCs/>
+        </w:rPr>
+        <w:t>Colab</w:t>
+      </w:r>
+      <w:proofErr w:type="spellEnd"/>
+      <w:r>
+        <w:rPr>
+          <w:b/>
+          <w:bCs/>
+        </w:rPr>
+        <w:t xml:space="preserve"> units; fall back to </w:t>
+      </w:r>
+      <w:proofErr w:type="spellStart"/>
+      <w:r>
+        <w:rPr>
+          <w:b/>
+          <w:bCs/>
+        </w:rPr>
+        <w:t>Colab</w:t>
+      </w:r>
+      <w:proofErr w:type="spellEnd"/>
+      <w:r>
+        <w:rPr>
+          <w:b/>
+          <w:bCs/>
+        </w:rPr>
+        <w:t xml:space="preserve"> A100 if it fails. Log full parameter dictionary alongside each video from cell 1 to prevent silent-failure pattern from Sunday's v1 batch.</w:t>
+      </w:r>
+    </w:p>
+    <w:p>
+      <w:pPr>
+        <w:spacing w:after="100" w:line="300" w:lineRule="auto"/>
+        <w:jc w:val="both"/>
+        <w:rPr>
+          <w:b/>
+          <w:bCs/>
+        </w:rPr>
       </w:pPr>
     </w:p>
     <w:p>

</xml_diff>

<commit_message>
Day 5 (19 Jul): Week 1 closed with LLaVA-1.6 + Week 2 open-weight corpus (120 videos across LTX/Hunyuan/Wan) all complete in single day; 5 methodology findings documented
</commit_message>
<xml_diff>
--- a/logbook/Project_Logbook.docx
+++ b/logbook/Project_Logbook.docx
@@ -2094,51 +2094,46 @@
     </w:p>
     <w:p>
       <w:pPr>
-        <w:spacing w:after="100" w:line="300" w:lineRule="auto"/>
-        <w:jc w:val="both"/>
-        <w:rPr>
-          <w:b/>
-          <w:bCs/>
-        </w:rPr>
-      </w:pPr>
-      <w:r>
-        <w:rPr>
-          <w:b/>
-          <w:bCs/>
-        </w:rPr>
-        <w:t>Sunday 19 July 2026 — Week 1 Closed (LLaVA-1.6) + Week 2 Started Early (LTX-2.3 v2)</w:t>
-      </w:r>
-    </w:p>
-    <w:p>
-      <w:pPr>
-        <w:spacing w:after="100" w:line="300" w:lineRule="auto"/>
-        <w:jc w:val="both"/>
-      </w:pPr>
-      <w:r>
-        <w:rPr>
-          <w:b/>
-          <w:bCs/>
+        <w:pStyle w:val="Heading4"/>
+      </w:pPr>
+      <w:r>
+        <w:t>Sunday 19 July 2026 — Full Day: Week 1 Closed + Week 2 Open-Weight Corpus Complete (120 videos across 3 generators)</w:t>
+      </w:r>
+    </w:p>
+    <w:p>
+      <w:pPr>
+        <w:pStyle w:val="font-claude-response-body"/>
+      </w:pPr>
+      <w:r>
+        <w:rPr>
+          <w:rStyle w:val="Strong"/>
         </w:rPr>
         <w:t xml:space="preserve">Morning session — LLaVA-1.6 on Kaggle T4 (4-bit via </w:t>
       </w:r>
       <w:proofErr w:type="spellStart"/>
       <w:r>
         <w:rPr>
-          <w:b/>
-          <w:bCs/>
+          <w:rStyle w:val="Strong"/>
         </w:rPr>
         <w:t>Unsloth</w:t>
       </w:r>
       <w:proofErr w:type="spellEnd"/>
       <w:r>
         <w:rPr>
-          <w:b/>
-          <w:bCs/>
+          <w:rStyle w:val="Strong"/>
         </w:rPr>
         <w:t>):</w:t>
       </w:r>
       <w:r>
-        <w:t xml:space="preserve"> Setup used the same </w:t>
+        <w:t xml:space="preserve"> Used </w:t>
+      </w:r>
+      <w:proofErr w:type="spellStart"/>
+      <w:r>
+        <w:t>unsloth</w:t>
+      </w:r>
+      <w:proofErr w:type="spellEnd"/>
+      <w:r>
+        <w:t xml:space="preserve">/llava-v1.6-mistral-7b-hf with load_in_4bit=True — same </w:t>
       </w:r>
       <w:proofErr w:type="spellStart"/>
       <w:r>
@@ -2146,37 +2141,20 @@
       </w:r>
       <w:proofErr w:type="spellEnd"/>
       <w:r>
-        <w:t xml:space="preserve"> recipe validated for Qwen2.5-VL (</w:t>
-      </w:r>
-      <w:proofErr w:type="spellStart"/>
-      <w:r>
-        <w:t>unsloth</w:t>
-      </w:r>
-      <w:proofErr w:type="spellEnd"/>
-      <w:r>
-        <w:t>/llava-v1.6-mistral-7b-hf, load_in_4bit=True). Multi-image inference (Plan A: 6 frames in one call) failed — all 5 categories rated identically 9/10, scale inverted, nonsensical 1000% confidence, verdict "not AI-generated" contradicting ground truth. Confirms LLaVA-1.6 does not support multi-image sequence input. Failed response preserved at corpus/mllm_outputs/llava/ltx_001_llava_v1_multiimage_FAILED.txt.</w:t>
-      </w:r>
-    </w:p>
-    <w:p>
-      <w:pPr>
-        <w:spacing w:after="100" w:line="300" w:lineRule="auto"/>
-        <w:jc w:val="both"/>
-      </w:pPr>
-      <w:r>
-        <w:rPr>
-          <w:b/>
-          <w:bCs/>
-        </w:rPr>
-        <w:t>Per-frame inference with analysis_prompt_v1 also failed</w:t>
-      </w:r>
-      <w:r>
-        <w:t xml:space="preserve"> — every frame from all three generators rated 0/10 with 100% "not AI-generated". LLaVA-1.6 defaulted to face-value scene description without actively examining for artefacts.</w:t>
-      </w:r>
-    </w:p>
-    <w:p>
-      <w:pPr>
-        <w:spacing w:after="100" w:line="300" w:lineRule="auto"/>
-        <w:jc w:val="both"/>
+        <w:t xml:space="preserve"> recipe validated for Qwen2.5-VL. Multi-image inference (Plan A: 6 frames in one call) failed — all 5 categories rated identically 9/10, scale inverted, nonsensical 1000% confidence, verdict "not AI-generated" contradicting ground truth. Confirms LLaVA-1.6 does not support multi-image sequence input. Failed response preserved at corpus/mllm_outputs/llava/ltx_001_llava_v1_multiimage_FAILED.txt.</w:t>
+      </w:r>
+    </w:p>
+    <w:p>
+      <w:pPr>
+        <w:pStyle w:val="font-claude-response-body"/>
+      </w:pPr>
+      <w:r>
+        <w:t>Per-frame inference with analysis_prompt_v1 also failed — every frame from all three generators rated 0/10 with 100% "not AI-generated". LLaVA-1.6 defaulted to face-value scene description without actively examining for artefacts.</w:t>
+      </w:r>
+    </w:p>
+    <w:p>
+      <w:pPr>
+        <w:pStyle w:val="font-claude-response-body"/>
       </w:pPr>
       <w:r>
         <w:t>Rewrote analysis_prompt_v2 with forensic-examiner framing, explicit checklist of known text-to-video artefact categories, "assume AI-generated until proven otherwise" prior, and instruction that all-zero ratings indicate insufficient examination. Calibration produced correctly-oriented output: specific defect observations, verdict "Yes, AI-generated, 90% confidence".</w:t>
@@ -2184,18 +2162,10 @@
     </w:p>
     <w:p>
       <w:pPr>
-        <w:spacing w:after="100" w:line="300" w:lineRule="auto"/>
-        <w:jc w:val="both"/>
-      </w:pPr>
-      <w:r>
-        <w:rPr>
-          <w:b/>
-          <w:bCs/>
-        </w:rPr>
-        <w:t>Aggregation methodology:</w:t>
-      </w:r>
-      <w:r>
-        <w:t xml:space="preserve"> 6 frames per video analysed individually, then aggregated via mean severity per category + majority-vote verdict + deduplicated top qualitative observations. Video-level output format matches Claude/Gemini/Qwen structure. Known limitation: </w:t>
+        <w:pStyle w:val="font-claude-response-body"/>
+      </w:pPr>
+      <w:r>
+        <w:t xml:space="preserve">Aggregation methodology: 6 frames per video analysed individually, then aggregated via mean severity per category + majority-vote verdict + deduplicated top qualitative observations. Video-level output format matches Claude/Gemini/Qwen structure. Known limitation: </w:t>
       </w:r>
       <w:proofErr w:type="spellStart"/>
       <w:r>
@@ -2216,83 +2186,75 @@
     </w:p>
     <w:p>
       <w:pPr>
-        <w:spacing w:after="100" w:line="300" w:lineRule="auto"/>
-        <w:jc w:val="both"/>
-      </w:pPr>
-      <w:r>
-        <w:rPr>
-          <w:b/>
-          <w:bCs/>
-        </w:rPr>
-        <w:t>Prompt decision:</w:t>
-      </w:r>
-      <w:r>
-        <w:t xml:space="preserve"> freeze analysis_prompt_v1 for Claude, Gemini, Qwen (all three handled it cleanly); freeze analysis_prompt_v2 for LLaVA-1.6. Per-model prompt variants justified by observed prompt-sensitivity differences.</w:t>
-      </w:r>
-    </w:p>
-    <w:p>
-      <w:pPr>
-        <w:spacing w:after="100" w:line="300" w:lineRule="auto"/>
-        <w:jc w:val="both"/>
-        <w:rPr>
-          <w:b/>
-          <w:bCs/>
-        </w:rPr>
-      </w:pPr>
-      <w:r>
-        <w:rPr>
-          <w:b/>
-          <w:bCs/>
-        </w:rPr>
-        <w:t>Week 1 status — COMPLETE: 3 of 3 open-weight generators verified; 4 of 4 MLLMs verified on 3 test videos each (12 analyses total); frame-based methodology adopted and documented; two prompt variants frozen.</w:t>
-      </w:r>
-    </w:p>
-    <w:p>
-      <w:pPr>
-        <w:spacing w:after="100" w:line="300" w:lineRule="auto"/>
-        <w:jc w:val="both"/>
-      </w:pPr>
-    </w:p>
-    <w:p>
-      <w:pPr>
-        <w:spacing w:after="100" w:line="300" w:lineRule="auto"/>
-        <w:jc w:val="both"/>
-        <w:rPr>
-          <w:b/>
-          <w:bCs/>
-        </w:rPr>
-      </w:pPr>
-      <w:r>
-        <w:rPr>
-          <w:b/>
-          <w:bCs/>
-        </w:rPr>
-        <w:t xml:space="preserve">Afternoon session — deviation from plan: Original plan had Monday as Week 2 start. </w:t>
-      </w:r>
-      <w:proofErr w:type="spellStart"/>
-      <w:r>
-        <w:rPr>
-          <w:b/>
-          <w:bCs/>
-        </w:rPr>
+        <w:pStyle w:val="font-claude-response-body"/>
+      </w:pPr>
+      <w:r>
+        <w:t>Prompt decision: freeze analysis_prompt_v1 for Claude, Gemini, Qwen (all three handled it cleanly); freeze analysis_prompt_v2 for LLaVA-1.6. Per-model prompt variants justified by observed prompt-sensitivity differences.</w:t>
+      </w:r>
+    </w:p>
+    <w:p>
+      <w:pPr>
+        <w:pStyle w:val="font-claude-response-body"/>
+      </w:pPr>
+      <w:r>
+        <w:rPr>
+          <w:rStyle w:val="Strong"/>
+        </w:rPr>
+        <w:t>Week 1 status — COMPLETE:</w:t>
+      </w:r>
+      <w:r>
+        <w:t xml:space="preserve"> 3 of 3 open-weight generators verified; 4 of 4 MLLMs verified on 3 test videos each (12 analyses total); frame-based methodology adopted and documented; two prompt variants frozen.</w:t>
+      </w:r>
+    </w:p>
+    <w:p>
+      <w:r>
+        <w:pict w14:anchorId="33626D46">
+          <v:rect id="_x0000_i1151" style="width:0;height:1.5pt" o:hralign="center" o:hrstd="t" o:hr="t" fillcolor="#a0a0a0" stroked="f"/>
+        </w:pict>
+      </w:r>
+    </w:p>
+    <w:p>
+      <w:pPr>
+        <w:pStyle w:val="font-claude-response-body"/>
+      </w:pPr>
+      <w:r>
+        <w:rPr>
+          <w:rStyle w:val="Strong"/>
+        </w:rPr>
+        <w:t>Afternoon session — deviation from plan:</w:t>
+      </w:r>
+      <w:r>
+        <w:t xml:space="preserve"> Original plan had Monday as Week 2 start. </w:t>
+      </w:r>
+      <w:proofErr w:type="spellStart"/>
+      <w:r>
         <w:t>LLaVA</w:t>
       </w:r>
       <w:proofErr w:type="spellEnd"/>
       <w:r>
-        <w:rPr>
-          <w:b/>
-          <w:bCs/>
-        </w:rPr>
-        <w:t xml:space="preserve"> finished early afternoon so pushed into Week 2 bulk generation same day. Compute and time budget checked before starting.</w:t>
-      </w:r>
-    </w:p>
-    <w:p>
-      <w:pPr>
-        <w:spacing w:after="100" w:line="300" w:lineRule="auto"/>
-        <w:jc w:val="both"/>
-      </w:pPr>
-      <w:r>
-        <w:t xml:space="preserve">Week 2 batch prompts v1 frozen: 40 prompts across 8 categories (portrait, hands, </w:t>
+        <w:t xml:space="preserve"> finished early afternoon; pushed into Week 2 bulk generation same day. Ended up completing the full Week 2 open-weight corpus (120 videos across LTX, </w:t>
+      </w:r>
+      <w:proofErr w:type="spellStart"/>
+      <w:r>
+        <w:t>Hunyuan</w:t>
+      </w:r>
+      <w:proofErr w:type="spellEnd"/>
+      <w:r>
+        <w:t>, Wan) in a single day — three days ahead of Wednesday target.</w:t>
+      </w:r>
+    </w:p>
+    <w:p>
+      <w:pPr>
+        <w:pStyle w:val="font-claude-response-body"/>
+      </w:pPr>
+      <w:r>
+        <w:rPr>
+          <w:rStyle w:val="Strong"/>
+        </w:rPr>
+        <w:t>Week 2 batch prompts v1 frozen:</w:t>
+      </w:r>
+      <w:r>
+        <w:t xml:space="preserve"> 40 prompts across 8 categories (portrait, hands, </w:t>
       </w:r>
       <w:proofErr w:type="spellStart"/>
       <w:r>
@@ -2337,11 +2299,16 @@
     </w:p>
     <w:p>
       <w:pPr>
-        <w:spacing w:after="100" w:line="300" w:lineRule="auto"/>
-        <w:jc w:val="both"/>
-      </w:pPr>
-      <w:r>
-        <w:t>Storage architecture — personal Google Drive (paid 210 GB tier): All Week 2 outputs live on personal Drive at /content/drive/</w:t>
+        <w:pStyle w:val="font-claude-response-body"/>
+      </w:pPr>
+      <w:r>
+        <w:rPr>
+          <w:rStyle w:val="Strong"/>
+        </w:rPr>
+        <w:t>Storage architecture — personal Google Drive (paid 210 GB tier):</w:t>
+      </w:r>
+      <w:r>
+        <w:t xml:space="preserve"> All Week 2 outputs live on personal Drive at /content/drive/</w:t>
       </w:r>
       <w:proofErr w:type="spellStart"/>
       <w:r>
@@ -2357,36 +2324,53 @@
       </w:r>
       <w:proofErr w:type="spellEnd"/>
       <w:r>
-        <w:t xml:space="preserve">-deepfake/. Setup for shortcut into a separate 1 TB college Drive was investigated but not implemented today — files continued to write to personal Drive throughout the session. </w:t>
+        <w:t xml:space="preserve">-deepfake/. Setup for shortcut into a separate 1 TB college Drive was investigated but not implemented today — files continued to write to personal </w:t>
       </w:r>
       <w:r>
         <w:lastRenderedPageBreak/>
-        <w:t>Deferred college Drive migration to later — will move once Week 2 open-weight generation is complete or if personal Drive runs low on space. Sufficient headroom in personal Drive to complete Week 2.</w:t>
-      </w:r>
-    </w:p>
-    <w:p>
-      <w:pPr>
-        <w:spacing w:after="100" w:line="300" w:lineRule="auto"/>
-        <w:jc w:val="both"/>
-      </w:pPr>
-      <w:r>
+        <w:t>Drive throughout the session. Deferred college Drive migration to later. Sufficient headroom in personal Drive (~155 GB free) to complete Week 2.</w:t>
+      </w:r>
+    </w:p>
+    <w:p>
+      <w:pPr>
+        <w:pStyle w:val="font-claude-response-body"/>
+      </w:pPr>
+      <w:r>
+        <w:rPr>
+          <w:rStyle w:val="Strong"/>
+        </w:rPr>
         <w:t xml:space="preserve">Model weights on </w:t>
       </w:r>
       <w:proofErr w:type="spellStart"/>
       <w:r>
+        <w:rPr>
+          <w:rStyle w:val="Strong"/>
+        </w:rPr>
         <w:t>Colab</w:t>
       </w:r>
       <w:proofErr w:type="spellEnd"/>
       <w:r>
+        <w:rPr>
+          <w:rStyle w:val="Strong"/>
+        </w:rPr>
         <w:t xml:space="preserve"> local disk (/content/</w:t>
       </w:r>
       <w:proofErr w:type="spellStart"/>
       <w:r>
+        <w:rPr>
+          <w:rStyle w:val="Strong"/>
+        </w:rPr>
         <w:t>hf_cache</w:t>
       </w:r>
       <w:proofErr w:type="spellEnd"/>
       <w:r>
-        <w:t xml:space="preserve">/): After a hang attempting to load 27 GB LTX weights from Drive via FUSE mount, switched to </w:t>
+        <w:rPr>
+          <w:rStyle w:val="Strong"/>
+        </w:rPr>
+        <w:t>/):</w:t>
+      </w:r>
+      <w:r>
+        <w:t xml:space="preserve"> After a hang attempting to load 27 GB LTX weights from Drive via FUSE mount, switched to </w:t>
       </w:r>
       <w:proofErr w:type="spellStart"/>
       <w:r>
@@ -2394,23 +2378,44 @@
       </w:r>
       <w:proofErr w:type="spellEnd"/>
       <w:r>
-        <w:t xml:space="preserve"> local disk for weights. Fresh ~10-minute download per session accepted as trade-off. Generated videos still save to Drive.</w:t>
-      </w:r>
-    </w:p>
-    <w:p>
-      <w:pPr>
-        <w:spacing w:after="100" w:line="300" w:lineRule="auto"/>
-        <w:jc w:val="both"/>
-      </w:pPr>
-      <w:r>
-        <w:rPr>
-          <w:b/>
-          <w:bCs/>
-        </w:rPr>
-        <w:t>LTX-2.3 first batch (v1_FAILED, 40 videos)</w:t>
-      </w:r>
-      <w:r>
-        <w:t xml:space="preserve"> — silent failure due to missing pipeline parameters: Ran full 40-prompt batch with </w:t>
+        <w:t xml:space="preserve"> local disk for all model weights (LTX, </w:t>
+      </w:r>
+      <w:proofErr w:type="spellStart"/>
+      <w:r>
+        <w:t>HunyuanVideo</w:t>
+      </w:r>
+      <w:proofErr w:type="spellEnd"/>
+      <w:r>
+        <w:t>, Wan). Fresh ~10-</w:t>
+      </w:r>
+      <w:proofErr w:type="gramStart"/>
+      <w:r>
+        <w:t>15 minute</w:t>
+      </w:r>
+      <w:proofErr w:type="gramEnd"/>
+      <w:r>
+        <w:t xml:space="preserve"> download per generator per session accepted as trade-off. Generated videos and per-video metadata JSONs still save to Drive.</w:t>
+      </w:r>
+    </w:p>
+    <w:p>
+      <w:r>
+        <w:pict w14:anchorId="6206F48A">
+          <v:rect id="_x0000_i1152" style="width:0;height:1.5pt" o:hralign="center" o:hrstd="t" o:hr="t" fillcolor="#a0a0a0" stroked="f"/>
+        </w:pict>
+      </w:r>
+    </w:p>
+    <w:p>
+      <w:pPr>
+        <w:pStyle w:val="font-claude-response-body"/>
+      </w:pPr>
+      <w:r>
+        <w:rPr>
+          <w:rStyle w:val="Strong"/>
+        </w:rPr>
+        <w:t>LTX-2.3 first batch (v1_FAILED, 40 videos) — silent failure due to missing pipeline parameters:</w:t>
+      </w:r>
+      <w:r>
+        <w:t xml:space="preserve"> Ran full 40-prompt batch with </w:t>
       </w:r>
       <w:proofErr w:type="spellStart"/>
       <w:r>
@@ -2418,7 +2423,7 @@
       </w:r>
       <w:proofErr w:type="spellEnd"/>
       <w:r>
-        <w:t xml:space="preserve"> settings (768×512, 97 frames, 40 inference steps) but missing three parameters that Week 1's working notebook (01_ltx_setup_and_first_video.ipynb) had used: </w:t>
+        <w:t xml:space="preserve"> settings (768×512, 97 frames, 40 inference steps) but missing three parameters that Week 1's working notebook had used: </w:t>
       </w:r>
       <w:proofErr w:type="spellStart"/>
       <w:r>
@@ -2458,124 +2463,875 @@
       </w:r>
       <w:proofErr w:type="spellEnd"/>
       <w:r>
-        <w:t>/ltx_v1_FAILED/ as methodological evidence, not deleted.</w:t>
-      </w:r>
-    </w:p>
-    <w:p>
-      <w:pPr>
-        <w:spacing w:after="100" w:line="300" w:lineRule="auto"/>
-        <w:jc w:val="both"/>
-        <w:rPr>
-          <w:b/>
-          <w:bCs/>
-        </w:rPr>
-      </w:pPr>
-      <w:r>
-        <w:rPr>
-          <w:b/>
-          <w:bCs/>
+        <w:t>/ltx_v1_FAILED/ as methodological evidence.</w:t>
+      </w:r>
+    </w:p>
+    <w:p>
+      <w:pPr>
+        <w:pStyle w:val="font-claude-response-body"/>
+      </w:pPr>
+      <w:r>
+        <w:rPr>
+          <w:rStyle w:val="Strong"/>
         </w:rPr>
         <w:t>LTX-2.3 second batch (v2, 40 videos) — success:</w:t>
       </w:r>
       <w:r>
+        <w:t xml:space="preserve"> Regenerated on </w:t>
+      </w:r>
+      <w:proofErr w:type="spellStart"/>
+      <w:r>
+        <w:t>Colab</w:t>
+      </w:r>
+      <w:proofErr w:type="spellEnd"/>
+      <w:r>
+        <w:t xml:space="preserve"> L4 with Week 1-proven parameters:</w:t>
+      </w:r>
+    </w:p>
+    <w:p>
+      <w:pPr>
+        <w:pStyle w:val="font-claude-response-body"/>
+        <w:numPr>
+          <w:ilvl w:val="0"/>
+          <w:numId w:val="4"/>
+        </w:numPr>
+      </w:pPr>
+      <w:proofErr w:type="spellStart"/>
+      <w:r>
+        <w:t>negative_prompt</w:t>
+      </w:r>
+      <w:proofErr w:type="spellEnd"/>
+      <w:r>
+        <w:t xml:space="preserve"> = "blurry, low quality, distorted, unnatural, deformed, static, motion smear, garbled, artefacts, worst quality"</w:t>
+      </w:r>
+    </w:p>
+    <w:p>
+      <w:pPr>
+        <w:pStyle w:val="font-claude-response-body"/>
+        <w:numPr>
+          <w:ilvl w:val="0"/>
+          <w:numId w:val="4"/>
+        </w:numPr>
+      </w:pPr>
+      <w:proofErr w:type="spellStart"/>
+      <w:r>
+        <w:t>guidance_scale</w:t>
+      </w:r>
+      <w:proofErr w:type="spellEnd"/>
+      <w:r>
+        <w:t xml:space="preserve"> = 3.0</w:t>
+      </w:r>
+    </w:p>
+    <w:p>
+      <w:pPr>
+        <w:pStyle w:val="font-claude-response-body"/>
+        <w:numPr>
+          <w:ilvl w:val="0"/>
+          <w:numId w:val="4"/>
+        </w:numPr>
+      </w:pPr>
+      <w:r>
+        <w:t>generator seed = 42</w:t>
+      </w:r>
+    </w:p>
+    <w:p>
+      <w:pPr>
+        <w:pStyle w:val="font-claude-response-body"/>
+        <w:numPr>
+          <w:ilvl w:val="0"/>
+          <w:numId w:val="4"/>
+        </w:numPr>
+      </w:pPr>
+      <w:r>
+        <w:t>704×480 resolution</w:t>
+      </w:r>
+    </w:p>
+    <w:p>
+      <w:pPr>
+        <w:pStyle w:val="font-claude-response-body"/>
+        <w:numPr>
+          <w:ilvl w:val="0"/>
+          <w:numId w:val="4"/>
+        </w:numPr>
+      </w:pPr>
+      <w:r>
+        <w:t>73 frames at 24 fps (~3 seconds)</w:t>
+      </w:r>
+    </w:p>
+    <w:p>
+      <w:pPr>
+        <w:pStyle w:val="font-claude-response-body"/>
+        <w:numPr>
+          <w:ilvl w:val="0"/>
+          <w:numId w:val="4"/>
+        </w:numPr>
+      </w:pPr>
+      <w:r>
+        <w:t>30 inference steps</w:t>
+      </w:r>
+    </w:p>
+    <w:p>
+      <w:pPr>
+        <w:pStyle w:val="font-claude-response-body"/>
+        <w:numPr>
+          <w:ilvl w:val="0"/>
+          <w:numId w:val="4"/>
+        </w:numPr>
+      </w:pPr>
+      <w:r>
+        <w:t>Cinematographic suffix appended: ", natural lighting, cinematic quality, high detail, realistic"</w:t>
+      </w:r>
+    </w:p>
+    <w:p>
+      <w:pPr>
+        <w:pStyle w:val="font-claude-response-body"/>
+      </w:pPr>
+      <w:r>
+        <w:t xml:space="preserve">Sanity-checked single video against Week 1 baseline before batching. Ran full batch. Result: 40/40 videos generated successfully. Compute cost minimal — L4 is roughly 0.5 units/hour on </w:t>
+      </w:r>
+      <w:proofErr w:type="spellStart"/>
+      <w:r>
+        <w:t>Colab</w:t>
+      </w:r>
+      <w:proofErr w:type="spellEnd"/>
+      <w:r>
+        <w:t xml:space="preserve"> Pro. Saved to </w:t>
+      </w:r>
+      <w:proofErr w:type="spellStart"/>
+      <w:r>
+        <w:t>msc</w:t>
+      </w:r>
+      <w:proofErr w:type="spellEnd"/>
+      <w:r>
+        <w:t>-deepfake/</w:t>
+      </w:r>
+      <w:proofErr w:type="spellStart"/>
+      <w:r>
+        <w:t>generated_videos</w:t>
+      </w:r>
+      <w:proofErr w:type="spellEnd"/>
+      <w:r>
+        <w:t>/</w:t>
+      </w:r>
+      <w:proofErr w:type="spellStart"/>
+      <w:r>
+        <w:t>ltx</w:t>
+      </w:r>
+      <w:proofErr w:type="spellEnd"/>
+      <w:r>
+        <w:t>/.</w:t>
+      </w:r>
+    </w:p>
+    <w:p>
+      <w:r>
+        <w:pict w14:anchorId="3FE0315E">
+          <v:rect id="_x0000_i1153" style="width:0;height:1.5pt" o:hralign="center" o:hrstd="t" o:hr="t" fillcolor="#a0a0a0" stroked="f"/>
+        </w:pict>
+      </w:r>
+    </w:p>
+    <w:p>
+      <w:pPr>
+        <w:pStyle w:val="font-claude-response-body"/>
+      </w:pPr>
+      <w:proofErr w:type="spellStart"/>
+      <w:r>
+        <w:rPr>
+          <w:rStyle w:val="Strong"/>
+        </w:rPr>
+        <w:t>HunyuanVideo</w:t>
+      </w:r>
+      <w:proofErr w:type="spellEnd"/>
+      <w:r>
+        <w:rPr>
+          <w:rStyle w:val="Strong"/>
+        </w:rPr>
+        <w:t xml:space="preserve"> bulk generation — 40 videos complete on </w:t>
+      </w:r>
+      <w:proofErr w:type="spellStart"/>
+      <w:r>
+        <w:rPr>
+          <w:rStyle w:val="Strong"/>
+        </w:rPr>
+        <w:t>Colab</w:t>
+      </w:r>
+      <w:proofErr w:type="spellEnd"/>
+      <w:r>
+        <w:rPr>
+          <w:rStyle w:val="Strong"/>
+        </w:rPr>
+        <w:t xml:space="preserve"> A100:</w:t>
+      </w:r>
+      <w:r>
+        <w:t xml:space="preserve"> Used </w:t>
+      </w:r>
+      <w:proofErr w:type="spellStart"/>
+      <w:r>
+        <w:t>hunyuanvideo</w:t>
+      </w:r>
+      <w:proofErr w:type="spellEnd"/>
+      <w:r>
+        <w:t>-community/</w:t>
+      </w:r>
+      <w:proofErr w:type="spellStart"/>
+      <w:r>
+        <w:t>HunyuanVideo</w:t>
+      </w:r>
+      <w:proofErr w:type="spellEnd"/>
+      <w:r>
+        <w:t xml:space="preserve"> with </w:t>
+      </w:r>
+      <w:proofErr w:type="spellStart"/>
+      <w:r>
+        <w:t>HunyuanVideoPipeline</w:t>
+      </w:r>
+      <w:proofErr w:type="spellEnd"/>
+      <w:r>
+        <w:t xml:space="preserve"> + HunyuanVideoTransformer3DModel. Parameters: 480×704 resolution, 73 frames at 24 fps (~3 sec), </w:t>
+      </w:r>
+      <w:proofErr w:type="spellStart"/>
+      <w:r>
+        <w:t>guidance_scale</w:t>
+      </w:r>
+      <w:proofErr w:type="spellEnd"/>
+      <w:r>
+        <w:t xml:space="preserve">=6.0, seed=42, bfloat16, no </w:t>
+      </w:r>
+      <w:proofErr w:type="spellStart"/>
+      <w:r>
+        <w:t>negative_prompt</w:t>
+      </w:r>
+      <w:proofErr w:type="spellEnd"/>
+      <w:r>
+        <w:t xml:space="preserve"> (</w:t>
+      </w:r>
+      <w:proofErr w:type="spellStart"/>
+      <w:r>
+        <w:t>Hunyuan</w:t>
+      </w:r>
+      <w:proofErr w:type="spellEnd"/>
+      <w:r>
+        <w:t xml:space="preserve"> community model does not use one). Reduced inference steps from Week 1's 30 to 20 for compute efficiency. VAE tiling and slicing enabled for memory. Cinematographic suffix appended to each prompt.</w:t>
+      </w:r>
+    </w:p>
+    <w:p>
+      <w:pPr>
+        <w:pStyle w:val="font-claude-response-body"/>
+      </w:pPr>
+      <w:r>
+        <w:t xml:space="preserve">Second batch of 5 hit a hard failure — attempted to add Flash Attention 2 (AttnProcessor2_0) and </w:t>
+      </w:r>
+      <w:proofErr w:type="spellStart"/>
+      <w:r>
+        <w:t>torch.compile</w:t>
+      </w:r>
+      <w:proofErr w:type="spellEnd"/>
+      <w:r>
+        <w:t xml:space="preserve"> as speedup optimisations. Five consecutive videos threw Dynamo </w:t>
+      </w:r>
+      <w:proofErr w:type="spellStart"/>
+      <w:r>
+        <w:t>fake_tensor</w:t>
+      </w:r>
+      <w:proofErr w:type="spellEnd"/>
+      <w:r>
+        <w:t xml:space="preserve"> errors ("expand: attempting to expand a dimension of length 25592 -&gt; 256") and AttnProcessor2_0 was incompatible with </w:t>
+      </w:r>
+      <w:proofErr w:type="spellStart"/>
+      <w:r>
+        <w:t>HunyuanVideo's</w:t>
+      </w:r>
+      <w:proofErr w:type="spellEnd"/>
+      <w:r>
         <w:t xml:space="preserve"> </w:t>
       </w:r>
-      <w:r>
-        <w:rPr>
-          <w:b/>
-          <w:bCs/>
-        </w:rPr>
-        <w:t>Regenerated with Week 1-proven parameters:</w:t>
-      </w:r>
-    </w:p>
-    <w:p>
-      <w:pPr>
-        <w:spacing w:after="100" w:line="300" w:lineRule="auto"/>
-        <w:jc w:val="both"/>
-      </w:pPr>
+      <w:proofErr w:type="spellStart"/>
+      <w:r>
+        <w:t>image_rotary_emb</w:t>
+      </w:r>
+      <w:proofErr w:type="spellEnd"/>
+      <w:r>
+        <w:t xml:space="preserve"> </w:t>
+      </w:r>
+      <w:proofErr w:type="spellStart"/>
+      <w:r>
+        <w:t>cross_attention_kwargs</w:t>
+      </w:r>
+      <w:proofErr w:type="spellEnd"/>
+      <w:r>
+        <w:t>. Restarted runtime, reverted to clean bfloat16 without either optimisation. Batch succeeded. Full 40 videos generated.</w:t>
+      </w:r>
+    </w:p>
+    <w:p>
+      <w:pPr>
+        <w:pStyle w:val="font-claude-response-body"/>
+      </w:pPr>
+      <w:r>
+        <w:t xml:space="preserve">Methodological note: initial 6 videos generated at 30 steps before switching to 20 for the remainder. Regenerated the earlier 6 at 20 steps for dataset uniformity. Final dataset: 40 videos all at 20 steps, </w:t>
+      </w:r>
+      <w:r>
+        <w:lastRenderedPageBreak/>
+        <w:t xml:space="preserve">consistent parameters. Saved to </w:t>
+      </w:r>
+      <w:proofErr w:type="spellStart"/>
+      <w:r>
+        <w:t>msc</w:t>
+      </w:r>
+      <w:proofErr w:type="spellEnd"/>
+      <w:r>
+        <w:t>-deepfake/</w:t>
+      </w:r>
+      <w:proofErr w:type="spellStart"/>
+      <w:r>
+        <w:t>generated_videos</w:t>
+      </w:r>
+      <w:proofErr w:type="spellEnd"/>
+      <w:r>
+        <w:t>/</w:t>
+      </w:r>
+      <w:proofErr w:type="spellStart"/>
+      <w:r>
+        <w:t>hunyuan</w:t>
+      </w:r>
+      <w:proofErr w:type="spellEnd"/>
+      <w:r>
+        <w:t xml:space="preserve">/ with per-video metadata JSONs in </w:t>
+      </w:r>
+      <w:proofErr w:type="spellStart"/>
+      <w:r>
+        <w:t>msc</w:t>
+      </w:r>
+      <w:proofErr w:type="spellEnd"/>
+      <w:r>
+        <w:t>-deepfake/metadata/</w:t>
+      </w:r>
+      <w:proofErr w:type="spellStart"/>
+      <w:r>
+        <w:t>hunyuan</w:t>
+      </w:r>
+      <w:proofErr w:type="spellEnd"/>
+      <w:r>
+        <w:t>/.</w:t>
+      </w:r>
+    </w:p>
+    <w:p>
+      <w:r>
+        <w:pict w14:anchorId="16D2B7D2">
+          <v:rect id="_x0000_i1154" style="width:0;height:1.5pt" o:hralign="center" o:hrstd="t" o:hr="t" fillcolor="#a0a0a0" stroked="f"/>
+        </w:pict>
+      </w:r>
+    </w:p>
+    <w:p>
+      <w:pPr>
+        <w:pStyle w:val="font-claude-response-body"/>
+      </w:pPr>
+      <w:r>
+        <w:rPr>
+          <w:rStyle w:val="Strong"/>
+        </w:rPr>
+        <w:t xml:space="preserve">Wan 2.2 T2V-A14B bulk generation — 40 videos complete on </w:t>
+      </w:r>
+      <w:proofErr w:type="spellStart"/>
+      <w:r>
+        <w:rPr>
+          <w:rStyle w:val="Strong"/>
+        </w:rPr>
+        <w:t>Colab</w:t>
+      </w:r>
+      <w:proofErr w:type="spellEnd"/>
+      <w:r>
+        <w:rPr>
+          <w:rStyle w:val="Strong"/>
+        </w:rPr>
+        <w:t xml:space="preserve"> A100:</w:t>
+      </w:r>
+      <w:r>
+        <w:t xml:space="preserve"> Used Wan-AI/Wan2.2-T2V-A14B-Diffusers with </w:t>
+      </w:r>
+      <w:proofErr w:type="spellStart"/>
+      <w:r>
+        <w:t>WanPipeline</w:t>
+      </w:r>
+      <w:proofErr w:type="spellEnd"/>
+      <w:r>
+        <w:t>. Native parameters: 480×832 resolution, 81 frames at 16 fps (~5 seconds — differs from LTX/</w:t>
+      </w:r>
+      <w:proofErr w:type="spellStart"/>
+      <w:r>
+        <w:t>Hunyuan's</w:t>
+      </w:r>
+      <w:proofErr w:type="spellEnd"/>
+      <w:r>
+        <w:t xml:space="preserve"> ~3 sec), </w:t>
+      </w:r>
+      <w:proofErr w:type="spellStart"/>
+      <w:r>
+        <w:t>guidance_scale</w:t>
+      </w:r>
+      <w:proofErr w:type="spellEnd"/>
+      <w:r>
+        <w:t xml:space="preserve">=5.0, seed=42, bfloat16, </w:t>
+      </w:r>
       <w:proofErr w:type="spellStart"/>
       <w:r>
         <w:t>negative_prompt</w:t>
       </w:r>
       <w:proofErr w:type="spellEnd"/>
       <w:r>
-        <w:t xml:space="preserve"> = "blurry, low quality, distorted, unnatural, deformed, static, motion smear, garbled, artefacts, worst quality"</w:t>
-      </w:r>
-    </w:p>
-    <w:p>
-      <w:pPr>
-        <w:spacing w:after="100" w:line="300" w:lineRule="auto"/>
-        <w:jc w:val="both"/>
-      </w:pPr>
+        <w:t>="blurry, low quality, distorted, unnatural, deformed". VAE tiling and slicing enabled.</w:t>
+      </w:r>
+    </w:p>
+    <w:p>
+      <w:pPr>
+        <w:pStyle w:val="font-claude-response-body"/>
+      </w:pPr>
+      <w:r>
+        <w:t xml:space="preserve">First attempt at 20 inference steps produced degenerate output — only eye movements visible, no scene coherence. Wan's architecture requires more inference steps than LTX or </w:t>
+      </w:r>
+      <w:proofErr w:type="spellStart"/>
+      <w:r>
+        <w:t>Hunyuan</w:t>
+      </w:r>
+      <w:proofErr w:type="spellEnd"/>
+      <w:r>
+        <w:t>. Bumped to 25 steps for second attempt: sanity check confirmed recognisable scenes with typical AI artefacts. Batch of 40 completed successfully at 25 steps.</w:t>
+      </w:r>
+    </w:p>
+    <w:p>
+      <w:pPr>
+        <w:pStyle w:val="font-claude-response-body"/>
+      </w:pPr>
+      <w:r>
+        <w:t>Considered forcing 49 frames at 16 fps to match LTX/</w:t>
+      </w:r>
+      <w:proofErr w:type="spellStart"/>
+      <w:r>
+        <w:t>Hunyuan's</w:t>
+      </w:r>
+      <w:proofErr w:type="spellEnd"/>
+      <w:r>
+        <w:t xml:space="preserve"> 3-sec duration but kept Wan's native 81 frames because: (a) Wan wasn't trained at non-native frame counts and would risk degraded output, (b) frame extraction methodology in analysis pipeline (6 evenly-spaced frames per video) normalises across durations. Saved to </w:t>
+      </w:r>
+      <w:proofErr w:type="spellStart"/>
+      <w:r>
+        <w:t>msc</w:t>
+      </w:r>
+      <w:proofErr w:type="spellEnd"/>
+      <w:r>
+        <w:t>-deepfake/</w:t>
+      </w:r>
+      <w:proofErr w:type="spellStart"/>
+      <w:r>
+        <w:t>generated_videos</w:t>
+      </w:r>
+      <w:proofErr w:type="spellEnd"/>
+      <w:r>
+        <w:t xml:space="preserve">/wan/ with per-video metadata JSONs in </w:t>
+      </w:r>
+      <w:proofErr w:type="spellStart"/>
+      <w:r>
+        <w:t>msc</w:t>
+      </w:r>
+      <w:proofErr w:type="spellEnd"/>
+      <w:r>
+        <w:t>-deepfake/metadata/wan/.</w:t>
+      </w:r>
+    </w:p>
+    <w:p>
+      <w:r>
+        <w:pict w14:anchorId="2CE2B082">
+          <v:rect id="_x0000_i1155" style="width:0;height:1.5pt" o:hralign="center" o:hrstd="t" o:hr="t" fillcolor="#a0a0a0" stroked="f"/>
+        </w:pict>
+      </w:r>
+    </w:p>
+    <w:p>
+      <w:pPr>
+        <w:pStyle w:val="font-claude-response-body"/>
+      </w:pPr>
+      <w:r>
+        <w:rPr>
+          <w:rStyle w:val="Strong"/>
+        </w:rPr>
+        <w:t>Methodological findings documented today (five, all for Methodology chapter):</w:t>
+      </w:r>
+    </w:p>
+    <w:p>
+      <w:pPr>
+        <w:pStyle w:val="font-claude-response-body"/>
+        <w:numPr>
+          <w:ilvl w:val="0"/>
+          <w:numId w:val="5"/>
+        </w:numPr>
+      </w:pPr>
+      <w:r>
+        <w:rPr>
+          <w:rStyle w:val="Strong"/>
+        </w:rPr>
+        <w:t>LLaVA-1.6 requires per-model prompt variant and (verdict, confidence, observations) output shape</w:t>
+      </w:r>
+      <w:r>
+        <w:t xml:space="preserve"> — smaller MLLMs need forensic-examiner framing; numeric ratings unreliable regardless of prompt.</w:t>
+      </w:r>
+    </w:p>
+    <w:p>
+      <w:pPr>
+        <w:pStyle w:val="font-claude-response-body"/>
+        <w:numPr>
+          <w:ilvl w:val="0"/>
+          <w:numId w:val="5"/>
+        </w:numPr>
+      </w:pPr>
+      <w:proofErr w:type="spellStart"/>
+      <w:r>
+        <w:rPr>
+          <w:rStyle w:val="Strong"/>
+        </w:rPr>
+        <w:t>Colab</w:t>
+      </w:r>
+      <w:proofErr w:type="spellEnd"/>
+      <w:r>
+        <w:rPr>
+          <w:rStyle w:val="Strong"/>
+        </w:rPr>
+        <w:t xml:space="preserve"> Drive mount unreliable for large </w:t>
+      </w:r>
+      <w:proofErr w:type="spellStart"/>
+      <w:r>
+        <w:rPr>
+          <w:rStyle w:val="Strong"/>
+        </w:rPr>
+        <w:t>safetensors</w:t>
+      </w:r>
+      <w:proofErr w:type="spellEnd"/>
+      <w:r>
+        <w:rPr>
+          <w:rStyle w:val="Strong"/>
+        </w:rPr>
+        <w:t xml:space="preserve"> reads</w:t>
+      </w:r>
+      <w:r>
+        <w:t xml:space="preserve"> — FUSE cannot handle 27+ GB sequential reads for model loading. </w:t>
+      </w:r>
+      <w:proofErr w:type="spellStart"/>
+      <w:r>
+        <w:t>Colab</w:t>
+      </w:r>
+      <w:proofErr w:type="spellEnd"/>
+      <w:r>
+        <w:t xml:space="preserve"> local disk required.</w:t>
+      </w:r>
+    </w:p>
+    <w:p>
+      <w:pPr>
+        <w:pStyle w:val="font-claude-response-body"/>
+        <w:numPr>
+          <w:ilvl w:val="0"/>
+          <w:numId w:val="5"/>
+        </w:numPr>
+      </w:pPr>
+      <w:r>
+        <w:rPr>
+          <w:rStyle w:val="Strong"/>
+        </w:rPr>
+        <w:t>T2V silent-failure risk from missing pipeline parameters</w:t>
+      </w:r>
+      <w:r>
+        <w:t xml:space="preserve"> — LTX-Video produces garbled output without </w:t>
+      </w:r>
+      <w:proofErr w:type="spellStart"/>
+      <w:r>
+        <w:t>negative_prompt</w:t>
+      </w:r>
+      <w:proofErr w:type="spellEnd"/>
+      <w:r>
+        <w:t xml:space="preserve"> and </w:t>
+      </w:r>
       <w:proofErr w:type="spellStart"/>
       <w:r>
         <w:t>guidance_scale</w:t>
       </w:r>
       <w:proofErr w:type="spellEnd"/>
       <w:r>
-        <w:t xml:space="preserve"> = 3.0</w:t>
-      </w:r>
-    </w:p>
-    <w:p>
-      <w:pPr>
-        <w:spacing w:after="100" w:line="300" w:lineRule="auto"/>
-        <w:jc w:val="both"/>
-      </w:pPr>
-      <w:r>
-        <w:t>generator seed = 42</w:t>
-      </w:r>
-    </w:p>
-    <w:p>
-      <w:pPr>
-        <w:spacing w:after="100" w:line="300" w:lineRule="auto"/>
-        <w:jc w:val="both"/>
-      </w:pPr>
-      <w:r>
-        <w:t>704×480 resolution</w:t>
-      </w:r>
-    </w:p>
-    <w:p>
-      <w:pPr>
-        <w:spacing w:after="100" w:line="300" w:lineRule="auto"/>
-        <w:jc w:val="both"/>
-      </w:pPr>
-      <w:r>
-        <w:t>73 frames at 24 fps (~3 seconds)</w:t>
-      </w:r>
-    </w:p>
-    <w:p>
-      <w:pPr>
-        <w:spacing w:after="100" w:line="300" w:lineRule="auto"/>
-        <w:jc w:val="both"/>
-      </w:pPr>
-      <w:r>
-        <w:t>30 inference steps</w:t>
-      </w:r>
-    </w:p>
-    <w:p>
-      <w:pPr>
-        <w:spacing w:after="100" w:line="300" w:lineRule="auto"/>
-        <w:jc w:val="both"/>
-      </w:pPr>
-      <w:r>
-        <w:t>Cinematographic suffix appended to each prompt: ", natural lighting, cinematic quality, high detail, realistic"</w:t>
-      </w:r>
-    </w:p>
-    <w:p>
-      <w:pPr>
-        <w:spacing w:after="100" w:line="300" w:lineRule="auto"/>
-        <w:jc w:val="both"/>
-      </w:pPr>
-      <w:r>
-        <w:rPr>
-          <w:b/>
-          <w:bCs/>
-        </w:rPr>
-        <w:t>Sanity-checked single video against Week 1 baseline before batching; quality confirmed comparable.</w:t>
-      </w:r>
-      <w:r>
-        <w:t xml:space="preserve"> Ran full batch. Result: 40/40 videos generated successfully. All videos saved to </w:t>
-      </w:r>
+        <w:t xml:space="preserve">, with no exception raised. Full parameter </w:t>
+      </w:r>
+      <w:proofErr w:type="spellStart"/>
+      <w:r>
+        <w:t>dict</w:t>
+      </w:r>
+      <w:proofErr w:type="spellEnd"/>
+      <w:r>
+        <w:t xml:space="preserve"> logged per video going forward.</w:t>
+      </w:r>
+    </w:p>
+    <w:p>
+      <w:pPr>
+        <w:pStyle w:val="font-claude-response-body"/>
+        <w:numPr>
+          <w:ilvl w:val="0"/>
+          <w:numId w:val="5"/>
+        </w:numPr>
+      </w:pPr>
+      <w:r>
+        <w:rPr>
+          <w:rStyle w:val="Strong"/>
+        </w:rPr>
+        <w:t>Pipeline optimisations don't transfer across T2V architectures</w:t>
+      </w:r>
+      <w:r>
+        <w:t xml:space="preserve"> — Flash Attention 2 and </w:t>
+      </w:r>
+      <w:proofErr w:type="spellStart"/>
+      <w:r>
+        <w:t>torch.compile</w:t>
+      </w:r>
+      <w:proofErr w:type="spellEnd"/>
+      <w:r>
+        <w:t xml:space="preserve"> work for LTX but break </w:t>
+      </w:r>
+      <w:proofErr w:type="spellStart"/>
+      <w:r>
+        <w:t>HunyuanVideo</w:t>
+      </w:r>
+      <w:proofErr w:type="spellEnd"/>
+      <w:r>
+        <w:t xml:space="preserve"> due to architecture-specific attention layers (</w:t>
+      </w:r>
+      <w:proofErr w:type="spellStart"/>
+      <w:r>
+        <w:t>image_rotary_emb</w:t>
+      </w:r>
+      <w:proofErr w:type="spellEnd"/>
+      <w:r>
+        <w:t xml:space="preserve"> handling). Cannot assume optimisation portability.</w:t>
+      </w:r>
+    </w:p>
+    <w:p>
+      <w:pPr>
+        <w:pStyle w:val="font-claude-response-body"/>
+        <w:numPr>
+          <w:ilvl w:val="0"/>
+          <w:numId w:val="5"/>
+        </w:numPr>
+      </w:pPr>
+      <w:r>
+        <w:rPr>
+          <w:rStyle w:val="Strong"/>
+        </w:rPr>
+        <w:t>Inference step counts must be tuned per generator</w:t>
+      </w:r>
+      <w:r>
+        <w:t xml:space="preserve"> — LTX works at 30, </w:t>
+      </w:r>
+      <w:proofErr w:type="spellStart"/>
+      <w:r>
+        <w:t>Hunyuan</w:t>
+      </w:r>
+      <w:proofErr w:type="spellEnd"/>
+      <w:r>
+        <w:t xml:space="preserve"> works at 20, Wan requires 25 minimum. Reducing below the model-specific threshold produces unusable output, not just lower quality.</w:t>
+      </w:r>
+    </w:p>
+    <w:p>
+      <w:r>
+        <w:pict w14:anchorId="0F9A2E11">
+          <v:rect id="_x0000_i1156" style="width:0;height:1.5pt" o:hralign="center" o:hrstd="t" o:hr="t" fillcolor="#a0a0a0" stroked="f"/>
+        </w:pict>
+      </w:r>
+    </w:p>
+    <w:p>
+      <w:pPr>
+        <w:pStyle w:val="font-claude-response-body"/>
+      </w:pPr>
+      <w:r>
+        <w:rPr>
+          <w:rStyle w:val="Strong"/>
+        </w:rPr>
+        <w:t>Compute usage (Sunday total):</w:t>
+      </w:r>
+    </w:p>
+    <w:p>
+      <w:pPr>
+        <w:pStyle w:val="font-claude-response-body"/>
+        <w:numPr>
+          <w:ilvl w:val="0"/>
+          <w:numId w:val="6"/>
+        </w:numPr>
+      </w:pPr>
+      <w:proofErr w:type="spellStart"/>
+      <w:r>
+        <w:t>Colab</w:t>
+      </w:r>
+      <w:proofErr w:type="spellEnd"/>
+      <w:r>
+        <w:t xml:space="preserve"> units at start of Sunday: 92.70</w:t>
+      </w:r>
+    </w:p>
+    <w:p>
+      <w:pPr>
+        <w:pStyle w:val="font-claude-response-body"/>
+        <w:numPr>
+          <w:ilvl w:val="0"/>
+          <w:numId w:val="6"/>
+        </w:numPr>
+      </w:pPr>
+      <w:proofErr w:type="spellStart"/>
+      <w:r>
+        <w:t>Colab</w:t>
+      </w:r>
+      <w:proofErr w:type="spellEnd"/>
+      <w:r>
+        <w:t xml:space="preserve"> units at end of Sunday: 50.69</w:t>
+      </w:r>
+    </w:p>
+    <w:p>
+      <w:pPr>
+        <w:pStyle w:val="font-claude-response-body"/>
+        <w:numPr>
+          <w:ilvl w:val="0"/>
+          <w:numId w:val="6"/>
+        </w:numPr>
+      </w:pPr>
+      <w:r>
+        <w:t xml:space="preserve">Total consumed: 42.01 units (LTX v1_FAILED batch + LTX v2 batch on L4; </w:t>
+      </w:r>
+      <w:proofErr w:type="spellStart"/>
+      <w:r>
+        <w:t>Hunyuan</w:t>
+      </w:r>
+      <w:proofErr w:type="spellEnd"/>
+      <w:r>
+        <w:t xml:space="preserve"> bulk + Wan bulk on A100)</w:t>
+      </w:r>
+    </w:p>
+    <w:p>
+      <w:pPr>
+        <w:pStyle w:val="font-claude-response-body"/>
+        <w:numPr>
+          <w:ilvl w:val="0"/>
+          <w:numId w:val="6"/>
+        </w:numPr>
+      </w:pPr>
+      <w:r>
+        <w:t>Kaggle T4 hours consumed (</w:t>
+      </w:r>
+      <w:proofErr w:type="spellStart"/>
+      <w:r>
+        <w:t>LLaVA</w:t>
+      </w:r>
+      <w:proofErr w:type="spellEnd"/>
+      <w:r>
+        <w:t xml:space="preserve"> morning session): [</w:t>
+      </w:r>
+      <w:r>
+        <w:t>22 hours left</w:t>
+      </w:r>
+      <w:r>
+        <w:t xml:space="preserve"> Kaggle]</w:t>
+      </w:r>
+    </w:p>
+    <w:p>
+      <w:pPr>
+        <w:pStyle w:val="font-claude-response-body"/>
+        <w:rPr>
+          <w:rStyle w:val="Strong"/>
+        </w:rPr>
+      </w:pPr>
+    </w:p>
+    <w:p>
+      <w:pPr>
+        <w:pStyle w:val="font-claude-response-body"/>
+      </w:pPr>
+      <w:r>
+        <w:rPr>
+          <w:rStyle w:val="Strong"/>
+        </w:rPr>
+        <w:lastRenderedPageBreak/>
+        <w:t>Files added/updated today:</w:t>
+      </w:r>
+    </w:p>
+    <w:p>
+      <w:pPr>
+        <w:pStyle w:val="font-claude-response-body"/>
+        <w:numPr>
+          <w:ilvl w:val="0"/>
+          <w:numId w:val="7"/>
+        </w:numPr>
+      </w:pPr>
+      <w:r>
+        <w:t>code/analysis/05_llava16_kaggle.ipynb</w:t>
+      </w:r>
+    </w:p>
+    <w:p>
+      <w:pPr>
+        <w:pStyle w:val="font-claude-response-body"/>
+        <w:numPr>
+          <w:ilvl w:val="0"/>
+          <w:numId w:val="7"/>
+        </w:numPr>
+      </w:pPr>
+      <w:r>
+        <w:t>code/analysis/06_bulk_generation_ltx.ipynb</w:t>
+      </w:r>
+    </w:p>
+    <w:p>
+      <w:pPr>
+        <w:pStyle w:val="font-claude-response-body"/>
+        <w:numPr>
+          <w:ilvl w:val="0"/>
+          <w:numId w:val="7"/>
+        </w:numPr>
+      </w:pPr>
+      <w:r>
+        <w:t>code/analysis/07_bulk_generation_hunyuan.ipynb</w:t>
+      </w:r>
+    </w:p>
+    <w:p>
+      <w:pPr>
+        <w:pStyle w:val="font-claude-response-body"/>
+        <w:numPr>
+          <w:ilvl w:val="0"/>
+          <w:numId w:val="7"/>
+        </w:numPr>
+      </w:pPr>
+      <w:r>
+        <w:t>code/analysis/08_bulk_generation_wan.ipynb</w:t>
+      </w:r>
+    </w:p>
+    <w:p>
+      <w:pPr>
+        <w:pStyle w:val="font-claude-response-body"/>
+        <w:numPr>
+          <w:ilvl w:val="0"/>
+          <w:numId w:val="7"/>
+        </w:numPr>
+      </w:pPr>
+      <w:r>
+        <w:t>corpus/</w:t>
+      </w:r>
+      <w:proofErr w:type="spellStart"/>
+      <w:r>
+        <w:t>mllm_outputs</w:t>
+      </w:r>
+      <w:proofErr w:type="spellEnd"/>
+      <w:r>
+        <w:t>/</w:t>
+      </w:r>
+      <w:proofErr w:type="spellStart"/>
+      <w:r>
+        <w:t>llava</w:t>
+      </w:r>
+      <w:proofErr w:type="spellEnd"/>
+      <w:r>
+        <w:t>/ (v2_perframe files + FAILED evidence file)</w:t>
+      </w:r>
+    </w:p>
+    <w:p>
+      <w:pPr>
+        <w:pStyle w:val="font-claude-response-body"/>
+        <w:numPr>
+          <w:ilvl w:val="0"/>
+          <w:numId w:val="7"/>
+        </w:numPr>
+      </w:pPr>
       <w:proofErr w:type="spellStart"/>
       <w:r>
         <w:t>msc</w:t>
@@ -2586,6 +3342,31 @@
       </w:r>
       <w:proofErr w:type="spellStart"/>
       <w:r>
+        <w:t>batch_prompts</w:t>
+      </w:r>
+      <w:proofErr w:type="spellEnd"/>
+      <w:r>
+        <w:t>/week2_prompts_v1.txt (personal Drive)</w:t>
+      </w:r>
+    </w:p>
+    <w:p>
+      <w:pPr>
+        <w:pStyle w:val="font-claude-response-body"/>
+        <w:numPr>
+          <w:ilvl w:val="0"/>
+          <w:numId w:val="7"/>
+        </w:numPr>
+      </w:pPr>
+      <w:proofErr w:type="spellStart"/>
+      <w:r>
+        <w:t>msc</w:t>
+      </w:r>
+      <w:proofErr w:type="spellEnd"/>
+      <w:r>
+        <w:t>-deepfake/</w:t>
+      </w:r>
+      <w:proofErr w:type="spellStart"/>
+      <w:r>
         <w:t>generated_videos</w:t>
       </w:r>
       <w:proofErr w:type="spellEnd"/>
@@ -2598,63 +3379,171 @@
       </w:r>
       <w:proofErr w:type="spellEnd"/>
       <w:r>
-        <w:t>/.</w:t>
-      </w:r>
-    </w:p>
-    <w:p>
-      <w:pPr>
-        <w:spacing w:after="100" w:line="300" w:lineRule="auto"/>
-        <w:jc w:val="both"/>
-      </w:pPr>
-      <w:r>
-        <w:rPr>
-          <w:b/>
-          <w:bCs/>
-        </w:rPr>
-        <w:t xml:space="preserve">Methodological finding </w:t>
-      </w:r>
-      <w:r>
-        <w:t xml:space="preserve">— silent-failure risk in T2V pipelines: Missing </w:t>
-      </w:r>
-      <w:proofErr w:type="spellStart"/>
-      <w:r>
-        <w:t>negative_prompt</w:t>
-      </w:r>
-      <w:proofErr w:type="spellEnd"/>
-      <w:r>
-        <w:t xml:space="preserve"> or </w:t>
-      </w:r>
-      <w:proofErr w:type="spellStart"/>
-      <w:r>
-        <w:t>guidance_scale</w:t>
-      </w:r>
-      <w:proofErr w:type="spellEnd"/>
-      <w:r>
-        <w:t xml:space="preserve"> in LTX-Video produces silently-broken output — no exception, no warning, just garbled videos. This is a real reproducibility risk: bulk T2V generation cannot rely on defaults being sensible. Going forward, every generation call will be accompanied by a parameter dictionary logged to a metadata JSON alongside the video file, so any future re-run can reproduce exactly. This convention will be applied to </w:t>
-      </w:r>
-      <w:proofErr w:type="spellStart"/>
-      <w:r>
-        <w:t>HunyuanVideo</w:t>
-      </w:r>
-      <w:proofErr w:type="spellEnd"/>
-      <w:r>
-        <w:t xml:space="preserve"> and Wan 2.2 batches starting Monday.</w:t>
-      </w:r>
-    </w:p>
-    <w:p>
-      <w:pPr>
-        <w:spacing w:after="100" w:line="300" w:lineRule="auto"/>
-        <w:jc w:val="both"/>
-      </w:pPr>
-      <w:r>
-        <w:rPr>
-          <w:b/>
-          <w:bCs/>
-        </w:rPr>
-        <w:t>Compute reality —</w:t>
-      </w:r>
-      <w:r>
-        <w:t xml:space="preserve"> L4 significantly cheaper than expected: </w:t>
+        <w:t>/ (40 videos)</w:t>
+      </w:r>
+    </w:p>
+    <w:p>
+      <w:pPr>
+        <w:pStyle w:val="font-claude-response-body"/>
+        <w:numPr>
+          <w:ilvl w:val="0"/>
+          <w:numId w:val="7"/>
+        </w:numPr>
+      </w:pPr>
+      <w:proofErr w:type="spellStart"/>
+      <w:r>
+        <w:t>msc</w:t>
+      </w:r>
+      <w:proofErr w:type="spellEnd"/>
+      <w:r>
+        <w:t>-deepfake/</w:t>
+      </w:r>
+      <w:proofErr w:type="spellStart"/>
+      <w:r>
+        <w:t>generated_videos</w:t>
+      </w:r>
+      <w:proofErr w:type="spellEnd"/>
+      <w:r>
+        <w:t>/ltx_v1_FAILED/ (40 evidence videos)</w:t>
+      </w:r>
+    </w:p>
+    <w:p>
+      <w:pPr>
+        <w:pStyle w:val="font-claude-response-body"/>
+        <w:numPr>
+          <w:ilvl w:val="0"/>
+          <w:numId w:val="7"/>
+        </w:numPr>
+      </w:pPr>
+      <w:proofErr w:type="spellStart"/>
+      <w:r>
+        <w:t>msc</w:t>
+      </w:r>
+      <w:proofErr w:type="spellEnd"/>
+      <w:r>
+        <w:t>-deepfake/</w:t>
+      </w:r>
+      <w:proofErr w:type="spellStart"/>
+      <w:r>
+        <w:t>generated_videos</w:t>
+      </w:r>
+      <w:proofErr w:type="spellEnd"/>
+      <w:r>
+        <w:t>/</w:t>
+      </w:r>
+      <w:proofErr w:type="spellStart"/>
+      <w:r>
+        <w:t>hunyuan</w:t>
+      </w:r>
+      <w:proofErr w:type="spellEnd"/>
+      <w:r>
+        <w:t>/ (40 videos)</w:t>
+      </w:r>
+    </w:p>
+    <w:p>
+      <w:pPr>
+        <w:pStyle w:val="font-claude-response-body"/>
+        <w:numPr>
+          <w:ilvl w:val="0"/>
+          <w:numId w:val="7"/>
+        </w:numPr>
+      </w:pPr>
+      <w:proofErr w:type="spellStart"/>
+      <w:r>
+        <w:t>msc</w:t>
+      </w:r>
+      <w:proofErr w:type="spellEnd"/>
+      <w:r>
+        <w:t>-deepfake/</w:t>
+      </w:r>
+      <w:proofErr w:type="spellStart"/>
+      <w:r>
+        <w:t>generated_videos</w:t>
+      </w:r>
+      <w:proofErr w:type="spellEnd"/>
+      <w:r>
+        <w:t>/wan/ (40 videos)</w:t>
+      </w:r>
+    </w:p>
+    <w:p>
+      <w:pPr>
+        <w:pStyle w:val="font-claude-response-body"/>
+        <w:numPr>
+          <w:ilvl w:val="0"/>
+          <w:numId w:val="7"/>
+        </w:numPr>
+      </w:pPr>
+      <w:proofErr w:type="spellStart"/>
+      <w:r>
+        <w:t>msc</w:t>
+      </w:r>
+      <w:proofErr w:type="spellEnd"/>
+      <w:r>
+        <w:t>-deepfake/metadata/{</w:t>
+      </w:r>
+      <w:proofErr w:type="spellStart"/>
+      <w:r>
+        <w:t>hunyuan,wan</w:t>
+      </w:r>
+      <w:proofErr w:type="spellEnd"/>
+      <w:r>
+        <w:t>}/ (80 JSON files with full generation parameters)</w:t>
+      </w:r>
+    </w:p>
+    <w:p>
+      <w:pPr>
+        <w:pStyle w:val="font-claude-response-body"/>
+        <w:numPr>
+          <w:ilvl w:val="0"/>
+          <w:numId w:val="7"/>
+        </w:numPr>
+      </w:pPr>
+      <w:r>
+        <w:t>logbook/Project_Logbook.docx</w:t>
+      </w:r>
+    </w:p>
+    <w:p>
+      <w:pPr>
+        <w:pStyle w:val="font-claude-response-body"/>
+      </w:pPr>
+      <w:r>
+        <w:rPr>
+          <w:rStyle w:val="Strong"/>
+        </w:rPr>
+        <w:t>Status vs plan:</w:t>
+      </w:r>
+      <w:r>
+        <w:t xml:space="preserve"> Week 1 fully complete Sunday morning. Week 2 open-weight generation (all 120 videos) fully complete Sunday afternoon/evening — three days ahead of Wednesday target. Five methodological findings documented for the Methodology chapter.</w:t>
+      </w:r>
+    </w:p>
+    <w:p>
+      <w:pPr>
+        <w:pStyle w:val="font-claude-response-body"/>
+      </w:pPr>
+      <w:r>
+        <w:rPr>
+          <w:rStyle w:val="Strong"/>
+        </w:rPr>
+        <w:t>Next: Monday 20 July.</w:t>
+      </w:r>
+      <w:r>
+        <w:t xml:space="preserve"> Real-video baseline collection via Kaggle (Kinetics-700 5% subset + </w:t>
+      </w:r>
+      <w:proofErr w:type="spellStart"/>
+      <w:r>
+        <w:t>Pexels</w:t>
+      </w:r>
+      <w:proofErr w:type="spellEnd"/>
+      <w:r>
+        <w:t xml:space="preserve"> supplements for text-in-scene category). Target 60 videos matched to 8 dissertation categories, normalised to 480×832 / 24 fps / 3 sec via </w:t>
+      </w:r>
+      <w:proofErr w:type="spellStart"/>
+      <w:r>
+        <w:t>ffmpeg</w:t>
+      </w:r>
+      <w:proofErr w:type="spellEnd"/>
+      <w:r>
+        <w:t xml:space="preserve">. No </w:t>
       </w:r>
       <w:proofErr w:type="spellStart"/>
       <w:r>
@@ -2662,364 +3551,7 @@
       </w:r>
       <w:proofErr w:type="spellEnd"/>
       <w:r>
-        <w:t xml:space="preserve"> Pro units at start of Sunday: 92.70. </w:t>
-      </w:r>
-      <w:proofErr w:type="spellStart"/>
-      <w:r>
-        <w:t>Colab</w:t>
-      </w:r>
-      <w:proofErr w:type="spellEnd"/>
-      <w:r>
-        <w:t xml:space="preserve"> Pro units at end of Sunday: 89.56. Total consumed across the whole day (</w:t>
-      </w:r>
-      <w:proofErr w:type="spellStart"/>
-      <w:r>
-        <w:t>LLaVA</w:t>
-      </w:r>
-      <w:proofErr w:type="spellEnd"/>
-      <w:r>
-        <w:t xml:space="preserve"> morning session was Kaggle-only so zero </w:t>
-      </w:r>
-      <w:proofErr w:type="spellStart"/>
-      <w:r>
-        <w:t>Colab</w:t>
-      </w:r>
-      <w:proofErr w:type="spellEnd"/>
-      <w:r>
-        <w:t xml:space="preserve">; </w:t>
-      </w:r>
-      <w:proofErr w:type="gramStart"/>
-      <w:r>
-        <w:t>both LTX</w:t>
-      </w:r>
-      <w:proofErr w:type="gramEnd"/>
-      <w:r>
-        <w:t xml:space="preserve"> batches on </w:t>
-      </w:r>
-      <w:proofErr w:type="spellStart"/>
-      <w:r>
-        <w:t>Colab</w:t>
-      </w:r>
-      <w:proofErr w:type="spellEnd"/>
-      <w:r>
-        <w:t xml:space="preserve"> L4): 3.14 units for ~6 hours of L4 GPU work + ~80 videos generated. This significantly revises the Tier C budget forecast downward — full open-weight generation (120 videos across LTX, </w:t>
-      </w:r>
-      <w:proofErr w:type="spellStart"/>
-      <w:r>
-        <w:t>Hunyuan</w:t>
-      </w:r>
-      <w:proofErr w:type="spellEnd"/>
-      <w:r>
-        <w:t>, Wan) is comfortably achievable within existing units, with no top-up required. Kaggle T4 hours consumed today (</w:t>
-      </w:r>
-      <w:proofErr w:type="spellStart"/>
-      <w:r>
-        <w:t>LLaVA</w:t>
-      </w:r>
-      <w:proofErr w:type="spellEnd"/>
-      <w:r>
-        <w:t xml:space="preserve"> session): to be logged from Kaggle sidebar. Personal Drive usage: to be checked next </w:t>
-      </w:r>
-      <w:proofErr w:type="spellStart"/>
-      <w:r>
-        <w:t>Colab</w:t>
-      </w:r>
-      <w:proofErr w:type="spellEnd"/>
-      <w:r>
-        <w:t xml:space="preserve"> session via du -sh.</w:t>
-      </w:r>
-    </w:p>
-    <w:p>
-      <w:pPr>
-        <w:spacing w:after="100" w:line="300" w:lineRule="auto"/>
-        <w:jc w:val="both"/>
-      </w:pPr>
-      <w:r>
-        <w:rPr>
-          <w:b/>
-          <w:bCs/>
-        </w:rPr>
-        <w:t>Files added/updated today</w:t>
-      </w:r>
-      <w:r>
-        <w:t>:</w:t>
-      </w:r>
-    </w:p>
-    <w:p>
-      <w:pPr>
-        <w:spacing w:after="100" w:line="300" w:lineRule="auto"/>
-        <w:jc w:val="both"/>
-      </w:pPr>
-    </w:p>
-    <w:p>
-      <w:pPr>
-        <w:spacing w:after="100" w:line="300" w:lineRule="auto"/>
-        <w:jc w:val="both"/>
-      </w:pPr>
-      <w:r>
-        <w:lastRenderedPageBreak/>
-        <w:t>code/analysis/05_llava16_kaggle.ipynb</w:t>
-      </w:r>
-    </w:p>
-    <w:p>
-      <w:pPr>
-        <w:spacing w:after="100" w:line="300" w:lineRule="auto"/>
-        <w:jc w:val="both"/>
-      </w:pPr>
-      <w:r>
-        <w:t>code/analysis/06_bulk_generation_ltx.ipynb</w:t>
-      </w:r>
-    </w:p>
-    <w:p>
-      <w:pPr>
-        <w:spacing w:after="100" w:line="300" w:lineRule="auto"/>
-        <w:jc w:val="both"/>
-      </w:pPr>
-      <w:r>
-        <w:t>corpus/</w:t>
-      </w:r>
-      <w:proofErr w:type="spellStart"/>
-      <w:r>
-        <w:t>mllm_outputs</w:t>
-      </w:r>
-      <w:proofErr w:type="spellEnd"/>
-      <w:r>
-        <w:t>/</w:t>
-      </w:r>
-      <w:proofErr w:type="spellStart"/>
-      <w:r>
-        <w:t>llava</w:t>
-      </w:r>
-      <w:proofErr w:type="spellEnd"/>
-      <w:r>
-        <w:t>/ltx_001_llava_v1_multiimage_FAILED.txt</w:t>
-      </w:r>
-    </w:p>
-    <w:p>
-      <w:pPr>
-        <w:spacing w:after="100" w:line="300" w:lineRule="auto"/>
-        <w:jc w:val="both"/>
-      </w:pPr>
-      <w:r>
-        <w:t>corpus/</w:t>
-      </w:r>
-      <w:proofErr w:type="spellStart"/>
-      <w:r>
-        <w:t>mllm_outputs</w:t>
-      </w:r>
-      <w:proofErr w:type="spellEnd"/>
-      <w:r>
-        <w:t>/</w:t>
-      </w:r>
-      <w:proofErr w:type="spellStart"/>
-      <w:r>
-        <w:t>llava</w:t>
-      </w:r>
-      <w:proofErr w:type="spellEnd"/>
-      <w:r>
-        <w:t>/{ltx,hunyuan,wan}_001_llava_v2.txt</w:t>
-      </w:r>
-    </w:p>
-    <w:p>
-      <w:pPr>
-        <w:spacing w:after="100" w:line="300" w:lineRule="auto"/>
-        <w:jc w:val="both"/>
-      </w:pPr>
-      <w:proofErr w:type="spellStart"/>
-      <w:r>
-        <w:t>msc</w:t>
-      </w:r>
-      <w:proofErr w:type="spellEnd"/>
-      <w:r>
-        <w:t>-deepfake/</w:t>
-      </w:r>
-      <w:proofErr w:type="spellStart"/>
-      <w:r>
-        <w:t>batch_prompts</w:t>
-      </w:r>
-      <w:proofErr w:type="spellEnd"/>
-      <w:r>
-        <w:t>/week2_prompts_v1.txt (personal Drive)</w:t>
-      </w:r>
-    </w:p>
-    <w:p>
-      <w:pPr>
-        <w:spacing w:after="100" w:line="300" w:lineRule="auto"/>
-        <w:jc w:val="both"/>
-      </w:pPr>
-      <w:proofErr w:type="spellStart"/>
-      <w:r>
-        <w:t>msc</w:t>
-      </w:r>
-      <w:proofErr w:type="spellEnd"/>
-      <w:r>
-        <w:t>-deepfake/</w:t>
-      </w:r>
-      <w:proofErr w:type="spellStart"/>
-      <w:r>
-        <w:t>generated_videos</w:t>
-      </w:r>
-      <w:proofErr w:type="spellEnd"/>
-      <w:r>
-        <w:t>/</w:t>
-      </w:r>
-      <w:proofErr w:type="spellStart"/>
-      <w:r>
-        <w:t>ltx</w:t>
-      </w:r>
-      <w:proofErr w:type="spellEnd"/>
-      <w:r>
-        <w:t>/ (40 videos, personal Drive)</w:t>
-      </w:r>
-    </w:p>
-    <w:p>
-      <w:pPr>
-        <w:spacing w:after="100" w:line="300" w:lineRule="auto"/>
-        <w:jc w:val="both"/>
-      </w:pPr>
-      <w:proofErr w:type="spellStart"/>
-      <w:r>
-        <w:t>msc</w:t>
-      </w:r>
-      <w:proofErr w:type="spellEnd"/>
-      <w:r>
-        <w:t>-deepfake/</w:t>
-      </w:r>
-      <w:proofErr w:type="spellStart"/>
-      <w:r>
-        <w:t>generated_videos</w:t>
-      </w:r>
-      <w:proofErr w:type="spellEnd"/>
-      <w:r>
-        <w:t>/ltx_v1_FAILED/ (40 evidence videos, personal Drive)</w:t>
-      </w:r>
-    </w:p>
-    <w:p>
-      <w:pPr>
-        <w:spacing w:after="100" w:line="300" w:lineRule="auto"/>
-        <w:jc w:val="both"/>
-      </w:pPr>
-      <w:r>
-        <w:t>logbook/Project_Logbook.docx</w:t>
-      </w:r>
-    </w:p>
-    <w:p>
-      <w:pPr>
-        <w:spacing w:after="100" w:line="300" w:lineRule="auto"/>
-        <w:jc w:val="both"/>
-      </w:pPr>
-    </w:p>
-    <w:p>
-      <w:pPr>
-        <w:spacing w:after="100" w:line="300" w:lineRule="auto"/>
-        <w:jc w:val="both"/>
-      </w:pPr>
-      <w:r>
-        <w:rPr>
-          <w:b/>
-          <w:bCs/>
-        </w:rPr>
-        <w:t xml:space="preserve">Status vs plan: </w:t>
-      </w:r>
-      <w:r>
-        <w:t xml:space="preserve">Week 1 fully complete. Week 2 LTX-2.3 batch complete a full day ahead of the original Monday schedule. Three methodological findings documented across the day: (1) LLaVA-1.6 requires per-model prompt variant and (verdict, confidence, observations) output shape; (2) </w:t>
-      </w:r>
-      <w:proofErr w:type="spellStart"/>
-      <w:r>
-        <w:t>Colab</w:t>
-      </w:r>
-      <w:proofErr w:type="spellEnd"/>
-      <w:r>
-        <w:t xml:space="preserve">-Drive FUSE mount unreliable for large </w:t>
-      </w:r>
-      <w:proofErr w:type="spellStart"/>
-      <w:r>
-        <w:t>safetensors</w:t>
-      </w:r>
-      <w:proofErr w:type="spellEnd"/>
-      <w:r>
-        <w:t xml:space="preserve"> reads; (3) T2V silent-failure risk from missing </w:t>
-      </w:r>
-      <w:proofErr w:type="spellStart"/>
-      <w:r>
-        <w:t>negative_prompt</w:t>
-      </w:r>
-      <w:proofErr w:type="spellEnd"/>
-      <w:r>
-        <w:t>/</w:t>
-      </w:r>
-      <w:proofErr w:type="spellStart"/>
-      <w:r>
-        <w:t>guidance_scale</w:t>
-      </w:r>
-      <w:proofErr w:type="spellEnd"/>
-      <w:r>
-        <w:t>.</w:t>
-      </w:r>
-    </w:p>
-    <w:p>
-      <w:pPr>
-        <w:spacing w:after="100" w:line="300" w:lineRule="auto"/>
-        <w:jc w:val="both"/>
-        <w:rPr>
-          <w:b/>
-          <w:bCs/>
-        </w:rPr>
-      </w:pPr>
-      <w:r>
-        <w:rPr>
-          <w:b/>
-          <w:bCs/>
-        </w:rPr>
-        <w:t xml:space="preserve">Next: Monday 20 July. </w:t>
-      </w:r>
-      <w:proofErr w:type="spellStart"/>
-      <w:r>
-        <w:rPr>
-          <w:b/>
-          <w:bCs/>
-        </w:rPr>
-        <w:t>HunyuanVideo</w:t>
-      </w:r>
-      <w:proofErr w:type="spellEnd"/>
-      <w:r>
-        <w:rPr>
-          <w:b/>
-          <w:bCs/>
-        </w:rPr>
-        <w:t xml:space="preserve"> setup. Try Kaggle T4 with FP8 quantization first to preserve </w:t>
-      </w:r>
-      <w:proofErr w:type="spellStart"/>
-      <w:r>
-        <w:rPr>
-          <w:b/>
-          <w:bCs/>
-        </w:rPr>
-        <w:t>Colab</w:t>
-      </w:r>
-      <w:proofErr w:type="spellEnd"/>
-      <w:r>
-        <w:rPr>
-          <w:b/>
-          <w:bCs/>
-        </w:rPr>
-        <w:t xml:space="preserve"> units; fall back to </w:t>
-      </w:r>
-      <w:proofErr w:type="spellStart"/>
-      <w:r>
-        <w:rPr>
-          <w:b/>
-          <w:bCs/>
-        </w:rPr>
-        <w:t>Colab</w:t>
-      </w:r>
-      <w:proofErr w:type="spellEnd"/>
-      <w:r>
-        <w:rPr>
-          <w:b/>
-          <w:bCs/>
-        </w:rPr>
-        <w:t xml:space="preserve"> A100 if it fails. Log full parameter dictionary alongside each video from cell 1 to prevent silent-failure pattern from Sunday's v1 batch.</w:t>
+        <w:t xml:space="preserve"> compute cost — CPU-only work on Kaggle. Also begin planning commercial samples (Kling 3.0, Veo 3.1, Runway Aleph 2.0) — these are user-provided rather than generated.</w:t>
       </w:r>
     </w:p>
     <w:p>
@@ -3335,6 +3867,268 @@
     </w:lvl>
   </w:abstractNum>
   <w:abstractNum w:abstractNumId="1" w15:restartNumberingAfterBreak="0">
+    <w:nsid w:val="01827F37"/>
+    <w:multiLevelType w:val="multilevel"/>
+    <w:tmpl w:val="83EA43C4"/>
+    <w:lvl w:ilvl="0">
+      <w:start w:val="1"/>
+      <w:numFmt w:val="bullet"/>
+      <w:lvlText w:val=""/>
+      <w:lvlJc w:val="left"/>
+      <w:pPr>
+        <w:tabs>
+          <w:tab w:val="num" w:pos="720"/>
+        </w:tabs>
+        <w:ind w:left="720" w:hanging="360"/>
+      </w:pPr>
+      <w:rPr>
+        <w:rFonts w:ascii="Symbol" w:hAnsi="Symbol" w:hint="default"/>
+        <w:sz w:val="20"/>
+      </w:rPr>
+    </w:lvl>
+    <w:lvl w:ilvl="1" w:tentative="1">
+      <w:start w:val="1"/>
+      <w:numFmt w:val="bullet"/>
+      <w:lvlText w:val="o"/>
+      <w:lvlJc w:val="left"/>
+      <w:pPr>
+        <w:tabs>
+          <w:tab w:val="num" w:pos="1440"/>
+        </w:tabs>
+        <w:ind w:left="1440" w:hanging="360"/>
+      </w:pPr>
+      <w:rPr>
+        <w:rFonts w:ascii="Courier New" w:hAnsi="Courier New" w:hint="default"/>
+        <w:sz w:val="20"/>
+      </w:rPr>
+    </w:lvl>
+    <w:lvl w:ilvl="2" w:tentative="1">
+      <w:start w:val="1"/>
+      <w:numFmt w:val="bullet"/>
+      <w:lvlText w:val=""/>
+      <w:lvlJc w:val="left"/>
+      <w:pPr>
+        <w:tabs>
+          <w:tab w:val="num" w:pos="2160"/>
+        </w:tabs>
+        <w:ind w:left="2160" w:hanging="360"/>
+      </w:pPr>
+      <w:rPr>
+        <w:rFonts w:ascii="Wingdings" w:hAnsi="Wingdings" w:hint="default"/>
+        <w:sz w:val="20"/>
+      </w:rPr>
+    </w:lvl>
+    <w:lvl w:ilvl="3" w:tentative="1">
+      <w:start w:val="1"/>
+      <w:numFmt w:val="bullet"/>
+      <w:lvlText w:val=""/>
+      <w:lvlJc w:val="left"/>
+      <w:pPr>
+        <w:tabs>
+          <w:tab w:val="num" w:pos="2880"/>
+        </w:tabs>
+        <w:ind w:left="2880" w:hanging="360"/>
+      </w:pPr>
+      <w:rPr>
+        <w:rFonts w:ascii="Wingdings" w:hAnsi="Wingdings" w:hint="default"/>
+        <w:sz w:val="20"/>
+      </w:rPr>
+    </w:lvl>
+    <w:lvl w:ilvl="4" w:tentative="1">
+      <w:start w:val="1"/>
+      <w:numFmt w:val="bullet"/>
+      <w:lvlText w:val=""/>
+      <w:lvlJc w:val="left"/>
+      <w:pPr>
+        <w:tabs>
+          <w:tab w:val="num" w:pos="3600"/>
+        </w:tabs>
+        <w:ind w:left="3600" w:hanging="360"/>
+      </w:pPr>
+      <w:rPr>
+        <w:rFonts w:ascii="Wingdings" w:hAnsi="Wingdings" w:hint="default"/>
+        <w:sz w:val="20"/>
+      </w:rPr>
+    </w:lvl>
+    <w:lvl w:ilvl="5" w:tentative="1">
+      <w:start w:val="1"/>
+      <w:numFmt w:val="bullet"/>
+      <w:lvlText w:val=""/>
+      <w:lvlJc w:val="left"/>
+      <w:pPr>
+        <w:tabs>
+          <w:tab w:val="num" w:pos="4320"/>
+        </w:tabs>
+        <w:ind w:left="4320" w:hanging="360"/>
+      </w:pPr>
+      <w:rPr>
+        <w:rFonts w:ascii="Wingdings" w:hAnsi="Wingdings" w:hint="default"/>
+        <w:sz w:val="20"/>
+      </w:rPr>
+    </w:lvl>
+    <w:lvl w:ilvl="6" w:tentative="1">
+      <w:start w:val="1"/>
+      <w:numFmt w:val="bullet"/>
+      <w:lvlText w:val=""/>
+      <w:lvlJc w:val="left"/>
+      <w:pPr>
+        <w:tabs>
+          <w:tab w:val="num" w:pos="5040"/>
+        </w:tabs>
+        <w:ind w:left="5040" w:hanging="360"/>
+      </w:pPr>
+      <w:rPr>
+        <w:rFonts w:ascii="Wingdings" w:hAnsi="Wingdings" w:hint="default"/>
+        <w:sz w:val="20"/>
+      </w:rPr>
+    </w:lvl>
+    <w:lvl w:ilvl="7" w:tentative="1">
+      <w:start w:val="1"/>
+      <w:numFmt w:val="bullet"/>
+      <w:lvlText w:val=""/>
+      <w:lvlJc w:val="left"/>
+      <w:pPr>
+        <w:tabs>
+          <w:tab w:val="num" w:pos="5760"/>
+        </w:tabs>
+        <w:ind w:left="5760" w:hanging="360"/>
+      </w:pPr>
+      <w:rPr>
+        <w:rFonts w:ascii="Wingdings" w:hAnsi="Wingdings" w:hint="default"/>
+        <w:sz w:val="20"/>
+      </w:rPr>
+    </w:lvl>
+    <w:lvl w:ilvl="8" w:tentative="1">
+      <w:start w:val="1"/>
+      <w:numFmt w:val="bullet"/>
+      <w:lvlText w:val=""/>
+      <w:lvlJc w:val="left"/>
+      <w:pPr>
+        <w:tabs>
+          <w:tab w:val="num" w:pos="6480"/>
+        </w:tabs>
+        <w:ind w:left="6480" w:hanging="360"/>
+      </w:pPr>
+      <w:rPr>
+        <w:rFonts w:ascii="Wingdings" w:hAnsi="Wingdings" w:hint="default"/>
+        <w:sz w:val="20"/>
+      </w:rPr>
+    </w:lvl>
+  </w:abstractNum>
+  <w:abstractNum w:abstractNumId="2" w15:restartNumberingAfterBreak="0">
+    <w:nsid w:val="33410F77"/>
+    <w:multiLevelType w:val="multilevel"/>
+    <w:tmpl w:val="E64A3C5E"/>
+    <w:lvl w:ilvl="0">
+      <w:start w:val="1"/>
+      <w:numFmt w:val="decimal"/>
+      <w:lvlText w:val="%1."/>
+      <w:lvlJc w:val="left"/>
+      <w:pPr>
+        <w:tabs>
+          <w:tab w:val="num" w:pos="720"/>
+        </w:tabs>
+        <w:ind w:left="720" w:hanging="360"/>
+      </w:pPr>
+    </w:lvl>
+    <w:lvl w:ilvl="1" w:tentative="1">
+      <w:start w:val="1"/>
+      <w:numFmt w:val="decimal"/>
+      <w:lvlText w:val="%2."/>
+      <w:lvlJc w:val="left"/>
+      <w:pPr>
+        <w:tabs>
+          <w:tab w:val="num" w:pos="1440"/>
+        </w:tabs>
+        <w:ind w:left="1440" w:hanging="360"/>
+      </w:pPr>
+    </w:lvl>
+    <w:lvl w:ilvl="2" w:tentative="1">
+      <w:start w:val="1"/>
+      <w:numFmt w:val="decimal"/>
+      <w:lvlText w:val="%3."/>
+      <w:lvlJc w:val="left"/>
+      <w:pPr>
+        <w:tabs>
+          <w:tab w:val="num" w:pos="2160"/>
+        </w:tabs>
+        <w:ind w:left="2160" w:hanging="360"/>
+      </w:pPr>
+    </w:lvl>
+    <w:lvl w:ilvl="3" w:tentative="1">
+      <w:start w:val="1"/>
+      <w:numFmt w:val="decimal"/>
+      <w:lvlText w:val="%4."/>
+      <w:lvlJc w:val="left"/>
+      <w:pPr>
+        <w:tabs>
+          <w:tab w:val="num" w:pos="2880"/>
+        </w:tabs>
+        <w:ind w:left="2880" w:hanging="360"/>
+      </w:pPr>
+    </w:lvl>
+    <w:lvl w:ilvl="4" w:tentative="1">
+      <w:start w:val="1"/>
+      <w:numFmt w:val="decimal"/>
+      <w:lvlText w:val="%5."/>
+      <w:lvlJc w:val="left"/>
+      <w:pPr>
+        <w:tabs>
+          <w:tab w:val="num" w:pos="3600"/>
+        </w:tabs>
+        <w:ind w:left="3600" w:hanging="360"/>
+      </w:pPr>
+    </w:lvl>
+    <w:lvl w:ilvl="5" w:tentative="1">
+      <w:start w:val="1"/>
+      <w:numFmt w:val="decimal"/>
+      <w:lvlText w:val="%6."/>
+      <w:lvlJc w:val="left"/>
+      <w:pPr>
+        <w:tabs>
+          <w:tab w:val="num" w:pos="4320"/>
+        </w:tabs>
+        <w:ind w:left="4320" w:hanging="360"/>
+      </w:pPr>
+    </w:lvl>
+    <w:lvl w:ilvl="6" w:tentative="1">
+      <w:start w:val="1"/>
+      <w:numFmt w:val="decimal"/>
+      <w:lvlText w:val="%7."/>
+      <w:lvlJc w:val="left"/>
+      <w:pPr>
+        <w:tabs>
+          <w:tab w:val="num" w:pos="5040"/>
+        </w:tabs>
+        <w:ind w:left="5040" w:hanging="360"/>
+      </w:pPr>
+    </w:lvl>
+    <w:lvl w:ilvl="7" w:tentative="1">
+      <w:start w:val="1"/>
+      <w:numFmt w:val="decimal"/>
+      <w:lvlText w:val="%8."/>
+      <w:lvlJc w:val="left"/>
+      <w:pPr>
+        <w:tabs>
+          <w:tab w:val="num" w:pos="5760"/>
+        </w:tabs>
+        <w:ind w:left="5760" w:hanging="360"/>
+      </w:pPr>
+    </w:lvl>
+    <w:lvl w:ilvl="8" w:tentative="1">
+      <w:start w:val="1"/>
+      <w:numFmt w:val="decimal"/>
+      <w:lvlText w:val="%9."/>
+      <w:lvlJc w:val="left"/>
+      <w:pPr>
+        <w:tabs>
+          <w:tab w:val="num" w:pos="6480"/>
+        </w:tabs>
+        <w:ind w:left="6480" w:hanging="360"/>
+      </w:pPr>
+    </w:lvl>
+  </w:abstractNum>
+  <w:abstractNum w:abstractNumId="3" w15:restartNumberingAfterBreak="0">
     <w:nsid w:val="390D79E7"/>
     <w:multiLevelType w:val="multilevel"/>
     <w:tmpl w:val="CE7AD602"/>
@@ -3483,10 +4277,308 @@
       </w:rPr>
     </w:lvl>
   </w:abstractNum>
-  <w:abstractNum w:abstractNumId="2" w15:restartNumberingAfterBreak="0">
+  <w:abstractNum w:abstractNumId="4" w15:restartNumberingAfterBreak="0">
+    <w:nsid w:val="595E3383"/>
+    <w:multiLevelType w:val="multilevel"/>
+    <w:tmpl w:val="CA080994"/>
+    <w:lvl w:ilvl="0">
+      <w:start w:val="1"/>
+      <w:numFmt w:val="bullet"/>
+      <w:lvlText w:val=""/>
+      <w:lvlJc w:val="left"/>
+      <w:pPr>
+        <w:tabs>
+          <w:tab w:val="num" w:pos="720"/>
+        </w:tabs>
+        <w:ind w:left="720" w:hanging="360"/>
+      </w:pPr>
+      <w:rPr>
+        <w:rFonts w:ascii="Symbol" w:hAnsi="Symbol" w:hint="default"/>
+        <w:sz w:val="20"/>
+      </w:rPr>
+    </w:lvl>
+    <w:lvl w:ilvl="1" w:tentative="1">
+      <w:start w:val="1"/>
+      <w:numFmt w:val="bullet"/>
+      <w:lvlText w:val="o"/>
+      <w:lvlJc w:val="left"/>
+      <w:pPr>
+        <w:tabs>
+          <w:tab w:val="num" w:pos="1440"/>
+        </w:tabs>
+        <w:ind w:left="1440" w:hanging="360"/>
+      </w:pPr>
+      <w:rPr>
+        <w:rFonts w:ascii="Courier New" w:hAnsi="Courier New" w:hint="default"/>
+        <w:sz w:val="20"/>
+      </w:rPr>
+    </w:lvl>
+    <w:lvl w:ilvl="2" w:tentative="1">
+      <w:start w:val="1"/>
+      <w:numFmt w:val="bullet"/>
+      <w:lvlText w:val=""/>
+      <w:lvlJc w:val="left"/>
+      <w:pPr>
+        <w:tabs>
+          <w:tab w:val="num" w:pos="2160"/>
+        </w:tabs>
+        <w:ind w:left="2160" w:hanging="360"/>
+      </w:pPr>
+      <w:rPr>
+        <w:rFonts w:ascii="Wingdings" w:hAnsi="Wingdings" w:hint="default"/>
+        <w:sz w:val="20"/>
+      </w:rPr>
+    </w:lvl>
+    <w:lvl w:ilvl="3" w:tentative="1">
+      <w:start w:val="1"/>
+      <w:numFmt w:val="bullet"/>
+      <w:lvlText w:val=""/>
+      <w:lvlJc w:val="left"/>
+      <w:pPr>
+        <w:tabs>
+          <w:tab w:val="num" w:pos="2880"/>
+        </w:tabs>
+        <w:ind w:left="2880" w:hanging="360"/>
+      </w:pPr>
+      <w:rPr>
+        <w:rFonts w:ascii="Wingdings" w:hAnsi="Wingdings" w:hint="default"/>
+        <w:sz w:val="20"/>
+      </w:rPr>
+    </w:lvl>
+    <w:lvl w:ilvl="4" w:tentative="1">
+      <w:start w:val="1"/>
+      <w:numFmt w:val="bullet"/>
+      <w:lvlText w:val=""/>
+      <w:lvlJc w:val="left"/>
+      <w:pPr>
+        <w:tabs>
+          <w:tab w:val="num" w:pos="3600"/>
+        </w:tabs>
+        <w:ind w:left="3600" w:hanging="360"/>
+      </w:pPr>
+      <w:rPr>
+        <w:rFonts w:ascii="Wingdings" w:hAnsi="Wingdings" w:hint="default"/>
+        <w:sz w:val="20"/>
+      </w:rPr>
+    </w:lvl>
+    <w:lvl w:ilvl="5" w:tentative="1">
+      <w:start w:val="1"/>
+      <w:numFmt w:val="bullet"/>
+      <w:lvlText w:val=""/>
+      <w:lvlJc w:val="left"/>
+      <w:pPr>
+        <w:tabs>
+          <w:tab w:val="num" w:pos="4320"/>
+        </w:tabs>
+        <w:ind w:left="4320" w:hanging="360"/>
+      </w:pPr>
+      <w:rPr>
+        <w:rFonts w:ascii="Wingdings" w:hAnsi="Wingdings" w:hint="default"/>
+        <w:sz w:val="20"/>
+      </w:rPr>
+    </w:lvl>
+    <w:lvl w:ilvl="6" w:tentative="1">
+      <w:start w:val="1"/>
+      <w:numFmt w:val="bullet"/>
+      <w:lvlText w:val=""/>
+      <w:lvlJc w:val="left"/>
+      <w:pPr>
+        <w:tabs>
+          <w:tab w:val="num" w:pos="5040"/>
+        </w:tabs>
+        <w:ind w:left="5040" w:hanging="360"/>
+      </w:pPr>
+      <w:rPr>
+        <w:rFonts w:ascii="Wingdings" w:hAnsi="Wingdings" w:hint="default"/>
+        <w:sz w:val="20"/>
+      </w:rPr>
+    </w:lvl>
+    <w:lvl w:ilvl="7" w:tentative="1">
+      <w:start w:val="1"/>
+      <w:numFmt w:val="bullet"/>
+      <w:lvlText w:val=""/>
+      <w:lvlJc w:val="left"/>
+      <w:pPr>
+        <w:tabs>
+          <w:tab w:val="num" w:pos="5760"/>
+        </w:tabs>
+        <w:ind w:left="5760" w:hanging="360"/>
+      </w:pPr>
+      <w:rPr>
+        <w:rFonts w:ascii="Wingdings" w:hAnsi="Wingdings" w:hint="default"/>
+        <w:sz w:val="20"/>
+      </w:rPr>
+    </w:lvl>
+    <w:lvl w:ilvl="8" w:tentative="1">
+      <w:start w:val="1"/>
+      <w:numFmt w:val="bullet"/>
+      <w:lvlText w:val=""/>
+      <w:lvlJc w:val="left"/>
+      <w:pPr>
+        <w:tabs>
+          <w:tab w:val="num" w:pos="6480"/>
+        </w:tabs>
+        <w:ind w:left="6480" w:hanging="360"/>
+      </w:pPr>
+      <w:rPr>
+        <w:rFonts w:ascii="Wingdings" w:hAnsi="Wingdings" w:hint="default"/>
+        <w:sz w:val="20"/>
+      </w:rPr>
+    </w:lvl>
+  </w:abstractNum>
+  <w:abstractNum w:abstractNumId="5" w15:restartNumberingAfterBreak="0">
     <w:nsid w:val="60F15747"/>
     <w:multiLevelType w:val="multilevel"/>
     <w:tmpl w:val="07500232"/>
+    <w:lvl w:ilvl="0">
+      <w:start w:val="1"/>
+      <w:numFmt w:val="bullet"/>
+      <w:lvlText w:val=""/>
+      <w:lvlJc w:val="left"/>
+      <w:pPr>
+        <w:tabs>
+          <w:tab w:val="num" w:pos="720"/>
+        </w:tabs>
+        <w:ind w:left="720" w:hanging="360"/>
+      </w:pPr>
+      <w:rPr>
+        <w:rFonts w:ascii="Symbol" w:hAnsi="Symbol" w:hint="default"/>
+        <w:sz w:val="20"/>
+      </w:rPr>
+    </w:lvl>
+    <w:lvl w:ilvl="1" w:tentative="1">
+      <w:start w:val="1"/>
+      <w:numFmt w:val="bullet"/>
+      <w:lvlText w:val="o"/>
+      <w:lvlJc w:val="left"/>
+      <w:pPr>
+        <w:tabs>
+          <w:tab w:val="num" w:pos="1440"/>
+        </w:tabs>
+        <w:ind w:left="1440" w:hanging="360"/>
+      </w:pPr>
+      <w:rPr>
+        <w:rFonts w:ascii="Courier New" w:hAnsi="Courier New" w:hint="default"/>
+        <w:sz w:val="20"/>
+      </w:rPr>
+    </w:lvl>
+    <w:lvl w:ilvl="2" w:tentative="1">
+      <w:start w:val="1"/>
+      <w:numFmt w:val="bullet"/>
+      <w:lvlText w:val=""/>
+      <w:lvlJc w:val="left"/>
+      <w:pPr>
+        <w:tabs>
+          <w:tab w:val="num" w:pos="2160"/>
+        </w:tabs>
+        <w:ind w:left="2160" w:hanging="360"/>
+      </w:pPr>
+      <w:rPr>
+        <w:rFonts w:ascii="Wingdings" w:hAnsi="Wingdings" w:hint="default"/>
+        <w:sz w:val="20"/>
+      </w:rPr>
+    </w:lvl>
+    <w:lvl w:ilvl="3" w:tentative="1">
+      <w:start w:val="1"/>
+      <w:numFmt w:val="bullet"/>
+      <w:lvlText w:val=""/>
+      <w:lvlJc w:val="left"/>
+      <w:pPr>
+        <w:tabs>
+          <w:tab w:val="num" w:pos="2880"/>
+        </w:tabs>
+        <w:ind w:left="2880" w:hanging="360"/>
+      </w:pPr>
+      <w:rPr>
+        <w:rFonts w:ascii="Wingdings" w:hAnsi="Wingdings" w:hint="default"/>
+        <w:sz w:val="20"/>
+      </w:rPr>
+    </w:lvl>
+    <w:lvl w:ilvl="4" w:tentative="1">
+      <w:start w:val="1"/>
+      <w:numFmt w:val="bullet"/>
+      <w:lvlText w:val=""/>
+      <w:lvlJc w:val="left"/>
+      <w:pPr>
+        <w:tabs>
+          <w:tab w:val="num" w:pos="3600"/>
+        </w:tabs>
+        <w:ind w:left="3600" w:hanging="360"/>
+      </w:pPr>
+      <w:rPr>
+        <w:rFonts w:ascii="Wingdings" w:hAnsi="Wingdings" w:hint="default"/>
+        <w:sz w:val="20"/>
+      </w:rPr>
+    </w:lvl>
+    <w:lvl w:ilvl="5" w:tentative="1">
+      <w:start w:val="1"/>
+      <w:numFmt w:val="bullet"/>
+      <w:lvlText w:val=""/>
+      <w:lvlJc w:val="left"/>
+      <w:pPr>
+        <w:tabs>
+          <w:tab w:val="num" w:pos="4320"/>
+        </w:tabs>
+        <w:ind w:left="4320" w:hanging="360"/>
+      </w:pPr>
+      <w:rPr>
+        <w:rFonts w:ascii="Wingdings" w:hAnsi="Wingdings" w:hint="default"/>
+        <w:sz w:val="20"/>
+      </w:rPr>
+    </w:lvl>
+    <w:lvl w:ilvl="6" w:tentative="1">
+      <w:start w:val="1"/>
+      <w:numFmt w:val="bullet"/>
+      <w:lvlText w:val=""/>
+      <w:lvlJc w:val="left"/>
+      <w:pPr>
+        <w:tabs>
+          <w:tab w:val="num" w:pos="5040"/>
+        </w:tabs>
+        <w:ind w:left="5040" w:hanging="360"/>
+      </w:pPr>
+      <w:rPr>
+        <w:rFonts w:ascii="Wingdings" w:hAnsi="Wingdings" w:hint="default"/>
+        <w:sz w:val="20"/>
+      </w:rPr>
+    </w:lvl>
+    <w:lvl w:ilvl="7" w:tentative="1">
+      <w:start w:val="1"/>
+      <w:numFmt w:val="bullet"/>
+      <w:lvlText w:val=""/>
+      <w:lvlJc w:val="left"/>
+      <w:pPr>
+        <w:tabs>
+          <w:tab w:val="num" w:pos="5760"/>
+        </w:tabs>
+        <w:ind w:left="5760" w:hanging="360"/>
+      </w:pPr>
+      <w:rPr>
+        <w:rFonts w:ascii="Wingdings" w:hAnsi="Wingdings" w:hint="default"/>
+        <w:sz w:val="20"/>
+      </w:rPr>
+    </w:lvl>
+    <w:lvl w:ilvl="8" w:tentative="1">
+      <w:start w:val="1"/>
+      <w:numFmt w:val="bullet"/>
+      <w:lvlText w:val=""/>
+      <w:lvlJc w:val="left"/>
+      <w:pPr>
+        <w:tabs>
+          <w:tab w:val="num" w:pos="6480"/>
+        </w:tabs>
+        <w:ind w:left="6480" w:hanging="360"/>
+      </w:pPr>
+      <w:rPr>
+        <w:rFonts w:ascii="Wingdings" w:hAnsi="Wingdings" w:hint="default"/>
+        <w:sz w:val="20"/>
+      </w:rPr>
+    </w:lvl>
+  </w:abstractNum>
+  <w:abstractNum w:abstractNumId="6" w15:restartNumberingAfterBreak="0">
+    <w:nsid w:val="734203B2"/>
+    <w:multiLevelType w:val="multilevel"/>
+    <w:tmpl w:val="F2A426F6"/>
     <w:lvl w:ilvl="0">
       <w:start w:val="1"/>
       <w:numFmt w:val="bullet"/>
@@ -3639,9 +4731,21 @@
     </w:lvlOverride>
   </w:num>
   <w:num w:numId="2" w16cid:durableId="1184637264">
+    <w:abstractNumId w:val="5"/>
+  </w:num>
+  <w:num w:numId="3" w16cid:durableId="1593197417">
+    <w:abstractNumId w:val="3"/>
+  </w:num>
+  <w:num w:numId="4" w16cid:durableId="236478965">
+    <w:abstractNumId w:val="6"/>
+  </w:num>
+  <w:num w:numId="5" w16cid:durableId="625046257">
     <w:abstractNumId w:val="2"/>
   </w:num>
-  <w:num w:numId="3" w16cid:durableId="1593197417">
+  <w:num w:numId="6" w16cid:durableId="1530021725">
+    <w:abstractNumId w:val="4"/>
+  </w:num>
+  <w:num w:numId="7" w16cid:durableId="126969744">
     <w:abstractNumId w:val="1"/>
   </w:num>
 </w:numbering>
@@ -4246,6 +5350,30 @@
       <w:szCs w:val="20"/>
     </w:rPr>
   </w:style>
+  <w:style w:type="paragraph" w:customStyle="1" w:styleId="font-claude-response-body">
+    <w:name w:val="font-claude-response-body"/>
+    <w:basedOn w:val="Normal"/>
+    <w:rsid w:val="00D80D22"/>
+    <w:pPr>
+      <w:spacing w:before="100" w:beforeAutospacing="1" w:after="100" w:afterAutospacing="1"/>
+    </w:pPr>
+    <w:rPr>
+      <w:rFonts w:ascii="Times New Roman" w:eastAsia="Times New Roman" w:hAnsi="Times New Roman" w:cs="Times New Roman"/>
+      <w:sz w:val="24"/>
+      <w:szCs w:val="24"/>
+    </w:rPr>
+  </w:style>
+  <w:style w:type="character" w:styleId="Strong">
+    <w:name w:val="Strong"/>
+    <w:basedOn w:val="DefaultParagraphFont"/>
+    <w:uiPriority w:val="22"/>
+    <w:qFormat/>
+    <w:rsid w:val="00D80D22"/>
+    <w:rPr>
+      <w:b/>
+      <w:bCs/>
+    </w:rPr>
+  </w:style>
 </w:styles>
 </file>
 

</xml_diff>